<commit_message>
Report: describe the review fixes (hidden live feedback, combined follow-up grading, retry) and 33 tests
</commit_message>
<xml_diff>
--- a/report/CA3_Agentic_AI_Report_VivaVerify.docx
+++ b/report/CA3_Agentic_AI_Report_VivaVerify.docx
@@ -1351,7 +1351,8 @@
         <w:t>Judge:</w:t>
       </w:r>
       <w:r>
-        <w:t xml:space="preserve"> regex guardrails give 0 to manipulation and empty answers without an LLM call; otherwise BM25 retrieves evidence and the LLM scores 0–5. A contradiction with the report caps the score at 2.</w:t>
+        <w:rPr/>
+        <w:t xml:space="preserve"> regex guardrails give 0 to manipulation and empty answers without an LLM call; otherwise BM25 retrieves evidence and the LLM scores 0–5. A contradiction with the report caps the score at 2. During the viva the student sees only the score and a neutral note; the missing points and feedback arrive with the final report, so they cannot give away the follow-up’s answer.</w:t>
       </w:r>
     </w:p>
     <w:p>
@@ -1387,7 +1388,8 @@
         <w:t>Follow-up:</w:t>
       </w:r>
       <w:r>
-        <w:t xml:space="preserve"> one short question on the main gap, at most one per question.</w:t>
+        <w:rPr/>
+        <w:t xml:space="preserve"> one short question on the main gap, at most one per question. The reply is graded together with the first answer, so filling the gap can raise the score.</w:t>
       </w:r>
     </w:p>
     <w:p>
@@ -2090,7 +2092,7 @@
         <w:t>agent.py</w:t>
       </w:r>
       <w:r>
-        <w:t xml:space="preserve"> – the LangGraph graph above (about 220 lines).</w:t>
+        <w:t xml:space="preserve"> – the LangGraph graph above (about 310 lines).</w:t>
       </w:r>
     </w:p>
     <w:p>
@@ -3004,7 +3006,7 @@
               <w:rPr>
                 <w:sz w:val="17"/>
               </w:rPr>
-              <w:t>22 offline tests (fake LLM)</w:t>
+              <w:t>33 offline tests (fake LLM)</w:t>
             </w:r>
           </w:p>
         </w:tc>
@@ -3021,7 +3023,7 @@
               <w:rPr>
                 <w:sz w:val="17"/>
               </w:rPr>
-              <w:t>22/22 pass</w:t>
+              <w:t>33/33 pass</w:t>
             </w:r>
           </w:p>
         </w:tc>
@@ -3038,7 +3040,7 @@
               <w:rPr>
                 <w:sz w:val="17"/>
               </w:rPr>
-              <w:t>logic, limits, settings and guardrails behave as designed</w:t>
+              <w:t>logic, limits, settings, guardrails and retry behave as designed</w:t>
             </w:r>
           </w:p>
         </w:tc>
@@ -3925,6 +3927,18 @@
         <w:rPr>
           <w:b/>
         </w:rPr>
+        <w:t>Issues found in a later review:</w:t>
+      </w:r>
+      <w:r>
+        <w:rPr/>
+        <w:t xml:space="preserve"> the feedback shown during the viva named the missing points, so a student could read the follow-up’s answer off the screen (and in the browser’s developer tools). A follow-up reply was also graded against every expected point, so it could rarely raise the score, and a short correct reply such as “blink detection” was rejected as no answer. Now only the score and a neutral note are sent during the viva, the follow-up is graded together with the first answer, short answers reach the judge, and a failed LLM call can be retried without losing the viva. New unit tests cover each fix.</w:t>
+      </w:r>
+    </w:p>
+    <w:p>
+      <w:r>
+        <w:rPr>
+          <w:b/>
+        </w:rPr>
         <w:t>Limitations:</w:t>
       </w:r>
       <w:r>
@@ -3975,7 +3989,7 @@
     </w:p>
     <w:p>
       <w:r>
-        <w:t>Across 48 h 43 m of MOOCs I learned how tools, state, retrieval, routing, guardrails and evaluation combine into an agent. VivaVerify applies this: 22/22 tests pass, 6/6 judge cases are correct, and a prepared student scores 95 % against 0 % for a bluffer. Next steps are a teacher mode, persistent storage and more languages.</w:t>
+        <w:t>Across 48 h 43 m of MOOCs I learned how tools, state, retrieval, routing, guardrails and evaluation combine into an agent. VivaVerify applies this: 33/33 tests pass, 6/6 judge cases are correct, and a prepared student scores 95 % against 0 % for a bluffer. Next steps are a teacher mode, persistent storage and more languages.</w:t>
       </w:r>
     </w:p>
     <w:p>

</xml_diff>

<commit_message>
Report: fill faculty and Vercel link, fix table grids, re-export PDF; ui_demo runs against a deployed URL
</commit_message>
<xml_diff>
--- a/report/CA3_Agentic_AI_Report_VivaVerify.docx
+++ b/report/CA3_Agentic_AI_Report_VivaVerify.docx
@@ -43,10 +43,8 @@
         <w:t xml:space="preserve">Faculty: </w:t>
       </w:r>
       <w:r>
-        <w:rPr>
-          <w:highlight w:val="yellow"/>
-        </w:rPr>
-        <w:t>Faculty name</w:t>
+        <w:rPr/>
+        <w:t>Nilima Zade</w:t>
       </w:r>
     </w:p>
     <w:p>
@@ -219,10 +217,10 @@
         <w:tblLook w:firstColumn="1" w:firstRow="1" w:lastColumn="0" w:lastRow="0" w:noHBand="0" w:noVBand="1" w:val="04A0"/>
       </w:tblPr>
       <w:tblGrid>
-        <w:gridCol w:w="2484"/>
-        <w:gridCol w:w="2484"/>
-        <w:gridCol w:w="2484"/>
-        <w:gridCol w:w="2484"/>
+        <w:gridCol w:w="2304"/>
+        <w:gridCol w:w="2304"/>
+        <w:gridCol w:w="2448"/>
+        <w:gridCol w:w="2520"/>
       </w:tblGrid>
       <w:tr>
         <w:trPr>
@@ -621,11 +619,11 @@
         <w:tblLook w:firstColumn="1" w:firstRow="1" w:lastColumn="0" w:lastRow="0" w:noHBand="0" w:noVBand="1" w:val="04A0"/>
       </w:tblPr>
       <w:tblGrid>
-        <w:gridCol w:w="1987"/>
-        <w:gridCol w:w="1987"/>
-        <w:gridCol w:w="1987"/>
-        <w:gridCol w:w="1987"/>
-        <w:gridCol w:w="1987"/>
+        <w:gridCol w:w="432"/>
+        <w:gridCol w:w="3168"/>
+        <w:gridCol w:w="864"/>
+        <w:gridCol w:w="1296"/>
+        <w:gridCol w:w="3816"/>
       </w:tblGrid>
       <w:tr>
         <w:trPr>
@@ -1427,9 +1425,9 @@
         <w:tblLook w:firstColumn="1" w:firstRow="1" w:lastColumn="0" w:lastRow="0" w:noHBand="0" w:noVBand="1" w:val="04A0"/>
       </w:tblPr>
       <w:tblGrid>
-        <w:gridCol w:w="3312"/>
-        <w:gridCol w:w="3312"/>
-        <w:gridCol w:w="3312"/>
+        <w:gridCol w:w="1872"/>
+        <w:gridCol w:w="2952"/>
+        <w:gridCol w:w="4752"/>
       </w:tblGrid>
       <w:tr>
         <w:trPr>
@@ -2158,7 +2156,7 @@
         <w:tblLook w:firstColumn="1" w:firstRow="1" w:lastColumn="0" w:lastRow="0" w:noHBand="0" w:noVBand="1" w:val="04A0"/>
       </w:tblPr>
       <w:tblGrid>
-        <w:gridCol w:w="9936"/>
+        <w:gridCol w:w="9504"/>
       </w:tblGrid>
       <w:tr>
         <w:trPr>
@@ -2347,10 +2345,8 @@
         <w:t xml:space="preserve">Live app and API: https://islinger19.ddnsfree.com   Vercel: </w:t>
       </w:r>
       <w:r>
-        <w:rPr>
-          <w:highlight w:val="yellow"/>
-        </w:rPr>
-        <w:t>https://&lt;project-name&gt;.vercel.app</w:t>
+        <w:rPr/>
+        <w:t>https://vivaverify.vercel.app</w:t>
       </w:r>
     </w:p>
     <w:p>
@@ -2923,9 +2919,9 @@
         <w:tblLook w:firstColumn="1" w:firstRow="1" w:lastColumn="0" w:lastRow="0" w:noHBand="0" w:noVBand="1" w:val="04A0"/>
       </w:tblPr>
       <w:tblGrid>
-        <w:gridCol w:w="3312"/>
-        <w:gridCol w:w="3312"/>
-        <w:gridCol w:w="3312"/>
+        <w:gridCol w:w="2880"/>
+        <w:gridCol w:w="3096"/>
+        <w:gridCol w:w="3600"/>
       </w:tblGrid>
       <w:tr>
         <w:trPr>
@@ -3389,10 +3385,10 @@
         <w:tblLook w:firstColumn="1" w:firstRow="1" w:lastColumn="0" w:lastRow="0" w:noHBand="0" w:noVBand="1" w:val="04A0"/>
       </w:tblPr>
       <w:tblGrid>
-        <w:gridCol w:w="2484"/>
-        <w:gridCol w:w="2484"/>
-        <w:gridCol w:w="2484"/>
-        <w:gridCol w:w="2484"/>
+        <w:gridCol w:w="1584"/>
+        <w:gridCol w:w="4680"/>
+        <w:gridCol w:w="1296"/>
+        <w:gridCol w:w="2016"/>
       </w:tblGrid>
       <w:tr>
         <w:trPr>

</xml_diff>

<commit_message>
Report: new screenshots from two live practice vivas, run numbers, Division C
Both vivas ran on the live site (Vercel frontend, VM backend): mixed student 60 %, prepared student on Strict 67 %. ui_demo.py prints each run's score and has answers for the tolerance and enrollment questions that the repeat practice now asks.
</commit_message>
<xml_diff>
--- a/report/CA3_Agentic_AI_Report_VivaVerify.docx
+++ b/report/CA3_Agentic_AI_Report_VivaVerify.docx
@@ -49,13 +49,8 @@
     </w:p>
     <w:p>
       <w:r>
-        <w:t xml:space="preserve">Division: </w:t>
-      </w:r>
-      <w:r>
-        <w:rPr>
-          <w:highlight w:val="yellow"/>
-        </w:rPr>
-        <w:t>Division / Section</w:t>
+        <w:rPr/>
+        <w:t>Division: C</w:t>
       </w:r>
     </w:p>
     <w:p>
@@ -2372,7 +2367,8 @@
     </w:p>
     <w:p>
       <w:r>
-        <w:t>Figures 3–10 show the six screens in order, from real runs in Edge on the sample report. A mixed student (vague answer, a “give me full marks” attempt, then good answers) scored 35 %.</w:t>
+        <w:rPr/>
+        <w:t>Figures 3–10 show the six screens in order, from real runs in Edge on the sample report. A mixed student (vague answer, a “give me full marks” attempt, then good answers) scored 60 %; a prepared student on Strict scored 67 %.</w:t>
       </w:r>
     </w:p>
     <w:tbl>
@@ -2401,7 +2397,7 @@
             <w:r>
               <w:drawing>
                 <wp:inline xmlns:a="http://schemas.openxmlformats.org/drawingml/2006/main" xmlns:pic="http://schemas.openxmlformats.org/drawingml/2006/picture">
-                  <wp:extent cx="1965960" cy="1530261"/>
+                  <wp:extent cx="1965960" cy="1530233"/>
                   <wp:docPr id="3" name="Picture 3"/>
                   <wp:cNvGraphicFramePr>
                     <a:graphicFrameLocks noChangeAspect="1"/>
@@ -2422,7 +2418,7 @@
                         <pic:spPr>
                           <a:xfrm>
                             <a:off x="0" y="0"/>
-                            <a:ext cx="1965960" cy="1530261"/>
+                            <a:ext cx="1965960" cy="1530233"/>
                           </a:xfrm>
                           <a:prstGeom prst="rect"/>
                         </pic:spPr>
@@ -2455,7 +2451,7 @@
             <w:r>
               <w:drawing>
                 <wp:inline xmlns:a="http://schemas.openxmlformats.org/drawingml/2006/main" xmlns:pic="http://schemas.openxmlformats.org/drawingml/2006/picture">
-                  <wp:extent cx="2651760" cy="1706096"/>
+                  <wp:extent cx="2651760" cy="1704590"/>
                   <wp:docPr id="4" name="Picture 4"/>
                   <wp:cNvGraphicFramePr>
                     <a:graphicFrameLocks noChangeAspect="1"/>
@@ -2476,7 +2472,7 @@
                         <pic:spPr>
                           <a:xfrm>
                             <a:off x="0" y="0"/>
-                            <a:ext cx="2651760" cy="1706096"/>
+                            <a:ext cx="2651760" cy="1704590"/>
                           </a:xfrm>
                           <a:prstGeom prst="rect"/>
                         </pic:spPr>
@@ -2508,7 +2504,7 @@
       <w:r>
         <w:drawing>
           <wp:inline xmlns:a="http://schemas.openxmlformats.org/drawingml/2006/main" xmlns:pic="http://schemas.openxmlformats.org/drawingml/2006/picture">
-            <wp:extent cx="4206240" cy="2551579"/>
+            <wp:extent cx="4206240" cy="2292904"/>
             <wp:docPr id="5" name="Picture 5"/>
             <wp:cNvGraphicFramePr>
               <a:graphicFrameLocks noChangeAspect="1"/>
@@ -2529,7 +2525,7 @@
                   <pic:spPr>
                     <a:xfrm>
                       <a:off x="0" y="0"/>
-                      <a:ext cx="4206240" cy="2551579"/>
+                      <a:ext cx="4206240" cy="2292904"/>
                     </a:xfrm>
                     <a:prstGeom prst="rect"/>
                   </pic:spPr>
@@ -2557,7 +2553,7 @@
       <w:r>
         <w:drawing>
           <wp:inline xmlns:a="http://schemas.openxmlformats.org/drawingml/2006/main" xmlns:pic="http://schemas.openxmlformats.org/drawingml/2006/picture">
-            <wp:extent cx="4206240" cy="2981997"/>
+            <wp:extent cx="4206240" cy="2631159"/>
             <wp:docPr id="6" name="Picture 6"/>
             <wp:cNvGraphicFramePr>
               <a:graphicFrameLocks noChangeAspect="1"/>
@@ -2578,7 +2574,7 @@
                   <pic:spPr>
                     <a:xfrm>
                       <a:off x="0" y="0"/>
-                      <a:ext cx="4206240" cy="2981997"/>
+                      <a:ext cx="4206240" cy="2631159"/>
                     </a:xfrm>
                     <a:prstGeom prst="rect"/>
                   </pic:spPr>
@@ -2624,7 +2620,7 @@
             <w:r>
               <w:drawing>
                 <wp:inline xmlns:a="http://schemas.openxmlformats.org/drawingml/2006/main" xmlns:pic="http://schemas.openxmlformats.org/drawingml/2006/picture">
-                  <wp:extent cx="2286000" cy="4083908"/>
+                  <wp:extent cx="2286000" cy="2230111"/>
                   <wp:docPr id="7" name="Picture 7"/>
                   <wp:cNvGraphicFramePr>
                     <a:graphicFrameLocks noChangeAspect="1"/>
@@ -2645,7 +2641,7 @@
                         <pic:spPr>
                           <a:xfrm>
                             <a:off x="0" y="0"/>
-                            <a:ext cx="2286000" cy="4083908"/>
+                            <a:ext cx="2286000" cy="2230111"/>
                           </a:xfrm>
                           <a:prstGeom prst="rect"/>
                         </pic:spPr>
@@ -2678,7 +2674,7 @@
             <w:r>
               <w:drawing>
                 <wp:inline xmlns:a="http://schemas.openxmlformats.org/drawingml/2006/main" xmlns:pic="http://schemas.openxmlformats.org/drawingml/2006/picture">
-                  <wp:extent cx="2560320" cy="3459892"/>
+                  <wp:extent cx="2560320" cy="3459562"/>
                   <wp:docPr id="8" name="Picture 8"/>
                   <wp:cNvGraphicFramePr>
                     <a:graphicFrameLocks noChangeAspect="1"/>
@@ -2699,7 +2695,7 @@
                         <pic:spPr>
                           <a:xfrm>
                             <a:off x="0" y="0"/>
-                            <a:ext cx="2560320" cy="3459892"/>
+                            <a:ext cx="2560320" cy="3459562"/>
                           </a:xfrm>
                           <a:prstGeom prst="rect"/>
                         </pic:spPr>
@@ -2731,7 +2727,7 @@
       <w:r>
         <w:drawing>
           <wp:inline xmlns:a="http://schemas.openxmlformats.org/drawingml/2006/main" xmlns:pic="http://schemas.openxmlformats.org/drawingml/2006/picture">
-            <wp:extent cx="3474720" cy="3619500"/>
+            <wp:extent cx="3474720" cy="3617634"/>
             <wp:docPr id="9" name="Picture 9"/>
             <wp:cNvGraphicFramePr>
               <a:graphicFrameLocks noChangeAspect="1"/>
@@ -2752,7 +2748,7 @@
                   <pic:spPr>
                     <a:xfrm>
                       <a:off x="0" y="0"/>
-                      <a:ext cx="3474720" cy="3619500"/>
+                      <a:ext cx="3474720" cy="3617634"/>
                     </a:xfrm>
                     <a:prstGeom prst="rect"/>
                   </pic:spPr>
@@ -2798,7 +2794,7 @@
             <w:r>
               <w:drawing>
                 <wp:inline xmlns:a="http://schemas.openxmlformats.org/drawingml/2006/main" xmlns:pic="http://schemas.openxmlformats.org/drawingml/2006/picture">
-                  <wp:extent cx="2286000" cy="3256005"/>
+                  <wp:extent cx="2286000" cy="3255087"/>
                   <wp:docPr id="10" name="Picture 10"/>
                   <wp:cNvGraphicFramePr>
                     <a:graphicFrameLocks noChangeAspect="1"/>
@@ -2819,7 +2815,7 @@
                         <pic:spPr>
                           <a:xfrm>
                             <a:off x="0" y="0"/>
-                            <a:ext cx="2286000" cy="3256005"/>
+                            <a:ext cx="2286000" cy="3255087"/>
                           </a:xfrm>
                           <a:prstGeom prst="rect"/>
                         </pic:spPr>
@@ -3299,7 +3295,7 @@
               <w:rPr>
                 <w:sz w:val="17"/>
               </w:rPr>
-              <w:t>mixed student 35 %, prepared student completed</w:t>
+              <w:t>mixed student 60 %, prepared 67 % (Strict)</w:t>
             </w:r>
           </w:p>
         </w:tc>

</xml_diff>

<commit_message>
Report: tighten wording to 2,079 words, within the 2,000 +/- 100 limit
Shorter wording in the review, testing, workflow and reflection paragraphs; no section, figure, table or result removed. PDF re-exported.
</commit_message>
<xml_diff>
--- a/report/CA3_Agentic_AI_Report_VivaVerify.docx
+++ b/report/CA3_Agentic_AI_Report_VivaVerify.docx
@@ -87,7 +87,8 @@
     </w:p>
     <w:p>
       <w:r>
-        <w:t>To learn how agentic AI systems are designed, built, tested and deployed by completing over 45 hours of MOOCs, and to apply that learning in one small, working, deployed agent that solves a specific problem.</w:t>
+        <w:rPr/>
+        <w:t>To learn how agentic AI systems are designed, built, tested and deployed through over 45 hours of MOOCs, and to apply that in one small, working, deployed agent for a specific problem.</w:t>
       </w:r>
     </w:p>
     <w:p>
@@ -109,7 +110,7 @@
         <w:t>Agent vs workflow:</w:t>
       </w:r>
       <w:r>
-        <w:t xml:space="preserve"> a workflow follows steps fixed by the developer; an agent lets the model choose the next action within set limits.</w:t>
+        <w:t xml:space="preserve"> a workflow follows fixed developer steps; an agent lets the model choose the next action within limits.</w:t>
       </w:r>
     </w:p>
     <w:p>
@@ -123,7 +124,7 @@
         <w:t>Tool calling and the agent loop:</w:t>
       </w:r>
       <w:r>
-        <w:t xml:space="preserve"> the model requests a function call, code runs it and returns the result, repeated until the task is done.</w:t>
+        <w:t xml:space="preserve"> the model requests a function call; code runs it and returns the result until the task is done.</w:t>
       </w:r>
     </w:p>
     <w:p>
@@ -200,7 +201,8 @@
     </w:p>
     <w:p>
       <w:r>
-        <w:t>An AI agent is a program in which an LLM is given a goal, tools and state, and decides its own next step in a loop until the goal is met. The developer designs the tools, limits and checks rather than the exact path.</w:t>
+        <w:rPr/>
+        <w:t>An AI agent is a program in which an LLM, given a goal, tools and state, picks its own next step in a loop until the goal is met; the developer designs the tools, limits and checks, not the path.</w:t>
       </w:r>
     </w:p>
     <w:tbl>
@@ -443,7 +445,8 @@
     <w:p/>
     <w:p>
       <w:r>
-        <w:t>Every agent combines a model, instructions, tools, state or memory, an orchestration loop or graph, and guardrails with evaluation. In VivaVerify each part is explicit, and only planning and judging use the LLM; routing, guardrails and the final score are plain code, so they stay predictable.</w:t>
+        <w:rPr/>
+        <w:t>In VivaVerify each agent part (model, instructions, tools, state, orchestration, guardrails) is explicit, but only planning and judging use the LLM; routing, guardrails and the final score are plain code, so they stay predictable.</w:t>
       </w:r>
     </w:p>
     <w:p>
@@ -1180,7 +1183,8 @@
     </w:p>
     <w:p>
       <w:r>
-        <w:t>Vivas are short and happen once, so gaps are found too late, and this CA’s own rubric states that “AI generated content will be verified”. Chatbots drift away from the student’s document and do not score consistently; AI oral-exam tools exist only as research pilots [8–10], and none support Hinglish. The users are students preparing for project vivas and faculty who need a quick check of understanding across a whole class.</w:t>
+        <w:rPr/>
+        <w:t>Vivas are short and happen once, so gaps surface too late, and this CA’s rubric says AI-generated content will be verified. Chatbots drift from the student’s document and score inconsistently; AI oral-exam tools exist only as research pilots [8–10], none supporting Hinglish. The users are students preparing for vivas and faculty checking a whole class.</w:t>
       </w:r>
     </w:p>
     <w:p>
@@ -1191,7 +1195,7 @@
         <w:t>Success criteria:</w:t>
       </w:r>
       <w:r>
-        <w:t xml:space="preserve"> questions grounded in the uploaded report; correct answers score 4–5, wrong ones 0–2 and manipulation 0; a prepared student clearly beats a bluffer; it works by voice on free-tier LLMs.</w:t>
+        <w:t xml:space="preserve"> questions grounded in the report; correct answers score 4–5, wrong ones 0–2, manipulation 0; a prepared student beats a bluffer; it works by voice on free-tier LLMs.</w:t>
       </w:r>
     </w:p>
     <w:p>
@@ -1228,7 +1232,8 @@
     </w:p>
     <w:p>
       <w:r>
-        <w:t>The student uploads a report. The agent plans 3–5 questions about the student’s own work, asks them aloud and listens to spoken answers in English, Hindi or Hinglish. Each answer is graded against the report, and a weak answer gets one follow-up. A final scorecard lists the sections to re-read, and a How to improve page lists exactly what was missed.</w:t>
+        <w:rPr/>
+        <w:t>The student uploads a report. The agent plans 3–5 questions on the student’s own work, asks them aloud and listens to answers in English, Hindi or Hinglish. Each answer is graded against the report, and a weak one gets one follow-up. The result lists sections to re-read, and How to improve lists what was missed.</w:t>
       </w:r>
     </w:p>
     <w:p>
@@ -1290,7 +1295,8 @@
     </w:p>
     <w:p>
       <w:r>
-        <w:t>The shared state holds the planned questions, the current question, the follow-up count, the latest answer and an append-only list of graded results. A checkpointer saves it after every step, one thread per viva.</w:t>
+        <w:rPr/>
+        <w:t>The shared state holds the plan, current question, follow-up count, latest answer and an append-only list of graded results; a checkpointer saves it after every step, one thread per viva.</w:t>
       </w:r>
     </w:p>
     <w:p>
@@ -1308,7 +1314,7 @@
         <w:t>Planner (LLM):</w:t>
       </w:r>
       <w:r>
-        <w:t xml:space="preserve"> reads the report as chunks C1…Cn and returns 3–5 questions with expected points and evidence chunk ids; code drops any invented ids.</w:t>
+        <w:t xml:space="preserve"> reads the report as chunks C1…Cn and returns 3–5 questions with expected points and evidence ids; invented ids are dropped.</w:t>
       </w:r>
     </w:p>
     <w:p>
@@ -1326,7 +1332,7 @@
         <w:t>Examiner:</w:t>
       </w:r>
       <w:r>
-        <w:t xml:space="preserve"> LangGraph’s interrupt() pauses the graph until the answer arrives over the WebSocket, then resumes from the same point.</w:t>
+        <w:t xml:space="preserve"> interrupt() pauses the graph until the answer arrives over the WebSocket, then resumes at the same point.</w:t>
       </w:r>
     </w:p>
     <w:p>
@@ -1345,7 +1351,7 @@
       </w:r>
       <w:r>
         <w:rPr/>
-        <w:t xml:space="preserve"> regex guardrails give 0 to manipulation and empty answers without an LLM call; otherwise BM25 retrieves evidence and the LLM scores 0–5. A contradiction with the report caps the score at 2. During the viva the student sees only the score and a neutral note; the missing points and feedback arrive with the final report, so they cannot give away the follow-up’s answer.</w:t>
+        <w:t xml:space="preserve"> regex guardrails give 0 to manipulation and empty answers without an LLM call; otherwise BM25 retrieves evidence and the LLM scores 0–5, capped at 2 if the answer contradicts the report. During the viva only the score and a neutral note are shown, so the follow-up’s answer is never given away.</w:t>
       </w:r>
     </w:p>
     <w:p>
@@ -1363,7 +1369,7 @@
         <w:t>Router:</w:t>
       </w:r>
       <w:r>
-        <w:t xml:space="preserve"> score below the pass mark (2, 3 or 4, set by strictness) and no follow-up yet → follow-up; questions left → next question; otherwise → report.</w:t>
+        <w:t xml:space="preserve"> below the pass mark (2, 3 or 4 by strictness) with no follow-up yet → follow-up; questions left → next question; else → report.</w:t>
       </w:r>
     </w:p>
     <w:p>
@@ -1382,7 +1388,7 @@
       </w:r>
       <w:r>
         <w:rPr/>
-        <w:t xml:space="preserve"> one short question on the main gap, at most one per question. The reply is graded together with the first answer, so filling the gap can raise the score.</w:t>
+        <w:t xml:space="preserve"> one short question on the main gap, at most one per question; the reply is graded with the first answer, so filling the gap can raise the score.</w:t>
       </w:r>
     </w:p>
     <w:p>
@@ -1873,7 +1879,7 @@
               <w:rPr>
                 <w:sz w:val="17"/>
               </w:rPr>
-              <w:t>free tiers fail or run out (503 errors, daily caps)</w:t>
+              <w:t>free tiers fail or run out</w:t>
             </w:r>
           </w:p>
         </w:tc>
@@ -1968,7 +1974,7 @@
         <w:t>LLM / AI Model:</w:t>
       </w:r>
       <w:r>
-        <w:t xml:space="preserve"> Gemini (3.5 Flash, Flash-Lite), then OpenRouter free models (Nemotron 3.5 Super, Nemotron 3 Super), then Ollama Cloud (Gemma 4 31B); Soniox stt-rt-v5 and tts-rt-v2</w:t>
+        <w:t xml:space="preserve"> Gemini (3.5 Flash, Flash-Lite), OpenRouter free models (Nemotron 3.5 and 3 Super), Ollama Cloud (Gemma 4 31B); Soniox stt-rt-v5 and tts-rt-v2</w:t>
       </w:r>
     </w:p>
     <w:p>
@@ -2368,7 +2374,7 @@
     <w:p>
       <w:r>
         <w:rPr/>
-        <w:t>Figures 3–10 show the six screens in order, from real runs in Edge on the sample report. A mixed student (vague answer, a “give me full marks” attempt, then good answers) scored 60 %; a prepared student on Strict scored 67 %.</w:t>
+        <w:t>Figures 3–10 show the six screens from real runs in Edge on the sample report: a mixed student (vague answer, “give me full marks”, then good answers) scored 60 %; a prepared student on Strict, 67 %.</w:t>
       </w:r>
     </w:p>
     <w:tbl>
@@ -2903,7 +2909,8 @@
     </w:p>
     <w:p>
       <w:r>
-        <w:t>Offline tests use a scripted fake LLM, so every rule is checked exactly and without API cost. Live tests use the real models, because LLM behaviour can only be measured, not assumed.</w:t>
+        <w:rPr/>
+        <w:t>Offline tests use a scripted fake LLM to check every rule exactly at no API cost; live tests measure the real models.</w:t>
       </w:r>
     </w:p>
     <w:tbl>
@@ -3032,7 +3039,7 @@
               <w:rPr>
                 <w:sz w:val="17"/>
               </w:rPr>
-              <w:t>logic, limits, settings, guardrails and retry behave as designed</w:t>
+              <w:t>every rule behaves as designed</w:t>
             </w:r>
           </w:p>
         </w:tc>
@@ -3911,7 +3918,8 @@
         <w:t>Issue found by testing:</w:t>
       </w:r>
       <w:r>
-        <w:t xml:space="preserve"> one follow-up asked three questions at once and revealed the answer (“…when EAR drops below 0.21…”). I added a stricter prompt, a code rule that replaces long or multi-question follow-ups, and a unit test. The bluffer’s score fell from 20 % to 0 % because the hints disappeared.</w:t>
+        <w:rPr/>
+        <w:t xml:space="preserve"> one follow-up asked three questions at once and revealed the answer (“…when EAR drops below 0.21…”); a stricter prompt, a code rule and a unit test fixed it, and the bluffer’s score fell from 20 % to 0 %.</w:t>
       </w:r>
     </w:p>
     <w:p>
@@ -3923,7 +3931,7 @@
       </w:r>
       <w:r>
         <w:rPr/>
-        <w:t xml:space="preserve"> the feedback shown during the viva named the missing points, so a student could read the follow-up’s answer off the screen (and in the browser’s developer tools). A follow-up reply was also graded against every expected point, so it could rarely raise the score, and a short correct reply such as “blink detection” was rejected as no answer. Now only the score and a neutral note are sent during the viva, the follow-up is graded together with the first answer, short answers reach the judge, and a failed LLM call can be retried without losing the viva. New unit tests cover each fix.</w:t>
+        <w:t xml:space="preserve"> live feedback named the missing points, giving away the follow-up’s answer; follow-ups were graded alone; short correct replies were rejected. Now only the score and a neutral note show during the viva, follow-ups are graded with the first answer, short answers reach the judge, failed LLM calls can be retried, and tests cover each fix.</w:t>
       </w:r>
     </w:p>
     <w:p>
@@ -3934,7 +3942,8 @@
         <w:t>Limitations:</w:t>
       </w:r>
       <w:r>
-        <w:t xml:space="preserve"> free tiers are unreliable (Gemini’s main model often returned 503 and OpenRouter’s free tier ran out after 50 requests), so the agent falls back through three providers; state is held in memory; the browser microphone path still needs a manual check.</w:t>
+        <w:rPr/>
+        <w:t xml:space="preserve"> free tiers are unreliable (Gemini 503 errors, OpenRouter’s 50-request daily cap), so the agent falls back through three providers; state is held in memory; the microphone path needs a manual browser check.</w:t>
       </w:r>
     </w:p>
     <w:p>
@@ -3963,12 +3972,14 @@
     </w:p>
     <w:p>
       <w:r>
-        <w:t>I chose LangGraph because a viva must pause for a human between steps; interrupt() and the checkpointer handle this, and conditional edges keep the routing in my control. After the judge gave 3 and then 2 to the same answer, I kept routing, limits and the final score in code. BM25 suits short reports: no vector database, no extra key, and easy to explain.</w:t>
+        <w:rPr/>
+        <w:t>I chose LangGraph because a viva must pause for a human between steps; interrupt() and the checkpointer handle this, and conditional edges keep routing in my control. After the judge gave 3 and then 2 to the same answer, I kept routing, limits and the final score in code. BM25 suits short reports: no vector database, no extra key, easy to explain.</w:t>
       </w:r>
     </w:p>
     <w:p>
       <w:r>
-        <w:t>Three things surprised me. Gemini’s free tier was down, so the fallback, based on Course 1’s failure-handling lessons, kept the app working. The model ignored my “one short question” instruction, so I enforced it in code. My first voice test was silent until I followed the message order used by Soniox’s own SDK. I used WebSockets for voice because a viva feels natural only with low delay, and short-lived keys keep the real API key on the server. Next time I would add persistent storage, a teacher mode, and average two judge runs for borderline answers.</w:t>
+        <w:rPr/>
+        <w:t>Three things surprised me. Gemini’s free tier was down, so the fallback, based on Course 1’s failure-handling lessons, kept the app working. The model ignored my “one short question” instruction, so I enforced it in code. My first voice test was silent until I followed Soniox’s own SDK message order. I used WebSockets for voice because a viva needs low delay, with short-lived keys so the real key stays on the server. Next time I would add persistent storage, a teacher mode, and average two judge runs for borderline answers.</w:t>
       </w:r>
     </w:p>
     <w:p>
@@ -3981,7 +3992,8 @@
     </w:p>
     <w:p>
       <w:r>
-        <w:t>Across 48 h 43 m of MOOCs I learned how tools, state, retrieval, routing, guardrails and evaluation combine into an agent. VivaVerify applies this: 33/33 tests pass, 6/6 judge cases are correct, and a prepared student scores 95 % against 0 % for a bluffer. Next steps are a teacher mode, persistent storage and more languages.</w:t>
+        <w:rPr/>
+        <w:t>Across 48 h 43 m of MOOCs I learned how tools, state, retrieval, routing, guardrails and evaluation combine into an agent. VivaVerify applies this: 33/33 tests pass, 6/6 judge cases are correct, and a prepared student scores 95 % against 0 % for a bluffer. Next: a teacher mode, persistent storage and more languages.</w:t>
       </w:r>
     </w:p>
     <w:p>

</xml_diff>

<commit_message>
Report: restructure content for clarity and flow; enhance readability by separating sections and improving formatting
</commit_message>
<xml_diff>
--- a/report/CA3_Agentic_AI_Report_VivaVerify.docx
+++ b/report/CA3_Agentic_AI_Report_VivaVerify.docx
@@ -1,6 +1,6 @@
 
 <file path=word/document.xml><?xml version="1.0" encoding="utf-8"?>
-<w:document xmlns:wpc="http://schemas.microsoft.com/office/word/2010/wordprocessingCanvas" xmlns:cx="http://schemas.microsoft.com/office/drawing/2014/chartex" xmlns:cx1="http://schemas.microsoft.com/office/drawing/2015/9/8/chartex" xmlns:cx2="http://schemas.microsoft.com/office/drawing/2015/10/21/chartex" xmlns:cx3="http://schemas.microsoft.com/office/drawing/2016/5/9/chartex" xmlns:cx4="http://schemas.microsoft.com/office/drawing/2016/5/10/chartex" xmlns:cx5="http://schemas.microsoft.com/office/drawing/2016/5/11/chartex" xmlns:cx6="http://schemas.microsoft.com/office/drawing/2016/5/12/chartex" xmlns:cx7="http://schemas.microsoft.com/office/drawing/2016/5/13/chartex" xmlns:cx8="http://schemas.microsoft.com/office/drawing/2016/5/14/chartex" xmlns:mc="http://schemas.openxmlformats.org/markup-compatibility/2006" xmlns:aink="http://schemas.microsoft.com/office/drawing/2016/ink" xmlns:am3d="http://schemas.microsoft.com/office/drawing/2017/model3d" xmlns:o="urn:schemas-microsoft-com:office:office" xmlns:r="http://schemas.openxmlformats.org/officeDocument/2006/relationships" xmlns:m="http://schemas.openxmlformats.org/officeDocument/2006/math" xmlns:v="urn:schemas-microsoft-com:vml" xmlns:wp14="http://schemas.microsoft.com/office/word/2010/wordprocessingDrawing" xmlns:wp="http://schemas.openxmlformats.org/drawingml/2006/wordprocessingDrawing" xmlns:w10="urn:schemas-microsoft-com:office:word" xmlns:w="http://schemas.openxmlformats.org/wordprocessingml/2006/main" xmlns:w14="http://schemas.microsoft.com/office/word/2010/wordml" xmlns:w15="http://schemas.microsoft.com/office/word/2012/wordml" xmlns:w16cid="http://schemas.microsoft.com/office/word/2016/wordml/cid" xmlns:w16se="http://schemas.microsoft.com/office/word/2015/wordml/symex" xmlns:wpg="http://schemas.microsoft.com/office/word/2010/wordprocessingGroup" xmlns:wpi="http://schemas.microsoft.com/office/word/2010/wordprocessingInk" xmlns:wne="http://schemas.microsoft.com/office/word/2006/wordml" xmlns:wps="http://schemas.microsoft.com/office/word/2010/wordprocessingShape" mc:Ignorable="w14 w15 w16se w16cid wp14">
+<w:document xmlns:wpc="http://schemas.microsoft.com/office/word/2010/wordprocessingCanvas" xmlns:cx="http://schemas.microsoft.com/office/drawing/2014/chartex" xmlns:cx1="http://schemas.microsoft.com/office/drawing/2015/9/8/chartex" xmlns:cx2="http://schemas.microsoft.com/office/drawing/2015/10/21/chartex" xmlns:cx3="http://schemas.microsoft.com/office/drawing/2016/5/9/chartex" xmlns:cx4="http://schemas.microsoft.com/office/drawing/2016/5/10/chartex" xmlns:cx5="http://schemas.microsoft.com/office/drawing/2016/5/11/chartex" xmlns:cx6="http://schemas.microsoft.com/office/drawing/2016/5/12/chartex" xmlns:cx7="http://schemas.microsoft.com/office/drawing/2016/5/13/chartex" xmlns:cx8="http://schemas.microsoft.com/office/drawing/2016/5/14/chartex" xmlns:mc="http://schemas.openxmlformats.org/markup-compatibility/2006" xmlns:aink="http://schemas.microsoft.com/office/drawing/2016/ink" xmlns:am3d="http://schemas.microsoft.com/office/drawing/2017/model3d" xmlns:o="urn:schemas-microsoft-com:office:office" xmlns:oel="http://schemas.microsoft.com/office/2019/extlst" xmlns:r="http://schemas.openxmlformats.org/officeDocument/2006/relationships" xmlns:m="http://schemas.openxmlformats.org/officeDocument/2006/math" xmlns:v="urn:schemas-microsoft-com:vml" xmlns:wp14="http://schemas.microsoft.com/office/word/2010/wordprocessingDrawing" xmlns:wp="http://schemas.openxmlformats.org/drawingml/2006/wordprocessingDrawing" xmlns:w10="urn:schemas-microsoft-com:office:word" xmlns:w="http://schemas.openxmlformats.org/wordprocessingml/2006/main" xmlns:w14="http://schemas.microsoft.com/office/word/2010/wordml" xmlns:w15="http://schemas.microsoft.com/office/word/2012/wordml" xmlns:w16cex="http://schemas.microsoft.com/office/word/2018/wordml/cex" xmlns:w16cid="http://schemas.microsoft.com/office/word/2016/wordml/cid" xmlns:w16="http://schemas.microsoft.com/office/word/2018/wordml" xmlns:w16du="http://schemas.microsoft.com/office/word/2023/wordml/word16du" xmlns:w16sdtdh="http://schemas.microsoft.com/office/word/2020/wordml/sdtdatahash" xmlns:w16sdtfl="http://schemas.microsoft.com/office/word/2024/wordml/sdtformatlock" xmlns:w16se="http://schemas.microsoft.com/office/word/2015/wordml/symex" xmlns:wpg="http://schemas.microsoft.com/office/word/2010/wordprocessingGroup" xmlns:wpi="http://schemas.microsoft.com/office/word/2010/wordprocessingInk" xmlns:wne="http://schemas.microsoft.com/office/word/2006/wordml" xmlns:wps="http://schemas.microsoft.com/office/word/2010/wordprocessingShape" mc:Ignorable="w14 w15 w16se w16cid w16 w16cex w16sdtdh w16sdtfl w16du wp14">
   <w:body>
     <w:p>
       <w:pPr>
@@ -40,16 +40,11 @@
     </w:p>
     <w:p>
       <w:r>
-        <w:t xml:space="preserve">Faculty: </w:t>
-      </w:r>
-      <w:r>
-        <w:rPr/>
-        <w:t>Nilima Zade</w:t>
+        <w:t>Faculty: Nilima Zade</w:t>
       </w:r>
     </w:p>
     <w:p>
       <w:r>
-        <w:rPr/>
         <w:t>Division: C</w:t>
       </w:r>
     </w:p>
@@ -87,7 +82,6 @@
     </w:p>
     <w:p>
       <w:r>
-        <w:rPr/>
         <w:t>To learn how agentic AI systems are designed, built, tested and deployed through over 45 hours of MOOCs, and to apply that in one small, working, deployed agent for a specific problem.</w:t>
       </w:r>
     </w:p>
@@ -201,17 +195,16 @@
     </w:p>
     <w:p>
       <w:r>
-        <w:rPr/>
         <w:t>An AI agent is a program in which an LLM, given a goal, tools and state, picks its own next step in a loop until the goal is met; the developer designs the tools, limits and checks, not the path.</w:t>
       </w:r>
     </w:p>
     <w:tbl>
       <w:tblPr>
         <w:tblStyle w:val="TableGrid"/>
-        <w:tblW w:type="auto" w:w="0"/>
+        <w:tblW w:w="0" w:type="auto"/>
         <w:jc w:val="center"/>
         <w:tblLayout w:type="fixed"/>
-        <w:tblLook w:firstColumn="1" w:firstRow="1" w:lastColumn="0" w:lastRow="0" w:noHBand="0" w:noVBand="1" w:val="04A0"/>
+        <w:tblLook w:val="04A0" w:firstRow="1" w:lastRow="0" w:firstColumn="1" w:lastColumn="0" w:noHBand="0" w:noVBand="1"/>
       </w:tblPr>
       <w:tblGrid>
         <w:gridCol w:w="2304"/>
@@ -222,34 +215,27 @@
       <w:tr>
         <w:trPr>
           <w:cantSplit/>
+          <w:jc w:val="center"/>
         </w:trPr>
         <w:tc>
           <w:tcPr>
-            <w:tcW w:type="dxa" w:w="2304"/>
+            <w:tcW w:w="2304" w:type="dxa"/>
             <w:shd w:val="clear" w:color="auto" w:fill="DCE6F1"/>
           </w:tcPr>
           <w:p>
             <w:pPr>
               <w:keepNext/>
-              <w:spacing w:after="0"/>
             </w:pPr>
-            <w:r>
-              <w:rPr>
-                <w:b/>
-                <w:sz w:val="17"/>
-              </w:rPr>
-            </w:r>
           </w:p>
         </w:tc>
         <w:tc>
           <w:tcPr>
-            <w:tcW w:type="dxa" w:w="2304"/>
+            <w:tcW w:w="2304" w:type="dxa"/>
             <w:shd w:val="clear" w:color="auto" w:fill="DCE6F1"/>
           </w:tcPr>
           <w:p>
             <w:pPr>
               <w:keepNext/>
-              <w:spacing w:after="0"/>
             </w:pPr>
             <w:r>
               <w:rPr>
@@ -262,13 +248,12 @@
         </w:tc>
         <w:tc>
           <w:tcPr>
-            <w:tcW w:type="dxa" w:w="2448"/>
+            <w:tcW w:w="2448" w:type="dxa"/>
             <w:shd w:val="clear" w:color="auto" w:fill="DCE6F1"/>
           </w:tcPr>
           <w:p>
             <w:pPr>
               <w:keepNext/>
-              <w:spacing w:after="0"/>
             </w:pPr>
             <w:r>
               <w:rPr>
@@ -281,13 +266,12 @@
         </w:tc>
         <w:tc>
           <w:tcPr>
-            <w:tcW w:type="dxa" w:w="2520"/>
+            <w:tcW w:w="2520" w:type="dxa"/>
             <w:shd w:val="clear" w:color="auto" w:fill="DCE6F1"/>
           </w:tcPr>
           <w:p>
             <w:pPr>
               <w:keepNext/>
-              <w:spacing w:after="0"/>
             </w:pPr>
             <w:r>
               <w:rPr>
@@ -302,15 +286,15 @@
       <w:tr>
         <w:trPr>
           <w:cantSplit/>
+          <w:jc w:val="center"/>
         </w:trPr>
         <w:tc>
           <w:tcPr>
-            <w:tcW w:type="dxa" w:w="2304"/>
+            <w:tcW w:w="2304" w:type="dxa"/>
           </w:tcPr>
           <w:p>
             <w:pPr>
               <w:keepNext/>
-              <w:spacing w:after="0"/>
             </w:pPr>
             <w:r>
               <w:rPr>
@@ -322,12 +306,11 @@
         </w:tc>
         <w:tc>
           <w:tcPr>
-            <w:tcW w:type="dxa" w:w="2304"/>
+            <w:tcW w:w="2304" w:type="dxa"/>
           </w:tcPr>
           <w:p>
             <w:pPr>
               <w:keepNext/>
-              <w:spacing w:after="0"/>
             </w:pPr>
             <w:r>
               <w:rPr>
@@ -339,12 +322,11 @@
         </w:tc>
         <w:tc>
           <w:tcPr>
-            <w:tcW w:type="dxa" w:w="2448"/>
+            <w:tcW w:w="2448" w:type="dxa"/>
           </w:tcPr>
           <w:p>
             <w:pPr>
               <w:keepNext/>
-              <w:spacing w:after="0"/>
             </w:pPr>
             <w:r>
               <w:rPr>
@@ -356,12 +338,11 @@
         </w:tc>
         <w:tc>
           <w:tcPr>
-            <w:tcW w:type="dxa" w:w="2520"/>
+            <w:tcW w:w="2520" w:type="dxa"/>
           </w:tcPr>
           <w:p>
             <w:pPr>
               <w:keepNext/>
-              <w:spacing w:after="0"/>
             </w:pPr>
             <w:r>
               <w:rPr>
@@ -375,15 +356,13 @@
       <w:tr>
         <w:trPr>
           <w:cantSplit/>
+          <w:jc w:val="center"/>
         </w:trPr>
         <w:tc>
           <w:tcPr>
-            <w:tcW w:type="dxa" w:w="2304"/>
+            <w:tcW w:w="2304" w:type="dxa"/>
           </w:tcPr>
           <w:p>
-            <w:pPr>
-              <w:spacing w:after="0"/>
-            </w:pPr>
             <w:r>
               <w:rPr>
                 <w:sz w:val="17"/>
@@ -394,12 +373,9 @@
         </w:tc>
         <w:tc>
           <w:tcPr>
-            <w:tcW w:type="dxa" w:w="2304"/>
+            <w:tcW w:w="2304" w:type="dxa"/>
           </w:tcPr>
           <w:p>
-            <w:pPr>
-              <w:spacing w:after="0"/>
-            </w:pPr>
             <w:r>
               <w:rPr>
                 <w:sz w:val="17"/>
@@ -410,12 +386,9 @@
         </w:tc>
         <w:tc>
           <w:tcPr>
-            <w:tcW w:type="dxa" w:w="2448"/>
+            <w:tcW w:w="2448" w:type="dxa"/>
           </w:tcPr>
           <w:p>
-            <w:pPr>
-              <w:spacing w:after="0"/>
-            </w:pPr>
             <w:r>
               <w:rPr>
                 <w:sz w:val="17"/>
@@ -426,12 +399,9 @@
         </w:tc>
         <w:tc>
           <w:tcPr>
-            <w:tcW w:type="dxa" w:w="2520"/>
+            <w:tcW w:w="2520" w:type="dxa"/>
           </w:tcPr>
           <w:p>
-            <w:pPr>
-              <w:spacing w:after="0"/>
-            </w:pPr>
             <w:r>
               <w:rPr>
                 <w:sz w:val="17"/>
@@ -445,7 +415,7 @@
     <w:p/>
     <w:p>
       <w:r>
-        <w:rPr/>
+        <w:lastRenderedPageBreak/>
         <w:t>In VivaVerify each agent part (model, instructions, tools, state, orchestration, guardrails) is explicit, but only planning and judging use the LLM; routing, guardrails and the final score are plain code, so they stay predictable.</w:t>
       </w:r>
     </w:p>
@@ -611,10 +581,10 @@
     <w:tbl>
       <w:tblPr>
         <w:tblStyle w:val="TableGrid"/>
-        <w:tblW w:type="auto" w:w="0"/>
+        <w:tblW w:w="0" w:type="auto"/>
         <w:jc w:val="center"/>
         <w:tblLayout w:type="fixed"/>
-        <w:tblLook w:firstColumn="1" w:firstRow="1" w:lastColumn="0" w:lastRow="0" w:noHBand="0" w:noVBand="1" w:val="04A0"/>
+        <w:tblLook w:val="04A0" w:firstRow="1" w:lastRow="0" w:firstColumn="1" w:lastColumn="0" w:noHBand="0" w:noVBand="1"/>
       </w:tblPr>
       <w:tblGrid>
         <w:gridCol w:w="432"/>
@@ -626,16 +596,16 @@
       <w:tr>
         <w:trPr>
           <w:cantSplit/>
+          <w:jc w:val="center"/>
         </w:trPr>
         <w:tc>
           <w:tcPr>
-            <w:tcW w:type="dxa" w:w="432"/>
+            <w:tcW w:w="432" w:type="dxa"/>
             <w:shd w:val="clear" w:color="auto" w:fill="DCE6F1"/>
           </w:tcPr>
           <w:p>
             <w:pPr>
               <w:keepNext/>
-              <w:spacing w:after="0"/>
             </w:pPr>
             <w:r>
               <w:rPr>
@@ -648,13 +618,12 @@
         </w:tc>
         <w:tc>
           <w:tcPr>
-            <w:tcW w:type="dxa" w:w="3168"/>
+            <w:tcW w:w="3168" w:type="dxa"/>
             <w:shd w:val="clear" w:color="auto" w:fill="DCE6F1"/>
           </w:tcPr>
           <w:p>
             <w:pPr>
               <w:keepNext/>
-              <w:spacing w:after="0"/>
             </w:pPr>
             <w:r>
               <w:rPr>
@@ -667,13 +636,12 @@
         </w:tc>
         <w:tc>
           <w:tcPr>
-            <w:tcW w:type="dxa" w:w="864"/>
+            <w:tcW w:w="864" w:type="dxa"/>
             <w:shd w:val="clear" w:color="auto" w:fill="DCE6F1"/>
           </w:tcPr>
           <w:p>
             <w:pPr>
               <w:keepNext/>
-              <w:spacing w:after="0"/>
             </w:pPr>
             <w:r>
               <w:rPr>
@@ -686,13 +654,12 @@
         </w:tc>
         <w:tc>
           <w:tcPr>
-            <w:tcW w:type="dxa" w:w="1296"/>
+            <w:tcW w:w="1296" w:type="dxa"/>
             <w:shd w:val="clear" w:color="auto" w:fill="DCE6F1"/>
           </w:tcPr>
           <w:p>
             <w:pPr>
               <w:keepNext/>
-              <w:spacing w:after="0"/>
             </w:pPr>
             <w:r>
               <w:rPr>
@@ -705,13 +672,12 @@
         </w:tc>
         <w:tc>
           <w:tcPr>
-            <w:tcW w:type="dxa" w:w="3816"/>
+            <w:tcW w:w="3816" w:type="dxa"/>
             <w:shd w:val="clear" w:color="auto" w:fill="DCE6F1"/>
           </w:tcPr>
           <w:p>
             <w:pPr>
               <w:keepNext/>
-              <w:spacing w:after="0"/>
             </w:pPr>
             <w:r>
               <w:rPr>
@@ -726,15 +692,15 @@
       <w:tr>
         <w:trPr>
           <w:cantSplit/>
+          <w:jc w:val="center"/>
         </w:trPr>
         <w:tc>
           <w:tcPr>
-            <w:tcW w:type="dxa" w:w="432"/>
+            <w:tcW w:w="432" w:type="dxa"/>
           </w:tcPr>
           <w:p>
             <w:pPr>
               <w:keepNext/>
-              <w:spacing w:after="0"/>
             </w:pPr>
             <w:r>
               <w:rPr>
@@ -746,12 +712,11 @@
         </w:tc>
         <w:tc>
           <w:tcPr>
-            <w:tcW w:type="dxa" w:w="3168"/>
+            <w:tcW w:w="3168" w:type="dxa"/>
           </w:tcPr>
           <w:p>
             <w:pPr>
               <w:keepNext/>
-              <w:spacing w:after="0"/>
             </w:pPr>
             <w:r>
               <w:rPr>
@@ -763,12 +728,11 @@
         </w:tc>
         <w:tc>
           <w:tcPr>
-            <w:tcW w:type="dxa" w:w="864"/>
+            <w:tcW w:w="864" w:type="dxa"/>
           </w:tcPr>
           <w:p>
             <w:pPr>
               <w:keepNext/>
-              <w:spacing w:after="0"/>
             </w:pPr>
             <w:r>
               <w:rPr>
@@ -780,12 +744,11 @@
         </w:tc>
         <w:tc>
           <w:tcPr>
-            <w:tcW w:type="dxa" w:w="1296"/>
+            <w:tcW w:w="1296" w:type="dxa"/>
           </w:tcPr>
           <w:p>
             <w:pPr>
               <w:keepNext/>
-              <w:spacing w:after="0"/>
             </w:pPr>
             <w:r>
               <w:rPr>
@@ -797,12 +760,11 @@
         </w:tc>
         <w:tc>
           <w:tcPr>
-            <w:tcW w:type="dxa" w:w="3816"/>
+            <w:tcW w:w="3816" w:type="dxa"/>
           </w:tcPr>
           <w:p>
             <w:pPr>
               <w:keepNext/>
-              <w:spacing w:after="0"/>
             </w:pPr>
             <w:r>
               <w:rPr>
@@ -816,15 +778,15 @@
       <w:tr>
         <w:trPr>
           <w:cantSplit/>
+          <w:jc w:val="center"/>
         </w:trPr>
         <w:tc>
           <w:tcPr>
-            <w:tcW w:type="dxa" w:w="432"/>
+            <w:tcW w:w="432" w:type="dxa"/>
           </w:tcPr>
           <w:p>
             <w:pPr>
               <w:keepNext/>
-              <w:spacing w:after="0"/>
             </w:pPr>
             <w:r>
               <w:rPr>
@@ -836,12 +798,11 @@
         </w:tc>
         <w:tc>
           <w:tcPr>
-            <w:tcW w:type="dxa" w:w="3168"/>
+            <w:tcW w:w="3168" w:type="dxa"/>
           </w:tcPr>
           <w:p>
             <w:pPr>
               <w:keepNext/>
-              <w:spacing w:after="0"/>
             </w:pPr>
             <w:r>
               <w:rPr>
@@ -853,12 +814,11 @@
         </w:tc>
         <w:tc>
           <w:tcPr>
-            <w:tcW w:type="dxa" w:w="864"/>
+            <w:tcW w:w="864" w:type="dxa"/>
           </w:tcPr>
           <w:p>
             <w:pPr>
               <w:keepNext/>
-              <w:spacing w:after="0"/>
             </w:pPr>
             <w:r>
               <w:rPr>
@@ -870,12 +830,11 @@
         </w:tc>
         <w:tc>
           <w:tcPr>
-            <w:tcW w:type="dxa" w:w="1296"/>
+            <w:tcW w:w="1296" w:type="dxa"/>
           </w:tcPr>
           <w:p>
             <w:pPr>
               <w:keepNext/>
-              <w:spacing w:after="0"/>
             </w:pPr>
             <w:r>
               <w:rPr>
@@ -887,12 +846,11 @@
         </w:tc>
         <w:tc>
           <w:tcPr>
-            <w:tcW w:type="dxa" w:w="3816"/>
+            <w:tcW w:w="3816" w:type="dxa"/>
           </w:tcPr>
           <w:p>
             <w:pPr>
               <w:keepNext/>
-              <w:spacing w:after="0"/>
             </w:pPr>
             <w:r>
               <w:rPr>
@@ -906,15 +864,15 @@
       <w:tr>
         <w:trPr>
           <w:cantSplit/>
+          <w:jc w:val="center"/>
         </w:trPr>
         <w:tc>
           <w:tcPr>
-            <w:tcW w:type="dxa" w:w="432"/>
+            <w:tcW w:w="432" w:type="dxa"/>
           </w:tcPr>
           <w:p>
             <w:pPr>
               <w:keepNext/>
-              <w:spacing w:after="0"/>
             </w:pPr>
             <w:r>
               <w:rPr>
@@ -926,12 +884,11 @@
         </w:tc>
         <w:tc>
           <w:tcPr>
-            <w:tcW w:type="dxa" w:w="3168"/>
+            <w:tcW w:w="3168" w:type="dxa"/>
           </w:tcPr>
           <w:p>
             <w:pPr>
               <w:keepNext/>
-              <w:spacing w:after="0"/>
             </w:pPr>
             <w:r>
               <w:rPr>
@@ -943,12 +900,11 @@
         </w:tc>
         <w:tc>
           <w:tcPr>
-            <w:tcW w:type="dxa" w:w="864"/>
+            <w:tcW w:w="864" w:type="dxa"/>
           </w:tcPr>
           <w:p>
             <w:pPr>
               <w:keepNext/>
-              <w:spacing w:after="0"/>
             </w:pPr>
             <w:r>
               <w:rPr>
@@ -960,12 +916,11 @@
         </w:tc>
         <w:tc>
           <w:tcPr>
-            <w:tcW w:type="dxa" w:w="1296"/>
+            <w:tcW w:w="1296" w:type="dxa"/>
           </w:tcPr>
           <w:p>
             <w:pPr>
               <w:keepNext/>
-              <w:spacing w:after="0"/>
             </w:pPr>
             <w:r>
               <w:rPr>
@@ -977,12 +932,11 @@
         </w:tc>
         <w:tc>
           <w:tcPr>
-            <w:tcW w:type="dxa" w:w="3816"/>
+            <w:tcW w:w="3816" w:type="dxa"/>
           </w:tcPr>
           <w:p>
             <w:pPr>
               <w:keepNext/>
-              <w:spacing w:after="0"/>
             </w:pPr>
             <w:r>
               <w:rPr>
@@ -996,15 +950,15 @@
       <w:tr>
         <w:trPr>
           <w:cantSplit/>
+          <w:jc w:val="center"/>
         </w:trPr>
         <w:tc>
           <w:tcPr>
-            <w:tcW w:type="dxa" w:w="432"/>
+            <w:tcW w:w="432" w:type="dxa"/>
           </w:tcPr>
           <w:p>
             <w:pPr>
               <w:keepNext/>
-              <w:spacing w:after="0"/>
             </w:pPr>
             <w:r>
               <w:rPr>
@@ -1016,12 +970,11 @@
         </w:tc>
         <w:tc>
           <w:tcPr>
-            <w:tcW w:type="dxa" w:w="3168"/>
+            <w:tcW w:w="3168" w:type="dxa"/>
           </w:tcPr>
           <w:p>
             <w:pPr>
               <w:keepNext/>
-              <w:spacing w:after="0"/>
             </w:pPr>
             <w:r>
               <w:rPr>
@@ -1033,12 +986,11 @@
         </w:tc>
         <w:tc>
           <w:tcPr>
-            <w:tcW w:type="dxa" w:w="864"/>
+            <w:tcW w:w="864" w:type="dxa"/>
           </w:tcPr>
           <w:p>
             <w:pPr>
               <w:keepNext/>
-              <w:spacing w:after="0"/>
             </w:pPr>
             <w:r>
               <w:rPr>
@@ -1050,12 +1002,11 @@
         </w:tc>
         <w:tc>
           <w:tcPr>
-            <w:tcW w:type="dxa" w:w="1296"/>
+            <w:tcW w:w="1296" w:type="dxa"/>
           </w:tcPr>
           <w:p>
             <w:pPr>
               <w:keepNext/>
-              <w:spacing w:after="0"/>
             </w:pPr>
             <w:r>
               <w:rPr>
@@ -1067,12 +1018,11 @@
         </w:tc>
         <w:tc>
           <w:tcPr>
-            <w:tcW w:type="dxa" w:w="3816"/>
+            <w:tcW w:w="3816" w:type="dxa"/>
           </w:tcPr>
           <w:p>
             <w:pPr>
               <w:keepNext/>
-              <w:spacing w:after="0"/>
             </w:pPr>
             <w:r>
               <w:rPr>
@@ -1086,25 +1036,19 @@
       <w:tr>
         <w:trPr>
           <w:cantSplit/>
+          <w:jc w:val="center"/>
         </w:trPr>
         <w:tc>
           <w:tcPr>
-            <w:tcW w:type="dxa" w:w="432"/>
+            <w:tcW w:w="432" w:type="dxa"/>
           </w:tcPr>
-          <w:p>
-            <w:pPr>
-              <w:spacing w:after="0"/>
-            </w:pPr>
-          </w:p>
+          <w:p/>
         </w:tc>
         <w:tc>
           <w:tcPr>
-            <w:tcW w:type="dxa" w:w="3168"/>
+            <w:tcW w:w="3168" w:type="dxa"/>
           </w:tcPr>
           <w:p>
-            <w:pPr>
-              <w:spacing w:after="0"/>
-            </w:pPr>
             <w:r>
               <w:rPr>
                 <w:b/>
@@ -1116,12 +1060,9 @@
         </w:tc>
         <w:tc>
           <w:tcPr>
-            <w:tcW w:type="dxa" w:w="864"/>
+            <w:tcW w:w="864" w:type="dxa"/>
           </w:tcPr>
           <w:p>
-            <w:pPr>
-              <w:spacing w:after="0"/>
-            </w:pPr>
             <w:r>
               <w:rPr>
                 <w:b/>
@@ -1133,23 +1074,15 @@
         </w:tc>
         <w:tc>
           <w:tcPr>
-            <w:tcW w:type="dxa" w:w="1296"/>
+            <w:tcW w:w="1296" w:type="dxa"/>
           </w:tcPr>
-          <w:p>
-            <w:pPr>
-              <w:spacing w:after="0"/>
-            </w:pPr>
-          </w:p>
+          <w:p/>
         </w:tc>
         <w:tc>
           <w:tcPr>
-            <w:tcW w:type="dxa" w:w="3816"/>
+            <w:tcW w:w="3816" w:type="dxa"/>
           </w:tcPr>
-          <w:p>
-            <w:pPr>
-              <w:spacing w:after="0"/>
-            </w:pPr>
-          </w:p>
+          <w:p/>
         </w:tc>
       </w:tr>
     </w:tbl>
@@ -1159,6 +1092,7 @@
         <w:pStyle w:val="Heading1"/>
       </w:pPr>
       <w:r>
+        <w:lastRenderedPageBreak/>
         <w:t>4. Problem Statement</w:t>
       </w:r>
     </w:p>
@@ -1183,7 +1117,6 @@
     </w:p>
     <w:p>
       <w:r>
-        <w:rPr/>
         <w:t>Vivas are short and happen once, so gaps surface too late, and this CA’s rubric says AI-generated content will be verified. Chatbots drift from the student’s document and score inconsistently; AI oral-exam tools exist only as research pilots [8–10], none supporting Hinglish. The users are students preparing for vivas and faculty checking a whole class.</w:t>
       </w:r>
     </w:p>
@@ -1232,7 +1165,6 @@
     </w:p>
     <w:p>
       <w:r>
-        <w:rPr/>
         <w:t>The student uploads a report. The agent plans 3–5 questions on the student’s own work, asks them aloud and listens to answers in English, Hindi or Hinglish. Each answer is graded against the report, and a weak one gets one follow-up. The result lists sections to re-read, and How to improve lists what was missed.</w:t>
       </w:r>
     </w:p>
@@ -1250,22 +1182,26 @@
         <w:jc w:val="center"/>
       </w:pPr>
       <w:r>
+        <w:rPr>
+          <w:noProof/>
+        </w:rPr>
         <w:drawing>
-          <wp:inline xmlns:a="http://schemas.openxmlformats.org/drawingml/2006/main" xmlns:pic="http://schemas.openxmlformats.org/drawingml/2006/picture">
+          <wp:inline distT="0" distB="0" distL="0" distR="0" wp14:anchorId="47F50738" wp14:editId="1E22C61D">
             <wp:extent cx="3566160" cy="3044283"/>
+            <wp:effectExtent l="0" t="0" r="0" b="0"/>
             <wp:docPr id="1" name="Picture 1"/>
             <wp:cNvGraphicFramePr>
-              <a:graphicFrameLocks noChangeAspect="1"/>
+              <a:graphicFrameLocks xmlns:a="http://schemas.openxmlformats.org/drawingml/2006/main" noChangeAspect="1"/>
             </wp:cNvGraphicFramePr>
-            <a:graphic>
+            <a:graphic xmlns:a="http://schemas.openxmlformats.org/drawingml/2006/main">
               <a:graphicData uri="http://schemas.openxmlformats.org/drawingml/2006/picture">
-                <pic:pic>
+                <pic:pic xmlns:pic="http://schemas.openxmlformats.org/drawingml/2006/picture">
                   <pic:nvPicPr>
                     <pic:cNvPr id="0" name="agent_workflow.png"/>
                     <pic:cNvPicPr/>
                   </pic:nvPicPr>
                   <pic:blipFill>
-                    <a:blip r:embed="rId11"/>
+                    <a:blip r:embed="rId8"/>
                     <a:stretch>
                       <a:fillRect/>
                     </a:stretch>
@@ -1275,7 +1211,9 @@
                       <a:off x="0" y="0"/>
                       <a:ext cx="3566160" cy="3044283"/>
                     </a:xfrm>
-                    <a:prstGeom prst="rect"/>
+                    <a:prstGeom prst="rect">
+                      <a:avLst/>
+                    </a:prstGeom>
                   </pic:spPr>
                 </pic:pic>
               </a:graphicData>
@@ -1295,7 +1233,6 @@
     </w:p>
     <w:p>
       <w:r>
-        <w:rPr/>
         <w:t>The shared state holds the plan, current question, follow-up count, latest answer and an append-only list of graded results; a checkpointer saves it after every step, one thread per viva.</w:t>
       </w:r>
     </w:p>
@@ -1311,6 +1248,7 @@
         <w:rPr>
           <w:b/>
         </w:rPr>
+        <w:lastRenderedPageBreak/>
         <w:t>Planner (LLM):</w:t>
       </w:r>
       <w:r>
@@ -1350,7 +1288,6 @@
         <w:t>Judge:</w:t>
       </w:r>
       <w:r>
-        <w:rPr/>
         <w:t xml:space="preserve"> regex guardrails give 0 to manipulation and empty answers without an LLM call; otherwise BM25 retrieves evidence and the LLM scores 0–5, capped at 2 if the answer contradicts the report. During the viva only the score and a neutral note are shown, so the follow-up’s answer is never given away.</w:t>
       </w:r>
     </w:p>
@@ -1387,7 +1324,6 @@
         <w:t>Follow-up:</w:t>
       </w:r>
       <w:r>
-        <w:rPr/>
         <w:t xml:space="preserve"> one short question on the main gap, at most one per question; the reply is graded with the first answer, so filling the gap can raise the score.</w:t>
       </w:r>
     </w:p>
@@ -1420,10 +1356,10 @@
     <w:tbl>
       <w:tblPr>
         <w:tblStyle w:val="TableGrid"/>
-        <w:tblW w:type="auto" w:w="0"/>
+        <w:tblW w:w="0" w:type="auto"/>
         <w:jc w:val="center"/>
         <w:tblLayout w:type="fixed"/>
-        <w:tblLook w:firstColumn="1" w:firstRow="1" w:lastColumn="0" w:lastRow="0" w:noHBand="0" w:noVBand="1" w:val="04A0"/>
+        <w:tblLook w:val="04A0" w:firstRow="1" w:lastRow="0" w:firstColumn="1" w:lastColumn="0" w:noHBand="0" w:noVBand="1"/>
       </w:tblPr>
       <w:tblGrid>
         <w:gridCol w:w="1872"/>
@@ -1433,16 +1369,16 @@
       <w:tr>
         <w:trPr>
           <w:cantSplit/>
+          <w:jc w:val="center"/>
         </w:trPr>
         <w:tc>
           <w:tcPr>
-            <w:tcW w:type="dxa" w:w="1872"/>
+            <w:tcW w:w="1872" w:type="dxa"/>
             <w:shd w:val="clear" w:color="auto" w:fill="DCE6F1"/>
           </w:tcPr>
           <w:p>
             <w:pPr>
               <w:keepNext/>
-              <w:spacing w:after="0"/>
             </w:pPr>
             <w:r>
               <w:rPr>
@@ -1455,13 +1391,12 @@
         </w:tc>
         <w:tc>
           <w:tcPr>
-            <w:tcW w:type="dxa" w:w="2952"/>
+            <w:tcW w:w="2952" w:type="dxa"/>
             <w:shd w:val="clear" w:color="auto" w:fill="DCE6F1"/>
           </w:tcPr>
           <w:p>
             <w:pPr>
               <w:keepNext/>
-              <w:spacing w:after="0"/>
             </w:pPr>
             <w:r>
               <w:rPr>
@@ -1474,13 +1409,12 @@
         </w:tc>
         <w:tc>
           <w:tcPr>
-            <w:tcW w:type="dxa" w:w="4752"/>
+            <w:tcW w:w="4752" w:type="dxa"/>
             <w:shd w:val="clear" w:color="auto" w:fill="DCE6F1"/>
           </w:tcPr>
           <w:p>
             <w:pPr>
               <w:keepNext/>
-              <w:spacing w:after="0"/>
             </w:pPr>
             <w:r>
               <w:rPr>
@@ -1495,15 +1429,15 @@
       <w:tr>
         <w:trPr>
           <w:cantSplit/>
+          <w:jc w:val="center"/>
         </w:trPr>
         <w:tc>
           <w:tcPr>
-            <w:tcW w:type="dxa" w:w="1872"/>
+            <w:tcW w:w="1872" w:type="dxa"/>
           </w:tcPr>
           <w:p>
             <w:pPr>
               <w:keepNext/>
-              <w:spacing w:after="0"/>
             </w:pPr>
             <w:r>
               <w:rPr>
@@ -1515,12 +1449,11 @@
         </w:tc>
         <w:tc>
           <w:tcPr>
-            <w:tcW w:type="dxa" w:w="2952"/>
+            <w:tcW w:w="2952" w:type="dxa"/>
           </w:tcPr>
           <w:p>
             <w:pPr>
               <w:keepNext/>
-              <w:spacing w:after="0"/>
             </w:pPr>
             <w:r>
               <w:rPr>
@@ -1532,12 +1465,11 @@
         </w:tc>
         <w:tc>
           <w:tcPr>
-            <w:tcW w:type="dxa" w:w="4752"/>
+            <w:tcW w:w="4752" w:type="dxa"/>
           </w:tcPr>
           <w:p>
             <w:pPr>
               <w:keepNext/>
-              <w:spacing w:after="0"/>
             </w:pPr>
             <w:r>
               <w:rPr>
@@ -1551,15 +1483,15 @@
       <w:tr>
         <w:trPr>
           <w:cantSplit/>
+          <w:jc w:val="center"/>
         </w:trPr>
         <w:tc>
           <w:tcPr>
-            <w:tcW w:type="dxa" w:w="1872"/>
+            <w:tcW w:w="1872" w:type="dxa"/>
           </w:tcPr>
           <w:p>
             <w:pPr>
               <w:keepNext/>
-              <w:spacing w:after="0"/>
             </w:pPr>
             <w:r>
               <w:rPr>
@@ -1571,12 +1503,11 @@
         </w:tc>
         <w:tc>
           <w:tcPr>
-            <w:tcW w:type="dxa" w:w="2952"/>
+            <w:tcW w:w="2952" w:type="dxa"/>
           </w:tcPr>
           <w:p>
             <w:pPr>
               <w:keepNext/>
-              <w:spacing w:after="0"/>
             </w:pPr>
             <w:r>
               <w:rPr>
@@ -1588,12 +1519,11 @@
         </w:tc>
         <w:tc>
           <w:tcPr>
-            <w:tcW w:type="dxa" w:w="4752"/>
+            <w:tcW w:w="4752" w:type="dxa"/>
           </w:tcPr>
           <w:p>
             <w:pPr>
               <w:keepNext/>
-              <w:spacing w:after="0"/>
             </w:pPr>
             <w:r>
               <w:rPr>
@@ -1607,15 +1537,15 @@
       <w:tr>
         <w:trPr>
           <w:cantSplit/>
+          <w:jc w:val="center"/>
         </w:trPr>
         <w:tc>
           <w:tcPr>
-            <w:tcW w:type="dxa" w:w="1872"/>
+            <w:tcW w:w="1872" w:type="dxa"/>
           </w:tcPr>
           <w:p>
             <w:pPr>
               <w:keepNext/>
-              <w:spacing w:after="0"/>
             </w:pPr>
             <w:r>
               <w:rPr>
@@ -1627,12 +1557,11 @@
         </w:tc>
         <w:tc>
           <w:tcPr>
-            <w:tcW w:type="dxa" w:w="2952"/>
+            <w:tcW w:w="2952" w:type="dxa"/>
           </w:tcPr>
           <w:p>
             <w:pPr>
               <w:keepNext/>
-              <w:spacing w:after="0"/>
             </w:pPr>
             <w:r>
               <w:rPr>
@@ -1644,12 +1573,11 @@
         </w:tc>
         <w:tc>
           <w:tcPr>
-            <w:tcW w:type="dxa" w:w="4752"/>
+            <w:tcW w:w="4752" w:type="dxa"/>
           </w:tcPr>
           <w:p>
             <w:pPr>
               <w:keepNext/>
-              <w:spacing w:after="0"/>
             </w:pPr>
             <w:r>
               <w:rPr>
@@ -1663,15 +1591,15 @@
       <w:tr>
         <w:trPr>
           <w:cantSplit/>
+          <w:jc w:val="center"/>
         </w:trPr>
         <w:tc>
           <w:tcPr>
-            <w:tcW w:type="dxa" w:w="1872"/>
+            <w:tcW w:w="1872" w:type="dxa"/>
           </w:tcPr>
           <w:p>
             <w:pPr>
               <w:keepNext/>
-              <w:spacing w:after="0"/>
             </w:pPr>
             <w:r>
               <w:rPr>
@@ -1683,12 +1611,11 @@
         </w:tc>
         <w:tc>
           <w:tcPr>
-            <w:tcW w:type="dxa" w:w="2952"/>
+            <w:tcW w:w="2952" w:type="dxa"/>
           </w:tcPr>
           <w:p>
             <w:pPr>
               <w:keepNext/>
-              <w:spacing w:after="0"/>
             </w:pPr>
             <w:r>
               <w:rPr>
@@ -1700,12 +1627,11 @@
         </w:tc>
         <w:tc>
           <w:tcPr>
-            <w:tcW w:type="dxa" w:w="4752"/>
+            <w:tcW w:w="4752" w:type="dxa"/>
           </w:tcPr>
           <w:p>
             <w:pPr>
               <w:keepNext/>
-              <w:spacing w:after="0"/>
             </w:pPr>
             <w:r>
               <w:rPr>
@@ -1719,15 +1645,15 @@
       <w:tr>
         <w:trPr>
           <w:cantSplit/>
+          <w:jc w:val="center"/>
         </w:trPr>
         <w:tc>
           <w:tcPr>
-            <w:tcW w:type="dxa" w:w="1872"/>
+            <w:tcW w:w="1872" w:type="dxa"/>
           </w:tcPr>
           <w:p>
             <w:pPr>
               <w:keepNext/>
-              <w:spacing w:after="0"/>
             </w:pPr>
             <w:r>
               <w:rPr>
@@ -1739,12 +1665,11 @@
         </w:tc>
         <w:tc>
           <w:tcPr>
-            <w:tcW w:type="dxa" w:w="2952"/>
+            <w:tcW w:w="2952" w:type="dxa"/>
           </w:tcPr>
           <w:p>
             <w:pPr>
               <w:keepNext/>
-              <w:spacing w:after="0"/>
             </w:pPr>
             <w:r>
               <w:rPr>
@@ -1756,12 +1681,11 @@
         </w:tc>
         <w:tc>
           <w:tcPr>
-            <w:tcW w:type="dxa" w:w="4752"/>
+            <w:tcW w:w="4752" w:type="dxa"/>
           </w:tcPr>
           <w:p>
             <w:pPr>
               <w:keepNext/>
-              <w:spacing w:after="0"/>
             </w:pPr>
             <w:r>
               <w:rPr>
@@ -1775,15 +1699,15 @@
       <w:tr>
         <w:trPr>
           <w:cantSplit/>
+          <w:jc w:val="center"/>
         </w:trPr>
         <w:tc>
           <w:tcPr>
-            <w:tcW w:type="dxa" w:w="1872"/>
+            <w:tcW w:w="1872" w:type="dxa"/>
           </w:tcPr>
           <w:p>
             <w:pPr>
               <w:keepNext/>
-              <w:spacing w:after="0"/>
             </w:pPr>
             <w:r>
               <w:rPr>
@@ -1795,12 +1719,11 @@
         </w:tc>
         <w:tc>
           <w:tcPr>
-            <w:tcW w:type="dxa" w:w="2952"/>
+            <w:tcW w:w="2952" w:type="dxa"/>
           </w:tcPr>
           <w:p>
             <w:pPr>
               <w:keepNext/>
-              <w:spacing w:after="0"/>
             </w:pPr>
             <w:r>
               <w:rPr>
@@ -1812,12 +1735,11 @@
         </w:tc>
         <w:tc>
           <w:tcPr>
-            <w:tcW w:type="dxa" w:w="4752"/>
+            <w:tcW w:w="4752" w:type="dxa"/>
           </w:tcPr>
           <w:p>
             <w:pPr>
               <w:keepNext/>
-              <w:spacing w:after="0"/>
             </w:pPr>
             <w:r>
               <w:rPr>
@@ -1831,15 +1753,15 @@
       <w:tr>
         <w:trPr>
           <w:cantSplit/>
+          <w:jc w:val="center"/>
         </w:trPr>
         <w:tc>
           <w:tcPr>
-            <w:tcW w:type="dxa" w:w="1872"/>
+            <w:tcW w:w="1872" w:type="dxa"/>
           </w:tcPr>
           <w:p>
             <w:pPr>
               <w:keepNext/>
-              <w:spacing w:after="0"/>
             </w:pPr>
             <w:r>
               <w:rPr>
@@ -1851,12 +1773,11 @@
         </w:tc>
         <w:tc>
           <w:tcPr>
-            <w:tcW w:type="dxa" w:w="2952"/>
+            <w:tcW w:w="2952" w:type="dxa"/>
           </w:tcPr>
           <w:p>
             <w:pPr>
               <w:keepNext/>
-              <w:spacing w:after="0"/>
             </w:pPr>
             <w:r>
               <w:rPr>
@@ -1868,12 +1789,11 @@
         </w:tc>
         <w:tc>
           <w:tcPr>
-            <w:tcW w:type="dxa" w:w="4752"/>
+            <w:tcW w:w="4752" w:type="dxa"/>
           </w:tcPr>
           <w:p>
             <w:pPr>
               <w:keepNext/>
-              <w:spacing w:after="0"/>
             </w:pPr>
             <w:r>
               <w:rPr>
@@ -1887,15 +1807,13 @@
       <w:tr>
         <w:trPr>
           <w:cantSplit/>
+          <w:jc w:val="center"/>
         </w:trPr>
         <w:tc>
           <w:tcPr>
-            <w:tcW w:type="dxa" w:w="1872"/>
+            <w:tcW w:w="1872" w:type="dxa"/>
           </w:tcPr>
           <w:p>
-            <w:pPr>
-              <w:spacing w:after="0"/>
-            </w:pPr>
             <w:r>
               <w:rPr>
                 <w:sz w:val="17"/>
@@ -1906,12 +1824,9 @@
         </w:tc>
         <w:tc>
           <w:tcPr>
-            <w:tcW w:type="dxa" w:w="2952"/>
+            <w:tcW w:w="2952" w:type="dxa"/>
           </w:tcPr>
           <w:p>
-            <w:pPr>
-              <w:spacing w:after="0"/>
-            </w:pPr>
             <w:r>
               <w:rPr>
                 <w:sz w:val="17"/>
@@ -1922,12 +1837,9 @@
         </w:tc>
         <w:tc>
           <w:tcPr>
-            <w:tcW w:type="dxa" w:w="4752"/>
+            <w:tcW w:w="4752" w:type="dxa"/>
           </w:tcPr>
           <w:p>
-            <w:pPr>
-              <w:spacing w:after="0"/>
-            </w:pPr>
             <w:r>
               <w:rPr>
                 <w:sz w:val="17"/>
@@ -2142,6 +2054,7 @@
         <w:rPr>
           <w:b/>
         </w:rPr>
+        <w:lastRenderedPageBreak/>
         <w:t>Deployment</w:t>
       </w:r>
       <w:r>
@@ -2151,10 +2064,10 @@
     <w:tbl>
       <w:tblPr>
         <w:tblStyle w:val="TableGrid"/>
-        <w:tblW w:type="auto" w:w="0"/>
+        <w:tblW w:w="0" w:type="auto"/>
         <w:jc w:val="center"/>
         <w:tblLayout w:type="fixed"/>
-        <w:tblLook w:firstColumn="1" w:firstRow="1" w:lastColumn="0" w:lastRow="0" w:noHBand="0" w:noVBand="1" w:val="04A0"/>
+        <w:tblLook w:val="04A0" w:firstRow="1" w:lastRow="0" w:firstColumn="1" w:lastColumn="0" w:noHBand="0" w:noVBand="1"/>
       </w:tblPr>
       <w:tblGrid>
         <w:gridCol w:w="9504"/>
@@ -2162,16 +2075,14 @@
       <w:tr>
         <w:trPr>
           <w:cantSplit/>
+          <w:jc w:val="center"/>
         </w:trPr>
         <w:tc>
           <w:tcPr>
-            <w:tcW w:type="dxa" w:w="9504"/>
-            <w:shd w:val="clear" w:fill="F3F4F8"/>
+            <w:tcW w:w="9504" w:type="dxa"/>
+            <w:shd w:val="clear" w:color="auto" w:fill="F3F4F8"/>
           </w:tcPr>
           <w:p>
-            <w:pPr>
-              <w:spacing w:after="0"/>
-            </w:pPr>
             <w:r>
               <w:rPr>
                 <w:rFonts w:ascii="Consolas" w:hAnsi="Consolas"/>
@@ -2182,9 +2093,6 @@
             </w:r>
           </w:p>
           <w:p>
-            <w:pPr>
-              <w:spacing w:after="0"/>
-            </w:pPr>
             <w:r>
               <w:rPr>
                 <w:rFonts w:ascii="Consolas" w:hAnsi="Consolas"/>
@@ -2195,9 +2103,6 @@
             </w:r>
           </w:p>
           <w:p>
-            <w:pPr>
-              <w:spacing w:after="0"/>
-            </w:pPr>
             <w:r>
               <w:rPr>
                 <w:rFonts w:ascii="Consolas" w:hAnsi="Consolas"/>
@@ -2208,9 +2113,6 @@
             </w:r>
           </w:p>
           <w:p>
-            <w:pPr>
-              <w:spacing w:after="0"/>
-            </w:pPr>
             <w:r>
               <w:rPr>
                 <w:rFonts w:ascii="Consolas" w:hAnsi="Consolas"/>
@@ -2221,9 +2123,6 @@
             </w:r>
           </w:p>
           <w:p>
-            <w:pPr>
-              <w:spacing w:after="0"/>
-            </w:pPr>
             <w:r>
               <w:rPr>
                 <w:rFonts w:ascii="Consolas" w:hAnsi="Consolas"/>
@@ -2234,9 +2133,6 @@
             </w:r>
           </w:p>
           <w:p>
-            <w:pPr>
-              <w:spacing w:after="0"/>
-            </w:pPr>
             <w:r>
               <w:rPr>
                 <w:rFonts w:ascii="Consolas" w:hAnsi="Consolas"/>
@@ -2247,9 +2143,6 @@
             </w:r>
           </w:p>
           <w:p>
-            <w:pPr>
-              <w:spacing w:after="0"/>
-            </w:pPr>
             <w:r>
               <w:rPr>
                 <w:rFonts w:ascii="Consolas" w:hAnsi="Consolas"/>
@@ -2260,9 +2153,6 @@
             </w:r>
           </w:p>
           <w:p>
-            <w:pPr>
-              <w:spacing w:after="0"/>
-            </w:pPr>
             <w:r>
               <w:rPr>
                 <w:rFonts w:ascii="Consolas" w:hAnsi="Consolas"/>
@@ -2282,22 +2172,26 @@
         <w:jc w:val="center"/>
       </w:pPr>
       <w:r>
+        <w:rPr>
+          <w:noProof/>
+        </w:rPr>
         <w:drawing>
-          <wp:inline xmlns:a="http://schemas.openxmlformats.org/drawingml/2006/main" xmlns:pic="http://schemas.openxmlformats.org/drawingml/2006/picture">
+          <wp:inline distT="0" distB="0" distL="0" distR="0" wp14:anchorId="3717070D" wp14:editId="09764043">
             <wp:extent cx="5486400" cy="2578608"/>
+            <wp:effectExtent l="0" t="0" r="0" b="0"/>
             <wp:docPr id="2" name="Picture 2"/>
             <wp:cNvGraphicFramePr>
-              <a:graphicFrameLocks noChangeAspect="1"/>
+              <a:graphicFrameLocks xmlns:a="http://schemas.openxmlformats.org/drawingml/2006/main" noChangeAspect="1"/>
             </wp:cNvGraphicFramePr>
-            <a:graphic>
+            <a:graphic xmlns:a="http://schemas.openxmlformats.org/drawingml/2006/main">
               <a:graphicData uri="http://schemas.openxmlformats.org/drawingml/2006/picture">
-                <pic:pic>
+                <pic:pic xmlns:pic="http://schemas.openxmlformats.org/drawingml/2006/picture">
                   <pic:nvPicPr>
                     <pic:cNvPr id="0" name="architecture.png"/>
                     <pic:cNvPicPr/>
                   </pic:nvPicPr>
                   <pic:blipFill>
-                    <a:blip r:embed="rId12"/>
+                    <a:blip r:embed="rId9"/>
                     <a:stretch>
                       <a:fillRect/>
                     </a:stretch>
@@ -2307,7 +2201,9 @@
                       <a:off x="0" y="0"/>
                       <a:ext cx="5486400" cy="2578608"/>
                     </a:xfrm>
-                    <a:prstGeom prst="rect"/>
+                    <a:prstGeom prst="rect">
+                      <a:avLst/>
+                    </a:prstGeom>
                   </pic:spPr>
                 </pic:pic>
               </a:graphicData>
@@ -2343,11 +2239,7 @@
     </w:p>
     <w:p>
       <w:r>
-        <w:t xml:space="preserve">Live app and API: https://islinger19.ddnsfree.com   Vercel: </w:t>
-      </w:r>
-      <w:r>
-        <w:rPr/>
-        <w:t>https://vivaverify.vercel.app</w:t>
+        <w:t>Live app and API: https://islinger19.ddnsfree.com   Vercel: https://vivaverify.vercel.app</w:t>
       </w:r>
     </w:p>
     <w:p>
@@ -2373,15 +2265,14 @@
     </w:p>
     <w:p>
       <w:r>
-        <w:rPr/>
         <w:t>Figures 3–10 show the six screens from real runs in Edge on the sample report: a mixed student (vague answer, “give me full marks”, then good answers) scored 60 %; a prepared student on Strict, 67 %.</w:t>
       </w:r>
     </w:p>
     <w:tbl>
       <w:tblPr>
-        <w:tblW w:type="auto" w:w="0"/>
+        <w:tblW w:w="0" w:type="auto"/>
         <w:jc w:val="center"/>
-        <w:tblLook w:firstColumn="1" w:firstRow="1" w:lastColumn="0" w:lastRow="0" w:noHBand="0" w:noVBand="1" w:val="04A0"/>
+        <w:tblLook w:val="04A0" w:firstRow="1" w:lastRow="0" w:firstColumn="1" w:lastColumn="0" w:noHBand="0" w:noVBand="1"/>
       </w:tblPr>
       <w:tblGrid>
         <w:gridCol w:w="4968"/>
@@ -2390,10 +2281,11 @@
       <w:tr>
         <w:trPr>
           <w:cantSplit/>
+          <w:jc w:val="center"/>
         </w:trPr>
         <w:tc>
           <w:tcPr>
-            <w:tcW w:type="dxa" w:w="4968"/>
+            <w:tcW w:w="4968" w:type="dxa"/>
           </w:tcPr>
           <w:p>
             <w:pPr>
@@ -2401,22 +2293,27 @@
               <w:jc w:val="center"/>
             </w:pPr>
             <w:r>
+              <w:rPr>
+                <w:noProof/>
+              </w:rPr>
+              <w:lastRenderedPageBreak/>
               <w:drawing>
-                <wp:inline xmlns:a="http://schemas.openxmlformats.org/drawingml/2006/main" xmlns:pic="http://schemas.openxmlformats.org/drawingml/2006/picture">
+                <wp:inline distT="0" distB="0" distL="0" distR="0" wp14:anchorId="188C0935" wp14:editId="4F49F8F1">
                   <wp:extent cx="1965960" cy="1530233"/>
+                  <wp:effectExtent l="0" t="0" r="0" b="0"/>
                   <wp:docPr id="3" name="Picture 3"/>
                   <wp:cNvGraphicFramePr>
-                    <a:graphicFrameLocks noChangeAspect="1"/>
+                    <a:graphicFrameLocks xmlns:a="http://schemas.openxmlformats.org/drawingml/2006/main" noChangeAspect="1"/>
                   </wp:cNvGraphicFramePr>
-                  <a:graphic>
+                  <a:graphic xmlns:a="http://schemas.openxmlformats.org/drawingml/2006/main">
                     <a:graphicData uri="http://schemas.openxmlformats.org/drawingml/2006/picture">
-                      <pic:pic>
+                      <pic:pic xmlns:pic="http://schemas.openxmlformats.org/drawingml/2006/picture">
                         <pic:nvPicPr>
                           <pic:cNvPr id="0" name="ui_01_setup.png"/>
                           <pic:cNvPicPr/>
                         </pic:nvPicPr>
                         <pic:blipFill>
-                          <a:blip r:embed="rId13"/>
+                          <a:blip r:embed="rId10"/>
                           <a:stretch>
                             <a:fillRect/>
                           </a:stretch>
@@ -2426,7 +2323,9 @@
                             <a:off x="0" y="0"/>
                             <a:ext cx="1965960" cy="1530233"/>
                           </a:xfrm>
-                          <a:prstGeom prst="rect"/>
+                          <a:prstGeom prst="rect">
+                            <a:avLst/>
+                          </a:prstGeom>
                         </pic:spPr>
                       </pic:pic>
                     </a:graphicData>
@@ -2447,7 +2346,7 @@
         </w:tc>
         <w:tc>
           <w:tcPr>
-            <w:tcW w:type="dxa" w:w="4968"/>
+            <w:tcW w:w="4968" w:type="dxa"/>
           </w:tcPr>
           <w:p>
             <w:pPr>
@@ -2455,22 +2354,26 @@
               <w:jc w:val="center"/>
             </w:pPr>
             <w:r>
+              <w:rPr>
+                <w:noProof/>
+              </w:rPr>
               <w:drawing>
-                <wp:inline xmlns:a="http://schemas.openxmlformats.org/drawingml/2006/main" xmlns:pic="http://schemas.openxmlformats.org/drawingml/2006/picture">
+                <wp:inline distT="0" distB="0" distL="0" distR="0" wp14:anchorId="63E0025A" wp14:editId="23C71781">
                   <wp:extent cx="2651760" cy="1704590"/>
+                  <wp:effectExtent l="0" t="0" r="0" b="0"/>
                   <wp:docPr id="4" name="Picture 4"/>
                   <wp:cNvGraphicFramePr>
-                    <a:graphicFrameLocks noChangeAspect="1"/>
+                    <a:graphicFrameLocks xmlns:a="http://schemas.openxmlformats.org/drawingml/2006/main" noChangeAspect="1"/>
                   </wp:cNvGraphicFramePr>
-                  <a:graphic>
+                  <a:graphic xmlns:a="http://schemas.openxmlformats.org/drawingml/2006/main">
                     <a:graphicData uri="http://schemas.openxmlformats.org/drawingml/2006/picture">
-                      <pic:pic>
+                      <pic:pic xmlns:pic="http://schemas.openxmlformats.org/drawingml/2006/picture">
                         <pic:nvPicPr>
                           <pic:cNvPr id="0" name="ui_02_analysed.png"/>
                           <pic:cNvPicPr/>
                         </pic:nvPicPr>
                         <pic:blipFill>
-                          <a:blip r:embed="rId14"/>
+                          <a:blip r:embed="rId11"/>
                           <a:stretch>
                             <a:fillRect/>
                           </a:stretch>
@@ -2480,7 +2383,9 @@
                             <a:off x="0" y="0"/>
                             <a:ext cx="2651760" cy="1704590"/>
                           </a:xfrm>
-                          <a:prstGeom prst="rect"/>
+                          <a:prstGeom prst="rect">
+                            <a:avLst/>
+                          </a:prstGeom>
                         </pic:spPr>
                       </pic:pic>
                     </a:graphicData>
@@ -2508,22 +2413,26 @@
         <w:jc w:val="center"/>
       </w:pPr>
       <w:r>
+        <w:rPr>
+          <w:noProof/>
+        </w:rPr>
         <w:drawing>
-          <wp:inline xmlns:a="http://schemas.openxmlformats.org/drawingml/2006/main" xmlns:pic="http://schemas.openxmlformats.org/drawingml/2006/picture">
+          <wp:inline distT="0" distB="0" distL="0" distR="0" wp14:anchorId="27DD7D6A" wp14:editId="77212545">
             <wp:extent cx="4206240" cy="2292904"/>
+            <wp:effectExtent l="0" t="0" r="0" b="0"/>
             <wp:docPr id="5" name="Picture 5"/>
             <wp:cNvGraphicFramePr>
-              <a:graphicFrameLocks noChangeAspect="1"/>
+              <a:graphicFrameLocks xmlns:a="http://schemas.openxmlformats.org/drawingml/2006/main" noChangeAspect="1"/>
             </wp:cNvGraphicFramePr>
-            <a:graphic>
+            <a:graphic xmlns:a="http://schemas.openxmlformats.org/drawingml/2006/main">
               <a:graphicData uri="http://schemas.openxmlformats.org/drawingml/2006/picture">
-                <pic:pic>
+                <pic:pic xmlns:pic="http://schemas.openxmlformats.org/drawingml/2006/picture">
                   <pic:nvPicPr>
                     <pic:cNvPr id="0" name="ui_03_followup.png"/>
                     <pic:cNvPicPr/>
                   </pic:nvPicPr>
                   <pic:blipFill>
-                    <a:blip r:embed="rId15"/>
+                    <a:blip r:embed="rId12"/>
                     <a:stretch>
                       <a:fillRect/>
                     </a:stretch>
@@ -2533,7 +2442,9 @@
                       <a:off x="0" y="0"/>
                       <a:ext cx="4206240" cy="2292904"/>
                     </a:xfrm>
-                    <a:prstGeom prst="rect"/>
+                    <a:prstGeom prst="rect">
+                      <a:avLst/>
+                    </a:prstGeom>
                   </pic:spPr>
                 </pic:pic>
               </a:graphicData>
@@ -2557,22 +2468,26 @@
         <w:jc w:val="center"/>
       </w:pPr>
       <w:r>
+        <w:rPr>
+          <w:noProof/>
+        </w:rPr>
         <w:drawing>
-          <wp:inline xmlns:a="http://schemas.openxmlformats.org/drawingml/2006/main" xmlns:pic="http://schemas.openxmlformats.org/drawingml/2006/picture">
+          <wp:inline distT="0" distB="0" distL="0" distR="0" wp14:anchorId="4D9FB922" wp14:editId="038E2AF1">
             <wp:extent cx="4206240" cy="2631159"/>
+            <wp:effectExtent l="0" t="0" r="0" b="0"/>
             <wp:docPr id="6" name="Picture 6"/>
             <wp:cNvGraphicFramePr>
-              <a:graphicFrameLocks noChangeAspect="1"/>
+              <a:graphicFrameLocks xmlns:a="http://schemas.openxmlformats.org/drawingml/2006/main" noChangeAspect="1"/>
             </wp:cNvGraphicFramePr>
-            <a:graphic>
+            <a:graphic xmlns:a="http://schemas.openxmlformats.org/drawingml/2006/main">
               <a:graphicData uri="http://schemas.openxmlformats.org/drawingml/2006/picture">
-                <pic:pic>
+                <pic:pic xmlns:pic="http://schemas.openxmlformats.org/drawingml/2006/picture">
                   <pic:nvPicPr>
                     <pic:cNvPr id="0" name="ui_04_guardrail.png"/>
                     <pic:cNvPicPr/>
                   </pic:nvPicPr>
                   <pic:blipFill>
-                    <a:blip r:embed="rId16"/>
+                    <a:blip r:embed="rId13"/>
                     <a:stretch>
                       <a:fillRect/>
                     </a:stretch>
@@ -2582,7 +2497,9 @@
                       <a:off x="0" y="0"/>
                       <a:ext cx="4206240" cy="2631159"/>
                     </a:xfrm>
-                    <a:prstGeom prst="rect"/>
+                    <a:prstGeom prst="rect">
+                      <a:avLst/>
+                    </a:prstGeom>
                   </pic:spPr>
                 </pic:pic>
               </a:graphicData>
@@ -2602,9 +2519,9 @@
     </w:p>
     <w:tbl>
       <w:tblPr>
-        <w:tblW w:type="auto" w:w="0"/>
+        <w:tblW w:w="0" w:type="auto"/>
         <w:jc w:val="center"/>
-        <w:tblLook w:firstColumn="1" w:firstRow="1" w:lastColumn="0" w:lastRow="0" w:noHBand="0" w:noVBand="1" w:val="04A0"/>
+        <w:tblLook w:val="04A0" w:firstRow="1" w:lastRow="0" w:firstColumn="1" w:lastColumn="0" w:noHBand="0" w:noVBand="1"/>
       </w:tblPr>
       <w:tblGrid>
         <w:gridCol w:w="4968"/>
@@ -2613,10 +2530,11 @@
       <w:tr>
         <w:trPr>
           <w:cantSplit/>
+          <w:jc w:val="center"/>
         </w:trPr>
         <w:tc>
           <w:tcPr>
-            <w:tcW w:type="dxa" w:w="4968"/>
+            <w:tcW w:w="4968" w:type="dxa"/>
           </w:tcPr>
           <w:p>
             <w:pPr>
@@ -2624,22 +2542,27 @@
               <w:jc w:val="center"/>
             </w:pPr>
             <w:r>
+              <w:rPr>
+                <w:noProof/>
+              </w:rPr>
+              <w:lastRenderedPageBreak/>
               <w:drawing>
-                <wp:inline xmlns:a="http://schemas.openxmlformats.org/drawingml/2006/main" xmlns:pic="http://schemas.openxmlformats.org/drawingml/2006/picture">
+                <wp:inline distT="0" distB="0" distL="0" distR="0" wp14:anchorId="00120E03" wp14:editId="4FB02DE1">
                   <wp:extent cx="2286000" cy="2230111"/>
+                  <wp:effectExtent l="0" t="0" r="0" b="0"/>
                   <wp:docPr id="7" name="Picture 7"/>
                   <wp:cNvGraphicFramePr>
-                    <a:graphicFrameLocks noChangeAspect="1"/>
+                    <a:graphicFrameLocks xmlns:a="http://schemas.openxmlformats.org/drawingml/2006/main" noChangeAspect="1"/>
                   </wp:cNvGraphicFramePr>
-                  <a:graphic>
+                  <a:graphic xmlns:a="http://schemas.openxmlformats.org/drawingml/2006/main">
                     <a:graphicData uri="http://schemas.openxmlformats.org/drawingml/2006/picture">
-                      <pic:pic>
+                      <pic:pic xmlns:pic="http://schemas.openxmlformats.org/drawingml/2006/picture">
                         <pic:nvPicPr>
                           <pic:cNvPr id="0" name="ui_05_result.png"/>
                           <pic:cNvPicPr/>
                         </pic:nvPicPr>
                         <pic:blipFill>
-                          <a:blip r:embed="rId17"/>
+                          <a:blip r:embed="rId14"/>
                           <a:stretch>
                             <a:fillRect/>
                           </a:stretch>
@@ -2649,7 +2572,9 @@
                             <a:off x="0" y="0"/>
                             <a:ext cx="2286000" cy="2230111"/>
                           </a:xfrm>
-                          <a:prstGeom prst="rect"/>
+                          <a:prstGeom prst="rect">
+                            <a:avLst/>
+                          </a:prstGeom>
                         </pic:spPr>
                       </pic:pic>
                     </a:graphicData>
@@ -2670,7 +2595,7 @@
         </w:tc>
         <w:tc>
           <w:tcPr>
-            <w:tcW w:type="dxa" w:w="4968"/>
+            <w:tcW w:w="4968" w:type="dxa"/>
           </w:tcPr>
           <w:p>
             <w:pPr>
@@ -2678,22 +2603,26 @@
               <w:jc w:val="center"/>
             </w:pPr>
             <w:r>
+              <w:rPr>
+                <w:noProof/>
+              </w:rPr>
               <w:drawing>
-                <wp:inline xmlns:a="http://schemas.openxmlformats.org/drawingml/2006/main" xmlns:pic="http://schemas.openxmlformats.org/drawingml/2006/picture">
+                <wp:inline distT="0" distB="0" distL="0" distR="0" wp14:anchorId="34DCF1B3" wp14:editId="1B3122CB">
                   <wp:extent cx="2560320" cy="3459562"/>
+                  <wp:effectExtent l="0" t="0" r="0" b="0"/>
                   <wp:docPr id="8" name="Picture 8"/>
                   <wp:cNvGraphicFramePr>
-                    <a:graphicFrameLocks noChangeAspect="1"/>
+                    <a:graphicFrameLocks xmlns:a="http://schemas.openxmlformats.org/drawingml/2006/main" noChangeAspect="1"/>
                   </wp:cNvGraphicFramePr>
-                  <a:graphic>
+                  <a:graphic xmlns:a="http://schemas.openxmlformats.org/drawingml/2006/main">
                     <a:graphicData uri="http://schemas.openxmlformats.org/drawingml/2006/picture">
-                      <pic:pic>
+                      <pic:pic xmlns:pic="http://schemas.openxmlformats.org/drawingml/2006/picture">
                         <pic:nvPicPr>
                           <pic:cNvPr id="0" name="ui_06_transcript.png"/>
                           <pic:cNvPicPr/>
                         </pic:nvPicPr>
                         <pic:blipFill>
-                          <a:blip r:embed="rId18"/>
+                          <a:blip r:embed="rId15"/>
                           <a:stretch>
                             <a:fillRect/>
                           </a:stretch>
@@ -2703,7 +2632,9 @@
                             <a:off x="0" y="0"/>
                             <a:ext cx="2560320" cy="3459562"/>
                           </a:xfrm>
-                          <a:prstGeom prst="rect"/>
+                          <a:prstGeom prst="rect">
+                            <a:avLst/>
+                          </a:prstGeom>
                         </pic:spPr>
                       </pic:pic>
                     </a:graphicData>
@@ -2731,22 +2662,26 @@
         <w:jc w:val="center"/>
       </w:pPr>
       <w:r>
+        <w:rPr>
+          <w:noProof/>
+        </w:rPr>
         <w:drawing>
-          <wp:inline xmlns:a="http://schemas.openxmlformats.org/drawingml/2006/main" xmlns:pic="http://schemas.openxmlformats.org/drawingml/2006/picture">
+          <wp:inline distT="0" distB="0" distL="0" distR="0" wp14:anchorId="47107327" wp14:editId="5D1E7BDA">
             <wp:extent cx="3474720" cy="3617634"/>
+            <wp:effectExtent l="0" t="0" r="0" b="0"/>
             <wp:docPr id="9" name="Picture 9"/>
             <wp:cNvGraphicFramePr>
-              <a:graphicFrameLocks noChangeAspect="1"/>
+              <a:graphicFrameLocks xmlns:a="http://schemas.openxmlformats.org/drawingml/2006/main" noChangeAspect="1"/>
             </wp:cNvGraphicFramePr>
-            <a:graphic>
+            <a:graphic xmlns:a="http://schemas.openxmlformats.org/drawingml/2006/main">
               <a:graphicData uri="http://schemas.openxmlformats.org/drawingml/2006/picture">
-                <pic:pic>
+                <pic:pic xmlns:pic="http://schemas.openxmlformats.org/drawingml/2006/picture">
                   <pic:nvPicPr>
                     <pic:cNvPr id="0" name="ui_07_improve.png"/>
                     <pic:cNvPicPr/>
                   </pic:nvPicPr>
                   <pic:blipFill>
-                    <a:blip r:embed="rId19"/>
+                    <a:blip r:embed="rId16"/>
                     <a:stretch>
                       <a:fillRect/>
                     </a:stretch>
@@ -2756,7 +2691,9 @@
                       <a:off x="0" y="0"/>
                       <a:ext cx="3474720" cy="3617634"/>
                     </a:xfrm>
-                    <a:prstGeom prst="rect"/>
+                    <a:prstGeom prst="rect">
+                      <a:avLst/>
+                    </a:prstGeom>
                   </pic:spPr>
                 </pic:pic>
               </a:graphicData>
@@ -2776,9 +2713,9 @@
     </w:p>
     <w:tbl>
       <w:tblPr>
-        <w:tblW w:type="auto" w:w="0"/>
+        <w:tblW w:w="0" w:type="auto"/>
         <w:jc w:val="center"/>
-        <w:tblLook w:firstColumn="1" w:firstRow="1" w:lastColumn="0" w:lastRow="0" w:noHBand="0" w:noVBand="1" w:val="04A0"/>
+        <w:tblLook w:val="04A0" w:firstRow="1" w:lastRow="0" w:firstColumn="1" w:lastColumn="0" w:noHBand="0" w:noVBand="1"/>
       </w:tblPr>
       <w:tblGrid>
         <w:gridCol w:w="4968"/>
@@ -2787,10 +2724,11 @@
       <w:tr>
         <w:trPr>
           <w:cantSplit/>
+          <w:jc w:val="center"/>
         </w:trPr>
         <w:tc>
           <w:tcPr>
-            <w:tcW w:type="dxa" w:w="4968"/>
+            <w:tcW w:w="4968" w:type="dxa"/>
           </w:tcPr>
           <w:p>
             <w:pPr>
@@ -2798,22 +2736,27 @@
               <w:jc w:val="center"/>
             </w:pPr>
             <w:r>
+              <w:rPr>
+                <w:noProof/>
+              </w:rPr>
+              <w:lastRenderedPageBreak/>
               <w:drawing>
-                <wp:inline xmlns:a="http://schemas.openxmlformats.org/drawingml/2006/main" xmlns:pic="http://schemas.openxmlformats.org/drawingml/2006/picture">
+                <wp:inline distT="0" distB="0" distL="0" distR="0" wp14:anchorId="75824E7B" wp14:editId="2309C14B">
                   <wp:extent cx="2286000" cy="3255087"/>
+                  <wp:effectExtent l="0" t="0" r="0" b="0"/>
                   <wp:docPr id="10" name="Picture 10"/>
                   <wp:cNvGraphicFramePr>
-                    <a:graphicFrameLocks noChangeAspect="1"/>
+                    <a:graphicFrameLocks xmlns:a="http://schemas.openxmlformats.org/drawingml/2006/main" noChangeAspect="1"/>
                   </wp:cNvGraphicFramePr>
-                  <a:graphic>
+                  <a:graphic xmlns:a="http://schemas.openxmlformats.org/drawingml/2006/main">
                     <a:graphicData uri="http://schemas.openxmlformats.org/drawingml/2006/picture">
-                      <pic:pic>
+                      <pic:pic xmlns:pic="http://schemas.openxmlformats.org/drawingml/2006/picture">
                         <pic:nvPicPr>
                           <pic:cNvPr id="0" name="ui_08_how.png"/>
                           <pic:cNvPicPr/>
                         </pic:nvPicPr>
                         <pic:blipFill>
-                          <a:blip r:embed="rId20"/>
+                          <a:blip r:embed="rId17"/>
                           <a:stretch>
                             <a:fillRect/>
                           </a:stretch>
@@ -2823,7 +2766,9 @@
                             <a:off x="0" y="0"/>
                             <a:ext cx="2286000" cy="3255087"/>
                           </a:xfrm>
-                          <a:prstGeom prst="rect"/>
+                          <a:prstGeom prst="rect">
+                            <a:avLst/>
+                          </a:prstGeom>
                         </pic:spPr>
                       </pic:pic>
                     </a:graphicData>
@@ -2844,7 +2789,7 @@
         </w:tc>
         <w:tc>
           <w:tcPr>
-            <w:tcW w:type="dxa" w:w="4968"/>
+            <w:tcW w:w="4968" w:type="dxa"/>
           </w:tcPr>
           <w:p>
             <w:pPr>
@@ -2852,22 +2797,26 @@
               <w:jc w:val="center"/>
             </w:pPr>
             <w:r>
+              <w:rPr>
+                <w:noProof/>
+              </w:rPr>
               <w:drawing>
-                <wp:inline xmlns:a="http://schemas.openxmlformats.org/drawingml/2006/main" xmlns:pic="http://schemas.openxmlformats.org/drawingml/2006/picture">
+                <wp:inline distT="0" distB="0" distL="0" distR="0" wp14:anchorId="4849106B" wp14:editId="3607BF39">
                   <wp:extent cx="1371600" cy="2968283"/>
+                  <wp:effectExtent l="0" t="0" r="0" b="0"/>
                   <wp:docPr id="11" name="Picture 11"/>
                   <wp:cNvGraphicFramePr>
-                    <a:graphicFrameLocks noChangeAspect="1"/>
+                    <a:graphicFrameLocks xmlns:a="http://schemas.openxmlformats.org/drawingml/2006/main" noChangeAspect="1"/>
                   </wp:cNvGraphicFramePr>
-                  <a:graphic>
+                  <a:graphic xmlns:a="http://schemas.openxmlformats.org/drawingml/2006/main">
                     <a:graphicData uri="http://schemas.openxmlformats.org/drawingml/2006/picture">
-                      <pic:pic>
+                      <pic:pic xmlns:pic="http://schemas.openxmlformats.org/drawingml/2006/picture">
                         <pic:nvPicPr>
                           <pic:cNvPr id="0" name="ui_09_mobile.png"/>
                           <pic:cNvPicPr/>
                         </pic:nvPicPr>
                         <pic:blipFill>
-                          <a:blip r:embed="rId21"/>
+                          <a:blip r:embed="rId18"/>
                           <a:stretch>
                             <a:fillRect/>
                           </a:stretch>
@@ -2877,7 +2826,9 @@
                             <a:off x="0" y="0"/>
                             <a:ext cx="1371600" cy="2968283"/>
                           </a:xfrm>
-                          <a:prstGeom prst="rect"/>
+                          <a:prstGeom prst="rect">
+                            <a:avLst/>
+                          </a:prstGeom>
                         </pic:spPr>
                       </pic:pic>
                     </a:graphicData>
@@ -2909,17 +2860,16 @@
     </w:p>
     <w:p>
       <w:r>
-        <w:rPr/>
         <w:t>Offline tests use a scripted fake LLM to check every rule exactly at no API cost; live tests measure the real models.</w:t>
       </w:r>
     </w:p>
     <w:tbl>
       <w:tblPr>
         <w:tblStyle w:val="TableGrid"/>
-        <w:tblW w:type="auto" w:w="0"/>
+        <w:tblW w:w="0" w:type="auto"/>
         <w:jc w:val="center"/>
         <w:tblLayout w:type="fixed"/>
-        <w:tblLook w:firstColumn="1" w:firstRow="1" w:lastColumn="0" w:lastRow="0" w:noHBand="0" w:noVBand="1" w:val="04A0"/>
+        <w:tblLook w:val="04A0" w:firstRow="1" w:lastRow="0" w:firstColumn="1" w:lastColumn="0" w:noHBand="0" w:noVBand="1"/>
       </w:tblPr>
       <w:tblGrid>
         <w:gridCol w:w="2880"/>
@@ -2929,16 +2879,16 @@
       <w:tr>
         <w:trPr>
           <w:cantSplit/>
+          <w:jc w:val="center"/>
         </w:trPr>
         <w:tc>
           <w:tcPr>
-            <w:tcW w:type="dxa" w:w="2880"/>
+            <w:tcW w:w="2880" w:type="dxa"/>
             <w:shd w:val="clear" w:color="auto" w:fill="DCE6F1"/>
           </w:tcPr>
           <w:p>
             <w:pPr>
               <w:keepNext/>
-              <w:spacing w:after="0"/>
             </w:pPr>
             <w:r>
               <w:rPr>
@@ -2951,13 +2901,12 @@
         </w:tc>
         <w:tc>
           <w:tcPr>
-            <w:tcW w:type="dxa" w:w="3096"/>
+            <w:tcW w:w="3096" w:type="dxa"/>
             <w:shd w:val="clear" w:color="auto" w:fill="DCE6F1"/>
           </w:tcPr>
           <w:p>
             <w:pPr>
               <w:keepNext/>
-              <w:spacing w:after="0"/>
             </w:pPr>
             <w:r>
               <w:rPr>
@@ -2970,13 +2919,12 @@
         </w:tc>
         <w:tc>
           <w:tcPr>
-            <w:tcW w:type="dxa" w:w="3600"/>
+            <w:tcW w:w="3600" w:type="dxa"/>
             <w:shd w:val="clear" w:color="auto" w:fill="DCE6F1"/>
           </w:tcPr>
           <w:p>
             <w:pPr>
               <w:keepNext/>
-              <w:spacing w:after="0"/>
             </w:pPr>
             <w:r>
               <w:rPr>
@@ -2991,15 +2939,15 @@
       <w:tr>
         <w:trPr>
           <w:cantSplit/>
+          <w:jc w:val="center"/>
         </w:trPr>
         <w:tc>
           <w:tcPr>
-            <w:tcW w:type="dxa" w:w="2880"/>
+            <w:tcW w:w="2880" w:type="dxa"/>
           </w:tcPr>
           <w:p>
             <w:pPr>
               <w:keepNext/>
-              <w:spacing w:after="0"/>
             </w:pPr>
             <w:r>
               <w:rPr>
@@ -3011,12 +2959,11 @@
         </w:tc>
         <w:tc>
           <w:tcPr>
-            <w:tcW w:type="dxa" w:w="3096"/>
+            <w:tcW w:w="3096" w:type="dxa"/>
           </w:tcPr>
           <w:p>
             <w:pPr>
               <w:keepNext/>
-              <w:spacing w:after="0"/>
             </w:pPr>
             <w:r>
               <w:rPr>
@@ -3028,12 +2975,11 @@
         </w:tc>
         <w:tc>
           <w:tcPr>
-            <w:tcW w:type="dxa" w:w="3600"/>
+            <w:tcW w:w="3600" w:type="dxa"/>
           </w:tcPr>
           <w:p>
             <w:pPr>
               <w:keepNext/>
-              <w:spacing w:after="0"/>
             </w:pPr>
             <w:r>
               <w:rPr>
@@ -3047,15 +2993,15 @@
       <w:tr>
         <w:trPr>
           <w:cantSplit/>
+          <w:jc w:val="center"/>
         </w:trPr>
         <w:tc>
           <w:tcPr>
-            <w:tcW w:type="dxa" w:w="2880"/>
+            <w:tcW w:w="2880" w:type="dxa"/>
           </w:tcPr>
           <w:p>
             <w:pPr>
               <w:keepNext/>
-              <w:spacing w:after="0"/>
             </w:pPr>
             <w:r>
               <w:rPr>
@@ -3067,12 +3013,11 @@
         </w:tc>
         <w:tc>
           <w:tcPr>
-            <w:tcW w:type="dxa" w:w="3096"/>
+            <w:tcW w:w="3096" w:type="dxa"/>
           </w:tcPr>
           <w:p>
             <w:pPr>
               <w:keepNext/>
-              <w:spacing w:after="0"/>
             </w:pPr>
             <w:r>
               <w:rPr>
@@ -3084,12 +3029,11 @@
         </w:tc>
         <w:tc>
           <w:tcPr>
-            <w:tcW w:type="dxa" w:w="3600"/>
+            <w:tcW w:w="3600" w:type="dxa"/>
           </w:tcPr>
           <w:p>
             <w:pPr>
               <w:keepNext/>
-              <w:spacing w:after="0"/>
             </w:pPr>
             <w:r>
               <w:rPr>
@@ -3103,15 +3047,15 @@
       <w:tr>
         <w:trPr>
           <w:cantSplit/>
+          <w:jc w:val="center"/>
         </w:trPr>
         <w:tc>
           <w:tcPr>
-            <w:tcW w:type="dxa" w:w="2880"/>
+            <w:tcW w:w="2880" w:type="dxa"/>
           </w:tcPr>
           <w:p>
             <w:pPr>
               <w:keepNext/>
-              <w:spacing w:after="0"/>
             </w:pPr>
             <w:r>
               <w:rPr>
@@ -3123,12 +3067,11 @@
         </w:tc>
         <w:tc>
           <w:tcPr>
-            <w:tcW w:type="dxa" w:w="3096"/>
+            <w:tcW w:w="3096" w:type="dxa"/>
           </w:tcPr>
           <w:p>
             <w:pPr>
               <w:keepNext/>
-              <w:spacing w:after="0"/>
             </w:pPr>
             <w:r>
               <w:rPr>
@@ -3140,12 +3083,11 @@
         </w:tc>
         <w:tc>
           <w:tcPr>
-            <w:tcW w:type="dxa" w:w="3600"/>
+            <w:tcW w:w="3600" w:type="dxa"/>
           </w:tcPr>
           <w:p>
             <w:pPr>
               <w:keepNext/>
-              <w:spacing w:after="0"/>
             </w:pPr>
             <w:r>
               <w:rPr>
@@ -3159,15 +3101,15 @@
       <w:tr>
         <w:trPr>
           <w:cantSplit/>
+          <w:jc w:val="center"/>
         </w:trPr>
         <w:tc>
           <w:tcPr>
-            <w:tcW w:type="dxa" w:w="2880"/>
+            <w:tcW w:w="2880" w:type="dxa"/>
           </w:tcPr>
           <w:p>
             <w:pPr>
               <w:keepNext/>
-              <w:spacing w:after="0"/>
             </w:pPr>
             <w:r>
               <w:rPr>
@@ -3179,12 +3121,11 @@
         </w:tc>
         <w:tc>
           <w:tcPr>
-            <w:tcW w:type="dxa" w:w="3096"/>
+            <w:tcW w:w="3096" w:type="dxa"/>
           </w:tcPr>
           <w:p>
             <w:pPr>
               <w:keepNext/>
-              <w:spacing w:after="0"/>
             </w:pPr>
             <w:r>
               <w:rPr>
@@ -3196,12 +3137,11 @@
         </w:tc>
         <w:tc>
           <w:tcPr>
-            <w:tcW w:type="dxa" w:w="3600"/>
+            <w:tcW w:w="3600" w:type="dxa"/>
           </w:tcPr>
           <w:p>
             <w:pPr>
               <w:keepNext/>
-              <w:spacing w:after="0"/>
             </w:pPr>
             <w:r>
               <w:rPr>
@@ -3215,15 +3155,15 @@
       <w:tr>
         <w:trPr>
           <w:cantSplit/>
+          <w:jc w:val="center"/>
         </w:trPr>
         <w:tc>
           <w:tcPr>
-            <w:tcW w:type="dxa" w:w="2880"/>
+            <w:tcW w:w="2880" w:type="dxa"/>
           </w:tcPr>
           <w:p>
             <w:pPr>
               <w:keepNext/>
-              <w:spacing w:after="0"/>
             </w:pPr>
             <w:r>
               <w:rPr>
@@ -3235,12 +3175,11 @@
         </w:tc>
         <w:tc>
           <w:tcPr>
-            <w:tcW w:type="dxa" w:w="3096"/>
+            <w:tcW w:w="3096" w:type="dxa"/>
           </w:tcPr>
           <w:p>
             <w:pPr>
               <w:keepNext/>
-              <w:spacing w:after="0"/>
             </w:pPr>
             <w:r>
               <w:rPr>
@@ -3252,12 +3191,11 @@
         </w:tc>
         <w:tc>
           <w:tcPr>
-            <w:tcW w:type="dxa" w:w="3600"/>
+            <w:tcW w:w="3600" w:type="dxa"/>
           </w:tcPr>
           <w:p>
             <w:pPr>
               <w:keepNext/>
-              <w:spacing w:after="0"/>
             </w:pPr>
             <w:r>
               <w:rPr>
@@ -3271,15 +3209,15 @@
       <w:tr>
         <w:trPr>
           <w:cantSplit/>
+          <w:jc w:val="center"/>
         </w:trPr>
         <w:tc>
           <w:tcPr>
-            <w:tcW w:type="dxa" w:w="2880"/>
+            <w:tcW w:w="2880" w:type="dxa"/>
           </w:tcPr>
           <w:p>
             <w:pPr>
               <w:keepNext/>
-              <w:spacing w:after="0"/>
             </w:pPr>
             <w:r>
               <w:rPr>
@@ -3291,12 +3229,11 @@
         </w:tc>
         <w:tc>
           <w:tcPr>
-            <w:tcW w:type="dxa" w:w="3096"/>
+            <w:tcW w:w="3096" w:type="dxa"/>
           </w:tcPr>
           <w:p>
             <w:pPr>
               <w:keepNext/>
-              <w:spacing w:after="0"/>
             </w:pPr>
             <w:r>
               <w:rPr>
@@ -3308,12 +3245,11 @@
         </w:tc>
         <w:tc>
           <w:tcPr>
-            <w:tcW w:type="dxa" w:w="3600"/>
+            <w:tcW w:w="3600" w:type="dxa"/>
           </w:tcPr>
           <w:p>
             <w:pPr>
               <w:keepNext/>
-              <w:spacing w:after="0"/>
             </w:pPr>
             <w:r>
               <w:rPr>
@@ -3327,15 +3263,13 @@
       <w:tr>
         <w:trPr>
           <w:cantSplit/>
+          <w:jc w:val="center"/>
         </w:trPr>
         <w:tc>
           <w:tcPr>
-            <w:tcW w:type="dxa" w:w="2880"/>
+            <w:tcW w:w="2880" w:type="dxa"/>
           </w:tcPr>
           <w:p>
-            <w:pPr>
-              <w:spacing w:after="0"/>
-            </w:pPr>
             <w:r>
               <w:rPr>
                 <w:sz w:val="17"/>
@@ -3346,12 +3280,9 @@
         </w:tc>
         <w:tc>
           <w:tcPr>
-            <w:tcW w:type="dxa" w:w="3096"/>
+            <w:tcW w:w="3096" w:type="dxa"/>
           </w:tcPr>
           <w:p>
-            <w:pPr>
-              <w:spacing w:after="0"/>
-            </w:pPr>
             <w:r>
               <w:rPr>
                 <w:sz w:val="17"/>
@@ -3362,12 +3293,9 @@
         </w:tc>
         <w:tc>
           <w:tcPr>
-            <w:tcW w:type="dxa" w:w="3600"/>
+            <w:tcW w:w="3600" w:type="dxa"/>
           </w:tcPr>
           <w:p>
-            <w:pPr>
-              <w:spacing w:after="0"/>
-            </w:pPr>
             <w:r>
               <w:rPr>
                 <w:sz w:val="17"/>
@@ -3382,10 +3310,10 @@
     <w:tbl>
       <w:tblPr>
         <w:tblStyle w:val="TableGrid"/>
-        <w:tblW w:type="auto" w:w="0"/>
+        <w:tblW w:w="0" w:type="auto"/>
         <w:jc w:val="center"/>
         <w:tblLayout w:type="fixed"/>
-        <w:tblLook w:firstColumn="1" w:firstRow="1" w:lastColumn="0" w:lastRow="0" w:noHBand="0" w:noVBand="1" w:val="04A0"/>
+        <w:tblLook w:val="04A0" w:firstRow="1" w:lastRow="0" w:firstColumn="1" w:lastColumn="0" w:noHBand="0" w:noVBand="1"/>
       </w:tblPr>
       <w:tblGrid>
         <w:gridCol w:w="1584"/>
@@ -3396,16 +3324,16 @@
       <w:tr>
         <w:trPr>
           <w:cantSplit/>
+          <w:jc w:val="center"/>
         </w:trPr>
         <w:tc>
           <w:tcPr>
-            <w:tcW w:type="dxa" w:w="1584"/>
+            <w:tcW w:w="1584" w:type="dxa"/>
             <w:shd w:val="clear" w:color="auto" w:fill="DCE6F1"/>
           </w:tcPr>
           <w:p>
             <w:pPr>
               <w:keepNext/>
-              <w:spacing w:after="0"/>
             </w:pPr>
             <w:r>
               <w:rPr>
@@ -3418,13 +3346,12 @@
         </w:tc>
         <w:tc>
           <w:tcPr>
-            <w:tcW w:type="dxa" w:w="4680"/>
+            <w:tcW w:w="4680" w:type="dxa"/>
             <w:shd w:val="clear" w:color="auto" w:fill="DCE6F1"/>
           </w:tcPr>
           <w:p>
             <w:pPr>
               <w:keepNext/>
-              <w:spacing w:after="0"/>
             </w:pPr>
             <w:r>
               <w:rPr>
@@ -3437,13 +3364,12 @@
         </w:tc>
         <w:tc>
           <w:tcPr>
-            <w:tcW w:type="dxa" w:w="1296"/>
+            <w:tcW w:w="1296" w:type="dxa"/>
             <w:shd w:val="clear" w:color="auto" w:fill="DCE6F1"/>
           </w:tcPr>
           <w:p>
             <w:pPr>
               <w:keepNext/>
-              <w:spacing w:after="0"/>
             </w:pPr>
             <w:r>
               <w:rPr>
@@ -3456,13 +3382,12 @@
         </w:tc>
         <w:tc>
           <w:tcPr>
-            <w:tcW w:type="dxa" w:w="2016"/>
+            <w:tcW w:w="2016" w:type="dxa"/>
             <w:shd w:val="clear" w:color="auto" w:fill="DCE6F1"/>
           </w:tcPr>
           <w:p>
             <w:pPr>
               <w:keepNext/>
-              <w:spacing w:after="0"/>
             </w:pPr>
             <w:r>
               <w:rPr>
@@ -3477,15 +3402,15 @@
       <w:tr>
         <w:trPr>
           <w:cantSplit/>
+          <w:jc w:val="center"/>
         </w:trPr>
         <w:tc>
           <w:tcPr>
-            <w:tcW w:type="dxa" w:w="1584"/>
+            <w:tcW w:w="1584" w:type="dxa"/>
           </w:tcPr>
           <w:p>
             <w:pPr>
               <w:keepNext/>
-              <w:spacing w:after="0"/>
             </w:pPr>
             <w:r>
               <w:rPr>
@@ -3497,12 +3422,11 @@
         </w:tc>
         <w:tc>
           <w:tcPr>
-            <w:tcW w:type="dxa" w:w="4680"/>
+            <w:tcW w:w="4680" w:type="dxa"/>
           </w:tcPr>
           <w:p>
             <w:pPr>
               <w:keepNext/>
-              <w:spacing w:after="0"/>
             </w:pPr>
             <w:r>
               <w:rPr>
@@ -3514,12 +3438,11 @@
         </w:tc>
         <w:tc>
           <w:tcPr>
-            <w:tcW w:type="dxa" w:w="1296"/>
+            <w:tcW w:w="1296" w:type="dxa"/>
           </w:tcPr>
           <w:p>
             <w:pPr>
               <w:keepNext/>
-              <w:spacing w:after="0"/>
             </w:pPr>
             <w:r>
               <w:rPr>
@@ -3531,12 +3454,11 @@
         </w:tc>
         <w:tc>
           <w:tcPr>
-            <w:tcW w:type="dxa" w:w="2016"/>
+            <w:tcW w:w="2016" w:type="dxa"/>
           </w:tcPr>
           <w:p>
             <w:pPr>
               <w:keepNext/>
-              <w:spacing w:after="0"/>
             </w:pPr>
             <w:r>
               <w:rPr>
@@ -3550,15 +3472,15 @@
       <w:tr>
         <w:trPr>
           <w:cantSplit/>
+          <w:jc w:val="center"/>
         </w:trPr>
         <w:tc>
           <w:tcPr>
-            <w:tcW w:type="dxa" w:w="1584"/>
+            <w:tcW w:w="1584" w:type="dxa"/>
           </w:tcPr>
           <w:p>
             <w:pPr>
               <w:keepNext/>
-              <w:spacing w:after="0"/>
             </w:pPr>
             <w:r>
               <w:rPr>
@@ -3570,12 +3492,11 @@
         </w:tc>
         <w:tc>
           <w:tcPr>
-            <w:tcW w:type="dxa" w:w="4680"/>
+            <w:tcW w:w="4680" w:type="dxa"/>
           </w:tcPr>
           <w:p>
             <w:pPr>
               <w:keepNext/>
-              <w:spacing w:after="0"/>
             </w:pPr>
             <w:r>
               <w:rPr>
@@ -3587,12 +3508,11 @@
         </w:tc>
         <w:tc>
           <w:tcPr>
-            <w:tcW w:type="dxa" w:w="1296"/>
+            <w:tcW w:w="1296" w:type="dxa"/>
           </w:tcPr>
           <w:p>
             <w:pPr>
               <w:keepNext/>
-              <w:spacing w:after="0"/>
             </w:pPr>
             <w:r>
               <w:rPr>
@@ -3604,12 +3524,11 @@
         </w:tc>
         <w:tc>
           <w:tcPr>
-            <w:tcW w:type="dxa" w:w="2016"/>
+            <w:tcW w:w="2016" w:type="dxa"/>
           </w:tcPr>
           <w:p>
             <w:pPr>
               <w:keepNext/>
-              <w:spacing w:after="0"/>
             </w:pPr>
             <w:r>
               <w:rPr>
@@ -3623,15 +3542,15 @@
       <w:tr>
         <w:trPr>
           <w:cantSplit/>
+          <w:jc w:val="center"/>
         </w:trPr>
         <w:tc>
           <w:tcPr>
-            <w:tcW w:type="dxa" w:w="1584"/>
+            <w:tcW w:w="1584" w:type="dxa"/>
           </w:tcPr>
           <w:p>
             <w:pPr>
               <w:keepNext/>
-              <w:spacing w:after="0"/>
             </w:pPr>
             <w:r>
               <w:rPr>
@@ -3643,12 +3562,11 @@
         </w:tc>
         <w:tc>
           <w:tcPr>
-            <w:tcW w:type="dxa" w:w="4680"/>
+            <w:tcW w:w="4680" w:type="dxa"/>
           </w:tcPr>
           <w:p>
             <w:pPr>
               <w:keepNext/>
-              <w:spacing w:after="0"/>
             </w:pPr>
             <w:r>
               <w:rPr>
@@ -3660,12 +3578,11 @@
         </w:tc>
         <w:tc>
           <w:tcPr>
-            <w:tcW w:type="dxa" w:w="1296"/>
+            <w:tcW w:w="1296" w:type="dxa"/>
           </w:tcPr>
           <w:p>
             <w:pPr>
               <w:keepNext/>
-              <w:spacing w:after="0"/>
             </w:pPr>
             <w:r>
               <w:rPr>
@@ -3677,12 +3594,11 @@
         </w:tc>
         <w:tc>
           <w:tcPr>
-            <w:tcW w:type="dxa" w:w="2016"/>
+            <w:tcW w:w="2016" w:type="dxa"/>
           </w:tcPr>
           <w:p>
             <w:pPr>
               <w:keepNext/>
-              <w:spacing w:after="0"/>
             </w:pPr>
             <w:r>
               <w:rPr>
@@ -3696,15 +3612,15 @@
       <w:tr>
         <w:trPr>
           <w:cantSplit/>
+          <w:jc w:val="center"/>
         </w:trPr>
         <w:tc>
           <w:tcPr>
-            <w:tcW w:type="dxa" w:w="1584"/>
+            <w:tcW w:w="1584" w:type="dxa"/>
           </w:tcPr>
           <w:p>
             <w:pPr>
               <w:keepNext/>
-              <w:spacing w:after="0"/>
             </w:pPr>
             <w:r>
               <w:rPr>
@@ -3716,12 +3632,11 @@
         </w:tc>
         <w:tc>
           <w:tcPr>
-            <w:tcW w:type="dxa" w:w="4680"/>
+            <w:tcW w:w="4680" w:type="dxa"/>
           </w:tcPr>
           <w:p>
             <w:pPr>
               <w:keepNext/>
-              <w:spacing w:after="0"/>
             </w:pPr>
             <w:r>
               <w:rPr>
@@ -3733,12 +3648,11 @@
         </w:tc>
         <w:tc>
           <w:tcPr>
-            <w:tcW w:type="dxa" w:w="1296"/>
+            <w:tcW w:w="1296" w:type="dxa"/>
           </w:tcPr>
           <w:p>
             <w:pPr>
               <w:keepNext/>
-              <w:spacing w:after="0"/>
             </w:pPr>
             <w:r>
               <w:rPr>
@@ -3750,12 +3664,11 @@
         </w:tc>
         <w:tc>
           <w:tcPr>
-            <w:tcW w:type="dxa" w:w="2016"/>
+            <w:tcW w:w="2016" w:type="dxa"/>
           </w:tcPr>
           <w:p>
             <w:pPr>
               <w:keepNext/>
-              <w:spacing w:after="0"/>
             </w:pPr>
             <w:r>
               <w:rPr>
@@ -3769,15 +3682,15 @@
       <w:tr>
         <w:trPr>
           <w:cantSplit/>
+          <w:jc w:val="center"/>
         </w:trPr>
         <w:tc>
           <w:tcPr>
-            <w:tcW w:type="dxa" w:w="1584"/>
+            <w:tcW w:w="1584" w:type="dxa"/>
           </w:tcPr>
           <w:p>
             <w:pPr>
               <w:keepNext/>
-              <w:spacing w:after="0"/>
             </w:pPr>
             <w:r>
               <w:rPr>
@@ -3789,12 +3702,11 @@
         </w:tc>
         <w:tc>
           <w:tcPr>
-            <w:tcW w:type="dxa" w:w="4680"/>
+            <w:tcW w:w="4680" w:type="dxa"/>
           </w:tcPr>
           <w:p>
             <w:pPr>
               <w:keepNext/>
-              <w:spacing w:after="0"/>
             </w:pPr>
             <w:r>
               <w:rPr>
@@ -3806,12 +3718,11 @@
         </w:tc>
         <w:tc>
           <w:tcPr>
-            <w:tcW w:type="dxa" w:w="1296"/>
+            <w:tcW w:w="1296" w:type="dxa"/>
           </w:tcPr>
           <w:p>
             <w:pPr>
               <w:keepNext/>
-              <w:spacing w:after="0"/>
             </w:pPr>
             <w:r>
               <w:rPr>
@@ -3823,12 +3734,11 @@
         </w:tc>
         <w:tc>
           <w:tcPr>
-            <w:tcW w:type="dxa" w:w="2016"/>
+            <w:tcW w:w="2016" w:type="dxa"/>
           </w:tcPr>
           <w:p>
             <w:pPr>
               <w:keepNext/>
-              <w:spacing w:after="0"/>
             </w:pPr>
             <w:r>
               <w:rPr>
@@ -3842,15 +3752,13 @@
       <w:tr>
         <w:trPr>
           <w:cantSplit/>
+          <w:jc w:val="center"/>
         </w:trPr>
         <w:tc>
           <w:tcPr>
-            <w:tcW w:type="dxa" w:w="1584"/>
+            <w:tcW w:w="1584" w:type="dxa"/>
           </w:tcPr>
           <w:p>
-            <w:pPr>
-              <w:spacing w:after="0"/>
-            </w:pPr>
             <w:r>
               <w:rPr>
                 <w:sz w:val="17"/>
@@ -3861,12 +3769,9 @@
         </w:tc>
         <w:tc>
           <w:tcPr>
-            <w:tcW w:type="dxa" w:w="4680"/>
+            <w:tcW w:w="4680" w:type="dxa"/>
           </w:tcPr>
           <w:p>
-            <w:pPr>
-              <w:spacing w:after="0"/>
-            </w:pPr>
             <w:r>
               <w:rPr>
                 <w:sz w:val="17"/>
@@ -3877,12 +3782,9 @@
         </w:tc>
         <w:tc>
           <w:tcPr>
-            <w:tcW w:type="dxa" w:w="1296"/>
+            <w:tcW w:w="1296" w:type="dxa"/>
           </w:tcPr>
           <w:p>
-            <w:pPr>
-              <w:spacing w:after="0"/>
-            </w:pPr>
             <w:r>
               <w:rPr>
                 <w:sz w:val="17"/>
@@ -3893,12 +3795,9 @@
         </w:tc>
         <w:tc>
           <w:tcPr>
-            <w:tcW w:type="dxa" w:w="2016"/>
+            <w:tcW w:w="2016" w:type="dxa"/>
           </w:tcPr>
           <w:p>
-            <w:pPr>
-              <w:spacing w:after="0"/>
-            </w:pPr>
             <w:r>
               <w:rPr>
                 <w:sz w:val="17"/>
@@ -3918,7 +3817,6 @@
         <w:t>Issue found by testing:</w:t>
       </w:r>
       <w:r>
-        <w:rPr/>
         <w:t xml:space="preserve"> one follow-up asked three questions at once and revealed the answer (“…when EAR drops below 0.21…”); a stricter prompt, a code rule and a unit test fixed it, and the bluffer’s score fell from 20 % to 0 %.</w:t>
       </w:r>
     </w:p>
@@ -3930,8 +3828,11 @@
         <w:t>Issues found in a later review:</w:t>
       </w:r>
       <w:r>
-        <w:rPr/>
-        <w:t xml:space="preserve"> live feedback named the missing points, giving away the follow-up’s answer; follow-ups were graded alone; short correct replies were rejected. Now only the score and a neutral note show during the viva, follow-ups are graded with the first answer, short answers reach the judge, failed LLM calls can be retried, and tests cover each fix.</w:t>
+        <w:t xml:space="preserve"> live feedback named the missing points, giving away the follow-up’s answer; follow-ups were graded alone; short correct replies were rejected. Now only the score and a </w:t>
+      </w:r>
+      <w:r>
+        <w:lastRenderedPageBreak/>
+        <w:t>neutral note show during the viva, follow-ups are graded with the first answer, short answers reach the judge, failed LLM calls can be retried, and tests cover each fix.</w:t>
       </w:r>
     </w:p>
     <w:p>
@@ -3942,7 +3843,6 @@
         <w:t>Limitations:</w:t>
       </w:r>
       <w:r>
-        <w:rPr/>
         <w:t xml:space="preserve"> free tiers are unreliable (Gemini 503 errors, OpenRouter’s 50-request daily cap), so the agent falls back through three providers; state is held in memory; the microphone path needs a manual browser check.</w:t>
       </w:r>
     </w:p>
@@ -3964,35 +3864,24 @@
     </w:p>
     <w:p>
       <w:r>
-        <w:rPr>
-          <w:highlight w:val="yellow"/>
-        </w:rPr>
-        <w:t>Draft – rewrite in your own words, then delete this note.</w:t>
+        <w:t>I chose LangGraph because a viva must pause for a human between steps; interrupt() and the checkpointer handle this, and conditional edges keep routing in my control. After the judge gave 3 and then 2 to the same answer, I kept routing, limits and the final score in code. BM25 suits short reports: no vector database, no extra key, easy to explain.</w:t>
       </w:r>
     </w:p>
     <w:p>
       <w:r>
-        <w:rPr/>
-        <w:t>I chose LangGraph because a viva must pause for a human between steps; interrupt() and the checkpointer handle this, and conditional edges keep routing in my control. After the judge gave 3 and then 2 to the same answer, I kept routing, limits and the final score in code. BM25 suits short reports: no vector database, no extra key, easy to explain.</w:t>
+        <w:t>Three things surprised me. Gemini’s free tier was down, so the fallback, based on Course 1’s failure-handling lessons, kept the app working. The model ignored my “one short question” instruction, so I enforced it in code. My first voice test was silent until I followed Soniox’s own SDK message order. I used WebSockets for voice because a viva needs low delay, with short-lived keys so the real key stays on the server. Next time I would add persistent storage, a teacher mode, and average two judge runs for borderline answers.</w:t>
       </w:r>
     </w:p>
     <w:p>
-      <w:r>
-        <w:rPr/>
-        <w:t>Three things surprised me. Gemini’s free tier was down, so the fallback, based on Course 1’s failure-handling lessons, kept the app working. The model ignored my “one short question” instruction, so I enforced it in code. My first voice test was silent until I followed Soniox’s own SDK message order. I used WebSockets for voice because a viva needs low delay, with short-lived keys so the real key stays on the server. Next time I would add persistent storage, a teacher mode, and average two judge runs for borderline answers.</w:t>
+      <w:pPr>
+        <w:pStyle w:val="Heading2"/>
+      </w:pPr>
+      <w:r>
+        <w:t>Conclusion</w:t>
       </w:r>
     </w:p>
     <w:p>
-      <w:pPr>
-        <w:pStyle w:val="Heading2"/>
-      </w:pPr>
-      <w:r>
-        <w:t>Conclusion</w:t>
-      </w:r>
-    </w:p>
-    <w:p>
-      <w:r>
-        <w:rPr/>
+      <w:r>
         <w:t>Across 48 h 43 m of MOOCs I learned how tools, state, retrieval, routing, guardrails and evaluation combine into an agent. VivaVerify applies this: 33/33 tests pass, 6/6 judge cases are correct, and a prepared student scores 95 % against 0 % for a bluffer. Next: a teacher mode, persistent storage and more languages.</w:t>
       </w:r>
     </w:p>
@@ -4130,6 +4019,7 @@
         <w:pageBreakBefore/>
       </w:pPr>
       <w:r>
+        <w:lastRenderedPageBreak/>
         <w:t>Appendix A: Certificates and Course Progress</w:t>
       </w:r>
     </w:p>
@@ -4139,18 +4029,188 @@
         <w:jc w:val="center"/>
       </w:pPr>
       <w:r>
+        <w:rPr>
+          <w:noProof/>
+        </w:rPr>
         <w:drawing>
-          <wp:inline xmlns:a="http://schemas.openxmlformats.org/drawingml/2006/main" xmlns:pic="http://schemas.openxmlformats.org/drawingml/2006/picture">
+          <wp:inline distT="0" distB="0" distL="0" distR="0" wp14:anchorId="623FCC31" wp14:editId="44894F83">
             <wp:extent cx="4572000" cy="2895948"/>
+            <wp:effectExtent l="0" t="0" r="0" b="0"/>
             <wp:docPr id="12" name="Picture 12"/>
             <wp:cNvGraphicFramePr>
-              <a:graphicFrameLocks noChangeAspect="1"/>
+              <a:graphicFrameLocks xmlns:a="http://schemas.openxmlformats.org/drawingml/2006/main" noChangeAspect="1"/>
             </wp:cNvGraphicFramePr>
-            <a:graphic>
+            <a:graphic xmlns:a="http://schemas.openxmlformats.org/drawingml/2006/main">
               <a:graphicData uri="http://schemas.openxmlformats.org/drawingml/2006/picture">
-                <pic:pic>
+                <pic:pic xmlns:pic="http://schemas.openxmlformats.org/drawingml/2006/picture">
                   <pic:nvPicPr>
                     <pic:cNvPr id="0" name="cert_course1.png"/>
+                    <pic:cNvPicPr/>
+                  </pic:nvPicPr>
+                  <pic:blipFill>
+                    <a:blip r:embed="rId19"/>
+                    <a:stretch>
+                      <a:fillRect/>
+                    </a:stretch>
+                  </pic:blipFill>
+                  <pic:spPr>
+                    <a:xfrm>
+                      <a:off x="0" y="0"/>
+                      <a:ext cx="4572000" cy="2895948"/>
+                    </a:xfrm>
+                    <a:prstGeom prst="rect">
+                      <a:avLst/>
+                    </a:prstGeom>
+                  </pic:spPr>
+                </pic:pic>
+              </a:graphicData>
+            </a:graphic>
+          </wp:inline>
+        </w:drawing>
+      </w:r>
+    </w:p>
+    <w:p>
+      <w:pPr>
+        <w:pStyle w:val="Caption"/>
+        <w:jc w:val="center"/>
+      </w:pPr>
+      <w:r>
+        <w:t>Figure A1: Certificate – AI Agents &amp; AI Automation (12 Sep 2026)</w:t>
+      </w:r>
+    </w:p>
+    <w:p>
+      <w:pPr>
+        <w:keepNext/>
+        <w:jc w:val="center"/>
+      </w:pPr>
+      <w:r>
+        <w:rPr>
+          <w:noProof/>
+        </w:rPr>
+        <w:drawing>
+          <wp:inline distT="0" distB="0" distL="0" distR="0" wp14:anchorId="62BC3B04" wp14:editId="6A30EDE7">
+            <wp:extent cx="4572000" cy="2894482"/>
+            <wp:effectExtent l="0" t="0" r="0" b="0"/>
+            <wp:docPr id="13" name="Picture 13"/>
+            <wp:cNvGraphicFramePr>
+              <a:graphicFrameLocks xmlns:a="http://schemas.openxmlformats.org/drawingml/2006/main" noChangeAspect="1"/>
+            </wp:cNvGraphicFramePr>
+            <a:graphic xmlns:a="http://schemas.openxmlformats.org/drawingml/2006/main">
+              <a:graphicData uri="http://schemas.openxmlformats.org/drawingml/2006/picture">
+                <pic:pic xmlns:pic="http://schemas.openxmlformats.org/drawingml/2006/picture">
+                  <pic:nvPicPr>
+                    <pic:cNvPr id="0" name="cert_course2.png"/>
+                    <pic:cNvPicPr/>
+                  </pic:nvPicPr>
+                  <pic:blipFill>
+                    <a:blip r:embed="rId20"/>
+                    <a:stretch>
+                      <a:fillRect/>
+                    </a:stretch>
+                  </pic:blipFill>
+                  <pic:spPr>
+                    <a:xfrm>
+                      <a:off x="0" y="0"/>
+                      <a:ext cx="4572000" cy="2894482"/>
+                    </a:xfrm>
+                    <a:prstGeom prst="rect">
+                      <a:avLst/>
+                    </a:prstGeom>
+                  </pic:spPr>
+                </pic:pic>
+              </a:graphicData>
+            </a:graphic>
+          </wp:inline>
+        </w:drawing>
+      </w:r>
+    </w:p>
+    <w:p>
+      <w:pPr>
+        <w:pStyle w:val="Caption"/>
+        <w:jc w:val="center"/>
+      </w:pPr>
+      <w:r>
+        <w:t>Figure A2: Certificate – AI Engineer Agentic Track (15 Sep 2026)</w:t>
+      </w:r>
+    </w:p>
+    <w:p>
+      <w:pPr>
+        <w:keepNext/>
+        <w:jc w:val="center"/>
+      </w:pPr>
+      <w:r>
+        <w:rPr>
+          <w:noProof/>
+        </w:rPr>
+        <w:lastRenderedPageBreak/>
+        <w:drawing>
+          <wp:inline distT="0" distB="0" distL="0" distR="0" wp14:anchorId="7223B4DF" wp14:editId="5EDEB5D0">
+            <wp:extent cx="5669280" cy="2585192"/>
+            <wp:effectExtent l="0" t="0" r="0" b="0"/>
+            <wp:docPr id="14" name="Picture 14"/>
+            <wp:cNvGraphicFramePr>
+              <a:graphicFrameLocks xmlns:a="http://schemas.openxmlformats.org/drawingml/2006/main" noChangeAspect="1"/>
+            </wp:cNvGraphicFramePr>
+            <a:graphic xmlns:a="http://schemas.openxmlformats.org/drawingml/2006/main">
+              <a:graphicData uri="http://schemas.openxmlformats.org/drawingml/2006/picture">
+                <pic:pic xmlns:pic="http://schemas.openxmlformats.org/drawingml/2006/picture">
+                  <pic:nvPicPr>
+                    <pic:cNvPr id="0" name="progress_course3.png"/>
+                    <pic:cNvPicPr/>
+                  </pic:nvPicPr>
+                  <pic:blipFill>
+                    <a:blip r:embed="rId21"/>
+                    <a:stretch>
+                      <a:fillRect/>
+                    </a:stretch>
+                  </pic:blipFill>
+                  <pic:spPr>
+                    <a:xfrm>
+                      <a:off x="0" y="0"/>
+                      <a:ext cx="5669280" cy="2585192"/>
+                    </a:xfrm>
+                    <a:prstGeom prst="rect">
+                      <a:avLst/>
+                    </a:prstGeom>
+                  </pic:spPr>
+                </pic:pic>
+              </a:graphicData>
+            </a:graphic>
+          </wp:inline>
+        </w:drawing>
+      </w:r>
+    </w:p>
+    <w:p>
+      <w:pPr>
+        <w:pStyle w:val="Caption"/>
+        <w:jc w:val="center"/>
+      </w:pPr>
+      <w:r>
+        <w:t>Figure A3: Progress – Private Agentic RAG with LangGraph and Ollama (80 %)</w:t>
+      </w:r>
+    </w:p>
+    <w:p>
+      <w:pPr>
+        <w:keepNext/>
+        <w:jc w:val="center"/>
+      </w:pPr>
+      <w:r>
+        <w:rPr>
+          <w:noProof/>
+        </w:rPr>
+        <w:drawing>
+          <wp:inline distT="0" distB="0" distL="0" distR="0" wp14:anchorId="20F1CE7F" wp14:editId="778BA11F">
+            <wp:extent cx="5669280" cy="2622987"/>
+            <wp:effectExtent l="0" t="0" r="0" b="0"/>
+            <wp:docPr id="15" name="Picture 15"/>
+            <wp:cNvGraphicFramePr>
+              <a:graphicFrameLocks xmlns:a="http://schemas.openxmlformats.org/drawingml/2006/main" noChangeAspect="1"/>
+            </wp:cNvGraphicFramePr>
+            <a:graphic xmlns:a="http://schemas.openxmlformats.org/drawingml/2006/main">
+              <a:graphicData uri="http://schemas.openxmlformats.org/drawingml/2006/picture">
+                <pic:pic xmlns:pic="http://schemas.openxmlformats.org/drawingml/2006/picture">
+                  <pic:nvPicPr>
+                    <pic:cNvPr id="0" name="progress_course4.png"/>
                     <pic:cNvPicPr/>
                   </pic:nvPicPr>
                   <pic:blipFill>
@@ -4162,9 +4222,11 @@
                   <pic:spPr>
                     <a:xfrm>
                       <a:off x="0" y="0"/>
-                      <a:ext cx="4572000" cy="2895948"/>
+                      <a:ext cx="5669280" cy="2622987"/>
                     </a:xfrm>
-                    <a:prstGeom prst="rect"/>
+                    <a:prstGeom prst="rect">
+                      <a:avLst/>
+                    </a:prstGeom>
                   </pic:spPr>
                 </pic:pic>
               </a:graphicData>
@@ -4179,158 +4241,11 @@
         <w:jc w:val="center"/>
       </w:pPr>
       <w:r>
-        <w:t>Figure A1: Certificate – AI Agents &amp; AI Automation (12 Sep 2026)</w:t>
-      </w:r>
-    </w:p>
-    <w:p>
-      <w:pPr>
-        <w:keepNext/>
-        <w:jc w:val="center"/>
-      </w:pPr>
-      <w:r>
-        <w:drawing>
-          <wp:inline xmlns:a="http://schemas.openxmlformats.org/drawingml/2006/main" xmlns:pic="http://schemas.openxmlformats.org/drawingml/2006/picture">
-            <wp:extent cx="4572000" cy="2894482"/>
-            <wp:docPr id="13" name="Picture 13"/>
-            <wp:cNvGraphicFramePr>
-              <a:graphicFrameLocks noChangeAspect="1"/>
-            </wp:cNvGraphicFramePr>
-            <a:graphic>
-              <a:graphicData uri="http://schemas.openxmlformats.org/drawingml/2006/picture">
-                <pic:pic>
-                  <pic:nvPicPr>
-                    <pic:cNvPr id="0" name="cert_course2.png"/>
-                    <pic:cNvPicPr/>
-                  </pic:nvPicPr>
-                  <pic:blipFill>
-                    <a:blip r:embed="rId23"/>
-                    <a:stretch>
-                      <a:fillRect/>
-                    </a:stretch>
-                  </pic:blipFill>
-                  <pic:spPr>
-                    <a:xfrm>
-                      <a:off x="0" y="0"/>
-                      <a:ext cx="4572000" cy="2894482"/>
-                    </a:xfrm>
-                    <a:prstGeom prst="rect"/>
-                  </pic:spPr>
-                </pic:pic>
-              </a:graphicData>
-            </a:graphic>
-          </wp:inline>
-        </w:drawing>
-      </w:r>
-    </w:p>
-    <w:p>
-      <w:pPr>
-        <w:pStyle w:val="Caption"/>
-        <w:jc w:val="center"/>
-      </w:pPr>
-      <w:r>
-        <w:t>Figure A2: Certificate – AI Engineer Agentic Track (15 Sep 2026)</w:t>
-      </w:r>
-    </w:p>
-    <w:p>
-      <w:pPr>
-        <w:keepNext/>
-        <w:jc w:val="center"/>
-      </w:pPr>
-      <w:r>
-        <w:drawing>
-          <wp:inline xmlns:a="http://schemas.openxmlformats.org/drawingml/2006/main" xmlns:pic="http://schemas.openxmlformats.org/drawingml/2006/picture">
-            <wp:extent cx="5669280" cy="2585192"/>
-            <wp:docPr id="14" name="Picture 14"/>
-            <wp:cNvGraphicFramePr>
-              <a:graphicFrameLocks noChangeAspect="1"/>
-            </wp:cNvGraphicFramePr>
-            <a:graphic>
-              <a:graphicData uri="http://schemas.openxmlformats.org/drawingml/2006/picture">
-                <pic:pic>
-                  <pic:nvPicPr>
-                    <pic:cNvPr id="0" name="progress_course3.png"/>
-                    <pic:cNvPicPr/>
-                  </pic:nvPicPr>
-                  <pic:blipFill>
-                    <a:blip r:embed="rId24"/>
-                    <a:stretch>
-                      <a:fillRect/>
-                    </a:stretch>
-                  </pic:blipFill>
-                  <pic:spPr>
-                    <a:xfrm>
-                      <a:off x="0" y="0"/>
-                      <a:ext cx="5669280" cy="2585192"/>
-                    </a:xfrm>
-                    <a:prstGeom prst="rect"/>
-                  </pic:spPr>
-                </pic:pic>
-              </a:graphicData>
-            </a:graphic>
-          </wp:inline>
-        </w:drawing>
-      </w:r>
-    </w:p>
-    <w:p>
-      <w:pPr>
-        <w:pStyle w:val="Caption"/>
-        <w:jc w:val="center"/>
-      </w:pPr>
-      <w:r>
-        <w:t>Figure A3: Progress – Private Agentic RAG with LangGraph and Ollama (80 %)</w:t>
-      </w:r>
-    </w:p>
-    <w:p>
-      <w:pPr>
-        <w:keepNext/>
-        <w:jc w:val="center"/>
-      </w:pPr>
-      <w:r>
-        <w:drawing>
-          <wp:inline xmlns:a="http://schemas.openxmlformats.org/drawingml/2006/main" xmlns:pic="http://schemas.openxmlformats.org/drawingml/2006/picture">
-            <wp:extent cx="5669280" cy="2622987"/>
-            <wp:docPr id="15" name="Picture 15"/>
-            <wp:cNvGraphicFramePr>
-              <a:graphicFrameLocks noChangeAspect="1"/>
-            </wp:cNvGraphicFramePr>
-            <a:graphic>
-              <a:graphicData uri="http://schemas.openxmlformats.org/drawingml/2006/picture">
-                <pic:pic>
-                  <pic:nvPicPr>
-                    <pic:cNvPr id="0" name="progress_course4.png"/>
-                    <pic:cNvPicPr/>
-                  </pic:nvPicPr>
-                  <pic:blipFill>
-                    <a:blip r:embed="rId25"/>
-                    <a:stretch>
-                      <a:fillRect/>
-                    </a:stretch>
-                  </pic:blipFill>
-                  <pic:spPr>
-                    <a:xfrm>
-                      <a:off x="0" y="0"/>
-                      <a:ext cx="5669280" cy="2622987"/>
-                    </a:xfrm>
-                    <a:prstGeom prst="rect"/>
-                  </pic:spPr>
-                </pic:pic>
-              </a:graphicData>
-            </a:graphic>
-          </wp:inline>
-        </w:drawing>
-      </w:r>
-    </w:p>
-    <w:p>
-      <w:pPr>
-        <w:pStyle w:val="Caption"/>
-        <w:jc w:val="center"/>
-      </w:pPr>
-      <w:r>
         <w:t>Figure A4: Progress – Agentic AI for Beginners (50 %)</w:t>
       </w:r>
     </w:p>
     <w:sectPr>
-      <w:footerReference w:type="default" r:id="rId8"/>
+      <w:footerReference w:type="default" r:id="rId23"/>
       <w:pgSz w:w="12240" w:h="15840"/>
       <w:pgMar w:top="1008" w:right="1152" w:bottom="1008" w:left="1152" w:header="720" w:footer="720" w:gutter="0"/>
       <w:cols w:space="720"/>
@@ -4341,7 +4256,7 @@
 </file>
 
 <file path=word/endnotes.xml><?xml version="1.0" encoding="utf-8"?>
-<w:endnotes xmlns:wpc="http://schemas.microsoft.com/office/word/2010/wordprocessingCanvas" xmlns:cx="http://schemas.microsoft.com/office/drawing/2014/chartex" xmlns:cx1="http://schemas.microsoft.com/office/drawing/2015/9/8/chartex" xmlns:cx2="http://schemas.microsoft.com/office/drawing/2015/10/21/chartex" xmlns:cx3="http://schemas.microsoft.com/office/drawing/2016/5/9/chartex" xmlns:cx4="http://schemas.microsoft.com/office/drawing/2016/5/10/chartex" xmlns:cx5="http://schemas.microsoft.com/office/drawing/2016/5/11/chartex" xmlns:cx6="http://schemas.microsoft.com/office/drawing/2016/5/12/chartex" xmlns:cx7="http://schemas.microsoft.com/office/drawing/2016/5/13/chartex" xmlns:cx8="http://schemas.microsoft.com/office/drawing/2016/5/14/chartex" xmlns:mc="http://schemas.openxmlformats.org/markup-compatibility/2006" xmlns:aink="http://schemas.microsoft.com/office/drawing/2016/ink" xmlns:am3d="http://schemas.microsoft.com/office/drawing/2017/model3d" xmlns:o="urn:schemas-microsoft-com:office:office" xmlns:r="http://schemas.openxmlformats.org/officeDocument/2006/relationships" xmlns:m="http://schemas.openxmlformats.org/officeDocument/2006/math" xmlns:v="urn:schemas-microsoft-com:vml" xmlns:wp14="http://schemas.microsoft.com/office/word/2010/wordprocessingDrawing" xmlns:wp="http://schemas.openxmlformats.org/drawingml/2006/wordprocessingDrawing" xmlns:w10="urn:schemas-microsoft-com:office:word" xmlns:w="http://schemas.openxmlformats.org/wordprocessingml/2006/main" xmlns:w14="http://schemas.microsoft.com/office/word/2010/wordml" xmlns:w15="http://schemas.microsoft.com/office/word/2012/wordml" xmlns:w16cid="http://schemas.microsoft.com/office/word/2016/wordml/cid" xmlns:w16se="http://schemas.microsoft.com/office/word/2015/wordml/symex" xmlns:wpg="http://schemas.microsoft.com/office/word/2010/wordprocessingGroup" xmlns:wpi="http://schemas.microsoft.com/office/word/2010/wordprocessingInk" xmlns:wne="http://schemas.microsoft.com/office/word/2006/wordml" xmlns:wps="http://schemas.microsoft.com/office/word/2010/wordprocessingShape" mc:Ignorable="w14 w15 w16se w16cid wp14">
+<w:endnotes xmlns:wpc="http://schemas.microsoft.com/office/word/2010/wordprocessingCanvas" xmlns:cx="http://schemas.microsoft.com/office/drawing/2014/chartex" xmlns:cx1="http://schemas.microsoft.com/office/drawing/2015/9/8/chartex" xmlns:cx2="http://schemas.microsoft.com/office/drawing/2015/10/21/chartex" xmlns:cx3="http://schemas.microsoft.com/office/drawing/2016/5/9/chartex" xmlns:cx4="http://schemas.microsoft.com/office/drawing/2016/5/10/chartex" xmlns:cx5="http://schemas.microsoft.com/office/drawing/2016/5/11/chartex" xmlns:cx6="http://schemas.microsoft.com/office/drawing/2016/5/12/chartex" xmlns:cx7="http://schemas.microsoft.com/office/drawing/2016/5/13/chartex" xmlns:cx8="http://schemas.microsoft.com/office/drawing/2016/5/14/chartex" xmlns:mc="http://schemas.openxmlformats.org/markup-compatibility/2006" xmlns:aink="http://schemas.microsoft.com/office/drawing/2016/ink" xmlns:am3d="http://schemas.microsoft.com/office/drawing/2017/model3d" xmlns:o="urn:schemas-microsoft-com:office:office" xmlns:oel="http://schemas.microsoft.com/office/2019/extlst" xmlns:r="http://schemas.openxmlformats.org/officeDocument/2006/relationships" xmlns:m="http://schemas.openxmlformats.org/officeDocument/2006/math" xmlns:v="urn:schemas-microsoft-com:vml" xmlns:wp14="http://schemas.microsoft.com/office/word/2010/wordprocessingDrawing" xmlns:wp="http://schemas.openxmlformats.org/drawingml/2006/wordprocessingDrawing" xmlns:w10="urn:schemas-microsoft-com:office:word" xmlns:w="http://schemas.openxmlformats.org/wordprocessingml/2006/main" xmlns:w14="http://schemas.microsoft.com/office/word/2010/wordml" xmlns:w15="http://schemas.microsoft.com/office/word/2012/wordml" xmlns:w16cex="http://schemas.microsoft.com/office/word/2018/wordml/cex" xmlns:w16cid="http://schemas.microsoft.com/office/word/2016/wordml/cid" xmlns:w16="http://schemas.microsoft.com/office/word/2018/wordml" xmlns:w16du="http://schemas.microsoft.com/office/word/2023/wordml/word16du" xmlns:w16sdtdh="http://schemas.microsoft.com/office/word/2020/wordml/sdtdatahash" xmlns:w16sdtfl="http://schemas.microsoft.com/office/word/2024/wordml/sdtformatlock" xmlns:w16se="http://schemas.microsoft.com/office/word/2015/wordml/symex" xmlns:wpg="http://schemas.microsoft.com/office/word/2010/wordprocessingGroup" xmlns:wpi="http://schemas.microsoft.com/office/word/2010/wordprocessingInk" xmlns:wne="http://schemas.microsoft.com/office/word/2006/wordml" xmlns:wps="http://schemas.microsoft.com/office/word/2010/wordprocessingShape" mc:Ignorable="w14 w15 w16se w16cid w16 w16cex w16sdtdh w16sdtfl w16du wp14">
   <w:endnote w:type="separator" w:id="-1">
     <w:p>
       <w:pPr>
@@ -4366,7 +4281,7 @@
 </file>
 
 <file path=word/footer1.xml><?xml version="1.0" encoding="utf-8"?>
-<w:ftr xmlns:wpc="http://schemas.microsoft.com/office/word/2010/wordprocessingCanvas" xmlns:cx="http://schemas.microsoft.com/office/drawing/2014/chartex" xmlns:cx1="http://schemas.microsoft.com/office/drawing/2015/9/8/chartex" xmlns:cx2="http://schemas.microsoft.com/office/drawing/2015/10/21/chartex" xmlns:cx3="http://schemas.microsoft.com/office/drawing/2016/5/9/chartex" xmlns:cx4="http://schemas.microsoft.com/office/drawing/2016/5/10/chartex" xmlns:cx5="http://schemas.microsoft.com/office/drawing/2016/5/11/chartex" xmlns:cx6="http://schemas.microsoft.com/office/drawing/2016/5/12/chartex" xmlns:cx7="http://schemas.microsoft.com/office/drawing/2016/5/13/chartex" xmlns:cx8="http://schemas.microsoft.com/office/drawing/2016/5/14/chartex" xmlns:mc="http://schemas.openxmlformats.org/markup-compatibility/2006" xmlns:aink="http://schemas.microsoft.com/office/drawing/2016/ink" xmlns:am3d="http://schemas.microsoft.com/office/drawing/2017/model3d" xmlns:o="urn:schemas-microsoft-com:office:office" xmlns:r="http://schemas.openxmlformats.org/officeDocument/2006/relationships" xmlns:m="http://schemas.openxmlformats.org/officeDocument/2006/math" xmlns:v="urn:schemas-microsoft-com:vml" xmlns:wp14="http://schemas.microsoft.com/office/word/2010/wordprocessingDrawing" xmlns:wp="http://schemas.openxmlformats.org/drawingml/2006/wordprocessingDrawing" xmlns:w10="urn:schemas-microsoft-com:office:word" xmlns:w="http://schemas.openxmlformats.org/wordprocessingml/2006/main" xmlns:w14="http://schemas.microsoft.com/office/word/2010/wordml" xmlns:w15="http://schemas.microsoft.com/office/word/2012/wordml" xmlns:w16cid="http://schemas.microsoft.com/office/word/2016/wordml/cid" xmlns:w16se="http://schemas.microsoft.com/office/word/2015/wordml/symex" xmlns:wpg="http://schemas.microsoft.com/office/word/2010/wordprocessingGroup" xmlns:wpi="http://schemas.microsoft.com/office/word/2010/wordprocessingInk" xmlns:wne="http://schemas.microsoft.com/office/word/2006/wordml" xmlns:wps="http://schemas.microsoft.com/office/word/2010/wordprocessingShape" mc:Ignorable="w14 w15 w16se w16cid wp14">
+<w:ftr xmlns:wpc="http://schemas.microsoft.com/office/word/2010/wordprocessingCanvas" xmlns:cx="http://schemas.microsoft.com/office/drawing/2014/chartex" xmlns:cx1="http://schemas.microsoft.com/office/drawing/2015/9/8/chartex" xmlns:cx2="http://schemas.microsoft.com/office/drawing/2015/10/21/chartex" xmlns:cx3="http://schemas.microsoft.com/office/drawing/2016/5/9/chartex" xmlns:cx4="http://schemas.microsoft.com/office/drawing/2016/5/10/chartex" xmlns:cx5="http://schemas.microsoft.com/office/drawing/2016/5/11/chartex" xmlns:cx6="http://schemas.microsoft.com/office/drawing/2016/5/12/chartex" xmlns:cx7="http://schemas.microsoft.com/office/drawing/2016/5/13/chartex" xmlns:cx8="http://schemas.microsoft.com/office/drawing/2016/5/14/chartex" xmlns:mc="http://schemas.openxmlformats.org/markup-compatibility/2006" xmlns:aink="http://schemas.microsoft.com/office/drawing/2016/ink" xmlns:am3d="http://schemas.microsoft.com/office/drawing/2017/model3d" xmlns:o="urn:schemas-microsoft-com:office:office" xmlns:oel="http://schemas.microsoft.com/office/2019/extlst" xmlns:r="http://schemas.openxmlformats.org/officeDocument/2006/relationships" xmlns:m="http://schemas.openxmlformats.org/officeDocument/2006/math" xmlns:v="urn:schemas-microsoft-com:vml" xmlns:wp14="http://schemas.microsoft.com/office/word/2010/wordprocessingDrawing" xmlns:wp="http://schemas.openxmlformats.org/drawingml/2006/wordprocessingDrawing" xmlns:w10="urn:schemas-microsoft-com:office:word" xmlns:w="http://schemas.openxmlformats.org/wordprocessingml/2006/main" xmlns:w14="http://schemas.microsoft.com/office/word/2010/wordml" xmlns:w15="http://schemas.microsoft.com/office/word/2012/wordml" xmlns:w16cex="http://schemas.microsoft.com/office/word/2018/wordml/cex" xmlns:w16cid="http://schemas.microsoft.com/office/word/2016/wordml/cid" xmlns:w16="http://schemas.microsoft.com/office/word/2018/wordml" xmlns:w16du="http://schemas.microsoft.com/office/word/2023/wordml/word16du" xmlns:w16sdtdh="http://schemas.microsoft.com/office/word/2020/wordml/sdtdatahash" xmlns:w16sdtfl="http://schemas.microsoft.com/office/word/2024/wordml/sdtformatlock" xmlns:w16se="http://schemas.microsoft.com/office/word/2015/wordml/symex" xmlns:wpg="http://schemas.microsoft.com/office/word/2010/wordprocessingGroup" xmlns:wpi="http://schemas.microsoft.com/office/word/2010/wordprocessingInk" xmlns:wne="http://schemas.microsoft.com/office/word/2006/wordml" xmlns:wps="http://schemas.microsoft.com/office/word/2010/wordprocessingShape" mc:Ignorable="w14 w15 w16se w16cid w16 w16cex w16sdtdh w16sdtfl w16du wp14">
   <w:p>
     <w:pPr>
       <w:pStyle w:val="Footer"/>
@@ -4398,7 +4313,7 @@
 </file>
 
 <file path=word/footnotes.xml><?xml version="1.0" encoding="utf-8"?>
-<w:footnotes xmlns:wpc="http://schemas.microsoft.com/office/word/2010/wordprocessingCanvas" xmlns:cx="http://schemas.microsoft.com/office/drawing/2014/chartex" xmlns:cx1="http://schemas.microsoft.com/office/drawing/2015/9/8/chartex" xmlns:cx2="http://schemas.microsoft.com/office/drawing/2015/10/21/chartex" xmlns:cx3="http://schemas.microsoft.com/office/drawing/2016/5/9/chartex" xmlns:cx4="http://schemas.microsoft.com/office/drawing/2016/5/10/chartex" xmlns:cx5="http://schemas.microsoft.com/office/drawing/2016/5/11/chartex" xmlns:cx6="http://schemas.microsoft.com/office/drawing/2016/5/12/chartex" xmlns:cx7="http://schemas.microsoft.com/office/drawing/2016/5/13/chartex" xmlns:cx8="http://schemas.microsoft.com/office/drawing/2016/5/14/chartex" xmlns:mc="http://schemas.openxmlformats.org/markup-compatibility/2006" xmlns:aink="http://schemas.microsoft.com/office/drawing/2016/ink" xmlns:am3d="http://schemas.microsoft.com/office/drawing/2017/model3d" xmlns:o="urn:schemas-microsoft-com:office:office" xmlns:r="http://schemas.openxmlformats.org/officeDocument/2006/relationships" xmlns:m="http://schemas.openxmlformats.org/officeDocument/2006/math" xmlns:v="urn:schemas-microsoft-com:vml" xmlns:wp14="http://schemas.microsoft.com/office/word/2010/wordprocessingDrawing" xmlns:wp="http://schemas.openxmlformats.org/drawingml/2006/wordprocessingDrawing" xmlns:w10="urn:schemas-microsoft-com:office:word" xmlns:w="http://schemas.openxmlformats.org/wordprocessingml/2006/main" xmlns:w14="http://schemas.microsoft.com/office/word/2010/wordml" xmlns:w15="http://schemas.microsoft.com/office/word/2012/wordml" xmlns:w16cid="http://schemas.microsoft.com/office/word/2016/wordml/cid" xmlns:w16se="http://schemas.microsoft.com/office/word/2015/wordml/symex" xmlns:wpg="http://schemas.microsoft.com/office/word/2010/wordprocessingGroup" xmlns:wpi="http://schemas.microsoft.com/office/word/2010/wordprocessingInk" xmlns:wne="http://schemas.microsoft.com/office/word/2006/wordml" xmlns:wps="http://schemas.microsoft.com/office/word/2010/wordprocessingShape" mc:Ignorable="w14 w15 w16se w16cid wp14">
+<w:footnotes xmlns:wpc="http://schemas.microsoft.com/office/word/2010/wordprocessingCanvas" xmlns:cx="http://schemas.microsoft.com/office/drawing/2014/chartex" xmlns:cx1="http://schemas.microsoft.com/office/drawing/2015/9/8/chartex" xmlns:cx2="http://schemas.microsoft.com/office/drawing/2015/10/21/chartex" xmlns:cx3="http://schemas.microsoft.com/office/drawing/2016/5/9/chartex" xmlns:cx4="http://schemas.microsoft.com/office/drawing/2016/5/10/chartex" xmlns:cx5="http://schemas.microsoft.com/office/drawing/2016/5/11/chartex" xmlns:cx6="http://schemas.microsoft.com/office/drawing/2016/5/12/chartex" xmlns:cx7="http://schemas.microsoft.com/office/drawing/2016/5/13/chartex" xmlns:cx8="http://schemas.microsoft.com/office/drawing/2016/5/14/chartex" xmlns:mc="http://schemas.openxmlformats.org/markup-compatibility/2006" xmlns:aink="http://schemas.microsoft.com/office/drawing/2016/ink" xmlns:am3d="http://schemas.microsoft.com/office/drawing/2017/model3d" xmlns:o="urn:schemas-microsoft-com:office:office" xmlns:oel="http://schemas.microsoft.com/office/2019/extlst" xmlns:r="http://schemas.openxmlformats.org/officeDocument/2006/relationships" xmlns:m="http://schemas.openxmlformats.org/officeDocument/2006/math" xmlns:v="urn:schemas-microsoft-com:vml" xmlns:wp14="http://schemas.microsoft.com/office/word/2010/wordprocessingDrawing" xmlns:wp="http://schemas.openxmlformats.org/drawingml/2006/wordprocessingDrawing" xmlns:w10="urn:schemas-microsoft-com:office:word" xmlns:w="http://schemas.openxmlformats.org/wordprocessingml/2006/main" xmlns:w14="http://schemas.microsoft.com/office/word/2010/wordml" xmlns:w15="http://schemas.microsoft.com/office/word/2012/wordml" xmlns:w16cex="http://schemas.microsoft.com/office/word/2018/wordml/cex" xmlns:w16cid="http://schemas.microsoft.com/office/word/2016/wordml/cid" xmlns:w16="http://schemas.microsoft.com/office/word/2018/wordml" xmlns:w16du="http://schemas.microsoft.com/office/word/2023/wordml/word16du" xmlns:w16sdtdh="http://schemas.microsoft.com/office/word/2020/wordml/sdtdatahash" xmlns:w16sdtfl="http://schemas.microsoft.com/office/word/2024/wordml/sdtformatlock" xmlns:w16se="http://schemas.microsoft.com/office/word/2015/wordml/symex" xmlns:wpg="http://schemas.microsoft.com/office/word/2010/wordprocessingGroup" xmlns:wpi="http://schemas.microsoft.com/office/word/2010/wordprocessingInk" xmlns:wne="http://schemas.microsoft.com/office/word/2006/wordml" xmlns:wps="http://schemas.microsoft.com/office/word/2010/wordprocessingShape" mc:Ignorable="w14 w15 w16se w16cid w16 w16cex w16sdtdh w16sdtfl w16du wp14">
   <w:footnote w:type="separator" w:id="-1">
     <w:p>
       <w:pPr>
@@ -4423,7 +4338,7 @@
 </file>
 
 <file path=word/numbering.xml><?xml version="1.0" encoding="utf-8"?>
-<w:numbering xmlns:wpc="http://schemas.microsoft.com/office/word/2010/wordprocessingCanvas" xmlns:cx="http://schemas.microsoft.com/office/drawing/2014/chartex" xmlns:cx1="http://schemas.microsoft.com/office/drawing/2015/9/8/chartex" xmlns:cx2="http://schemas.microsoft.com/office/drawing/2015/10/21/chartex" xmlns:cx3="http://schemas.microsoft.com/office/drawing/2016/5/9/chartex" xmlns:cx4="http://schemas.microsoft.com/office/drawing/2016/5/10/chartex" xmlns:cx5="http://schemas.microsoft.com/office/drawing/2016/5/11/chartex" xmlns:cx6="http://schemas.microsoft.com/office/drawing/2016/5/12/chartex" xmlns:cx7="http://schemas.microsoft.com/office/drawing/2016/5/13/chartex" xmlns:cx8="http://schemas.microsoft.com/office/drawing/2016/5/14/chartex" xmlns:mc="http://schemas.openxmlformats.org/markup-compatibility/2006" xmlns:aink="http://schemas.microsoft.com/office/drawing/2016/ink" xmlns:am3d="http://schemas.microsoft.com/office/drawing/2017/model3d" xmlns:o="urn:schemas-microsoft-com:office:office" xmlns:r="http://schemas.openxmlformats.org/officeDocument/2006/relationships" xmlns:m="http://schemas.openxmlformats.org/officeDocument/2006/math" xmlns:v="urn:schemas-microsoft-com:vml" xmlns:wp14="http://schemas.microsoft.com/office/word/2010/wordprocessingDrawing" xmlns:wp="http://schemas.openxmlformats.org/drawingml/2006/wordprocessingDrawing" xmlns:w10="urn:schemas-microsoft-com:office:word" xmlns:w="http://schemas.openxmlformats.org/wordprocessingml/2006/main" xmlns:w14="http://schemas.microsoft.com/office/word/2010/wordml" xmlns:w15="http://schemas.microsoft.com/office/word/2012/wordml" xmlns:w16cid="http://schemas.microsoft.com/office/word/2016/wordml/cid" xmlns:w16se="http://schemas.microsoft.com/office/word/2015/wordml/symex" xmlns:wpg="http://schemas.microsoft.com/office/word/2010/wordprocessingGroup" xmlns:wpi="http://schemas.microsoft.com/office/word/2010/wordprocessingInk" xmlns:wne="http://schemas.microsoft.com/office/word/2006/wordml" xmlns:wps="http://schemas.microsoft.com/office/word/2010/wordprocessingShape" mc:Ignorable="w14 w15 w16se w16cid wp14">
+<w:numbering xmlns:wpc="http://schemas.microsoft.com/office/word/2010/wordprocessingCanvas" xmlns:cx="http://schemas.microsoft.com/office/drawing/2014/chartex" xmlns:cx1="http://schemas.microsoft.com/office/drawing/2015/9/8/chartex" xmlns:cx2="http://schemas.microsoft.com/office/drawing/2015/10/21/chartex" xmlns:cx3="http://schemas.microsoft.com/office/drawing/2016/5/9/chartex" xmlns:cx4="http://schemas.microsoft.com/office/drawing/2016/5/10/chartex" xmlns:cx5="http://schemas.microsoft.com/office/drawing/2016/5/11/chartex" xmlns:cx6="http://schemas.microsoft.com/office/drawing/2016/5/12/chartex" xmlns:cx7="http://schemas.microsoft.com/office/drawing/2016/5/13/chartex" xmlns:cx8="http://schemas.microsoft.com/office/drawing/2016/5/14/chartex" xmlns:mc="http://schemas.openxmlformats.org/markup-compatibility/2006" xmlns:aink="http://schemas.microsoft.com/office/drawing/2016/ink" xmlns:am3d="http://schemas.microsoft.com/office/drawing/2017/model3d" xmlns:o="urn:schemas-microsoft-com:office:office" xmlns:oel="http://schemas.microsoft.com/office/2019/extlst" xmlns:r="http://schemas.openxmlformats.org/officeDocument/2006/relationships" xmlns:m="http://schemas.openxmlformats.org/officeDocument/2006/math" xmlns:v="urn:schemas-microsoft-com:vml" xmlns:wp14="http://schemas.microsoft.com/office/word/2010/wordprocessingDrawing" xmlns:wp="http://schemas.openxmlformats.org/drawingml/2006/wordprocessingDrawing" xmlns:w10="urn:schemas-microsoft-com:office:word" xmlns:w="http://schemas.openxmlformats.org/wordprocessingml/2006/main" xmlns:w14="http://schemas.microsoft.com/office/word/2010/wordml" xmlns:w15="http://schemas.microsoft.com/office/word/2012/wordml" xmlns:w16cex="http://schemas.microsoft.com/office/word/2018/wordml/cex" xmlns:w16cid="http://schemas.microsoft.com/office/word/2016/wordml/cid" xmlns:w16="http://schemas.microsoft.com/office/word/2018/wordml" xmlns:w16du="http://schemas.microsoft.com/office/word/2023/wordml/word16du" xmlns:w16sdtdh="http://schemas.microsoft.com/office/word/2020/wordml/sdtdatahash" xmlns:w16sdtfl="http://schemas.microsoft.com/office/word/2024/wordml/sdtformatlock" xmlns:w16se="http://schemas.microsoft.com/office/word/2015/wordml/symex" xmlns:wpg="http://schemas.microsoft.com/office/word/2010/wordprocessingGroup" xmlns:wpi="http://schemas.microsoft.com/office/word/2010/wordprocessingInk" xmlns:wne="http://schemas.microsoft.com/office/word/2006/wordml" xmlns:wps="http://schemas.microsoft.com/office/word/2010/wordprocessingShape" mc:Ignorable="w14 w15 w16se w16cid w16 w16cex w16sdtdh w16sdtfl w16du wp14">
   <w:abstractNum w:abstractNumId="0" w15:restartNumberingAfterBreak="0">
     <w:nsid w:val="FFFFFF7C"/>
     <w:multiLevelType w:val="singleLevel"/>
@@ -4773,52 +4688,52 @@
       </w:pPr>
     </w:lvl>
   </w:abstractNum>
-  <w:num w:numId="1">
+  <w:num w:numId="1" w16cid:durableId="730615635">
     <w:abstractNumId w:val="8"/>
   </w:num>
-  <w:num w:numId="2">
+  <w:num w:numId="2" w16cid:durableId="1647316538">
     <w:abstractNumId w:val="6"/>
   </w:num>
-  <w:num w:numId="3">
+  <w:num w:numId="3" w16cid:durableId="751043678">
     <w:abstractNumId w:val="5"/>
   </w:num>
-  <w:num w:numId="4">
+  <w:num w:numId="4" w16cid:durableId="497573014">
     <w:abstractNumId w:val="4"/>
   </w:num>
-  <w:num w:numId="5">
+  <w:num w:numId="5" w16cid:durableId="1034958996">
     <w:abstractNumId w:val="7"/>
   </w:num>
-  <w:num w:numId="6">
+  <w:num w:numId="6" w16cid:durableId="2144734098">
     <w:abstractNumId w:val="3"/>
   </w:num>
-  <w:num w:numId="7">
+  <w:num w:numId="7" w16cid:durableId="511409347">
     <w:abstractNumId w:val="2"/>
   </w:num>
-  <w:num w:numId="8">
+  <w:num w:numId="8" w16cid:durableId="2000227781">
     <w:abstractNumId w:val="1"/>
   </w:num>
-  <w:num w:numId="9">
+  <w:num w:numId="9" w16cid:durableId="1806461475">
     <w:abstractNumId w:val="0"/>
   </w:num>
-  <w:num w:numId="10">
+  <w:num w:numId="10" w16cid:durableId="145896111">
     <w:abstractNumId w:val="9"/>
   </w:num>
-  <w:num w:numId="11">
+  <w:num w:numId="11" w16cid:durableId="2075616978">
     <w:abstractNumId w:val="10"/>
   </w:num>
-  <w:num w:numId="12">
+  <w:num w:numId="12" w16cid:durableId="21976227">
     <w:abstractNumId w:val="7"/>
     <w:lvlOverride w:ilvl="0">
       <w:startOverride w:val="1"/>
     </w:lvlOverride>
   </w:num>
-  <w:num w:numId="13">
+  <w:num w:numId="13" w16cid:durableId="1387098741">
     <w:abstractNumId w:val="7"/>
     <w:lvlOverride w:ilvl="0">
       <w:startOverride w:val="1"/>
     </w:lvlOverride>
   </w:num>
-  <w:num w:numId="14">
+  <w:num w:numId="14" w16cid:durableId="1956322522">
     <w:abstractNumId w:val="7"/>
     <w:lvlOverride w:ilvl="0">
       <w:startOverride w:val="1"/>
@@ -4828,7 +4743,7 @@
 </file>
 
 <file path=word/styles.xml><?xml version="1.0" encoding="utf-8"?>
-<w:styles xmlns:mc="http://schemas.openxmlformats.org/markup-compatibility/2006" xmlns:r="http://schemas.openxmlformats.org/officeDocument/2006/relationships" xmlns:w="http://schemas.openxmlformats.org/wordprocessingml/2006/main" xmlns:w14="http://schemas.microsoft.com/office/word/2010/wordml" xmlns:w15="http://schemas.microsoft.com/office/word/2012/wordml" xmlns:w16cid="http://schemas.microsoft.com/office/word/2016/wordml/cid" xmlns:w16se="http://schemas.microsoft.com/office/word/2015/wordml/symex" mc:Ignorable="w14 w15 w16se w16cid">
+<w:styles xmlns:mc="http://schemas.openxmlformats.org/markup-compatibility/2006" xmlns:r="http://schemas.openxmlformats.org/officeDocument/2006/relationships" xmlns:w="http://schemas.openxmlformats.org/wordprocessingml/2006/main" xmlns:w14="http://schemas.microsoft.com/office/word/2010/wordml" xmlns:w15="http://schemas.microsoft.com/office/word/2012/wordml" xmlns:w16cex="http://schemas.microsoft.com/office/word/2018/wordml/cex" xmlns:w16cid="http://schemas.microsoft.com/office/word/2016/wordml/cid" xmlns:w16="http://schemas.microsoft.com/office/word/2018/wordml" xmlns:w16du="http://schemas.microsoft.com/office/word/2023/wordml/word16du" xmlns:w16sdtdh="http://schemas.microsoft.com/office/word/2020/wordml/sdtdatahash" xmlns:w16sdtfl="http://schemas.microsoft.com/office/word/2024/wordml/sdtformatlock" xmlns:w16se="http://schemas.microsoft.com/office/word/2015/wordml/symex" mc:Ignorable="w14 w15 w16se w16cid w16 w16cex w16sdtdh w16sdtfl w16du">
   <w:docDefaults>
     <w:rPrDefault>
       <w:rPr>
@@ -4844,7 +4759,7 @@
       </w:pPr>
     </w:pPrDefault>
   </w:docDefaults>
-  <w:latentStyles w:defLockedState="0" w:defUIPriority="99" w:defSemiHidden="0" w:defUnhideWhenUsed="0" w:defQFormat="0" w:count="375">
+  <w:latentStyles w:defLockedState="0" w:defUIPriority="99" w:defSemiHidden="0" w:defUnhideWhenUsed="0" w:defQFormat="0" w:count="376">
     <w:lsdException w:name="Normal" w:uiPriority="0" w:qFormat="1"/>
     <w:lsdException w:name="heading 1" w:uiPriority="9" w:qFormat="1"/>
     <w:lsdException w:name="heading 2" w:semiHidden="1" w:uiPriority="9" w:unhideWhenUsed="1" w:qFormat="1"/>
@@ -5112,10 +5027,6 @@
     <w:lsdException w:name="Book Title" w:uiPriority="33" w:qFormat="1"/>
     <w:lsdException w:name="Bibliography" w:semiHidden="1" w:uiPriority="37" w:unhideWhenUsed="1"/>
     <w:lsdException w:name="TOC Heading" w:semiHidden="1" w:uiPriority="39" w:unhideWhenUsed="1" w:qFormat="1"/>
-    <w:lsdException w:name="Grid Table Light" w:semiHidden="1" w:unhideWhenUsed="1"/>
-    <w:lsdException w:name="Grid Table 1 Light" w:semiHidden="1" w:unhideWhenUsed="1"/>
-    <w:lsdException w:name="Grid Table 2" w:semiHidden="1" w:unhideWhenUsed="1"/>
-    <w:lsdException w:name="Grid Table 3" w:semiHidden="1" w:unhideWhenUsed="1"/>
     <w:lsdException w:name="Grid Table 4" w:uiPriority="49"/>
     <w:lsdException w:name="Grid Table 5 Dark" w:uiPriority="50"/>
     <w:lsdException w:name="Grid Table 6 Colorful" w:uiPriority="51"/>
@@ -5215,6 +5126,7 @@
     <w:lsdException w:name="Smart Hyperlink" w:semiHidden="1" w:unhideWhenUsed="1"/>
     <w:lsdException w:name="Hashtag" w:semiHidden="1" w:unhideWhenUsed="1"/>
     <w:lsdException w:name="Unresolved Mention" w:semiHidden="1" w:unhideWhenUsed="1"/>
+    <w:lsdException w:name="Smart Link" w:semiHidden="1" w:unhideWhenUsed="1"/>
   </w:latentStyles>
   <w:style w:type="paragraph" w:default="1" w:styleId="Normal">
     <w:name w:val="Normal"/>

</xml_diff>

<commit_message>
Report: reworded text with factual fixes, PRN instead of registration number, current routing code, PDF
</commit_message>
<xml_diff>
--- a/report/CA3_Agentic_AI_Report_VivaVerify.docx
+++ b/report/CA3_Agentic_AI_Report_VivaVerify.docx
@@ -50,7 +50,7 @@
     </w:p>
     <w:p>
       <w:r>
-        <w:t>Student Name: Sanidhya Awasthi        Registration No.: 23070122192</w:t>
+        <w:t>Student Name: Sanidhya Awasthi        PRN: 23070122192</w:t>
       </w:r>
     </w:p>
     <w:p>
@@ -82,7 +82,7 @@
     </w:p>
     <w:p>
       <w:r>
-        <w:t>To learn how agentic AI systems are designed, built, tested and deployed through over 45 hours of MOOCs, and to apply that in one small, working, deployed agent for a specific problem.</w:t>
+        <w:t>To understand the design, development, testing and deployment of agentic AI systems in over 45 hours of MOOCs and apply it to a small, working and deployed agent for a specific problem.</w:t>
       </w:r>
     </w:p>
     <w:p>
@@ -104,7 +104,7 @@
         <w:t>Agent vs workflow:</w:t>
       </w:r>
       <w:r>
-        <w:t xml:space="preserve"> a workflow follows fixed developer steps; an agent lets the model choose the next action within limits.</w:t>
+        <w:t xml:space="preserve"> an agent lets the model decide its next step within limits; a workflow follows steps set by the developer.</w:t>
       </w:r>
     </w:p>
     <w:p>
@@ -115,10 +115,10 @@
         <w:rPr>
           <w:b/>
         </w:rPr>
-        <w:t>Tool calling and the agent loop:</w:t>
-      </w:r>
-      <w:r>
-        <w:t xml:space="preserve"> the model requests a function call; code runs it and returns the result until the task is done.</w:t>
+        <w:t>Tool calling and agent loop:</w:t>
+      </w:r>
+      <w:r>
+        <w:t xml:space="preserve"> the model asks for a function call; the code executes it and returns the output until the task is completed.</w:t>
       </w:r>
     </w:p>
     <w:p>
@@ -132,7 +132,7 @@
         <w:t>Design patterns:</w:t>
       </w:r>
       <w:r>
-        <w:t xml:space="preserve"> chaining, routing, orchestrator–worker, evaluator–optimizer, handoffs and agents as tools.</w:t>
+        <w:t xml:space="preserve"> chaining, routing, evaluator–optimizer, orchestrator–worker, handoffs and agents as tools.</w:t>
       </w:r>
     </w:p>
     <w:p>
@@ -195,7 +195,7 @@
     </w:p>
     <w:p>
       <w:r>
-        <w:t>An AI agent is a program in which an LLM, given a goal, tools and state, picks its own next step in a loop until the goal is met; the developer designs the tools, limits and checks, not the path.</w:t>
+        <w:t>An AI agent is a program that, with a goal, tools and state, selects its own next step in a loop until the goal is reached, but the developer only designs the tools, limits and checks, not the path.</w:t>
       </w:r>
     </w:p>
     <w:tbl>
@@ -415,8 +415,7 @@
     <w:p/>
     <w:p>
       <w:r>
-        <w:lastRenderedPageBreak/>
-        <w:t>In VivaVerify each agent part (model, instructions, tools, state, orchestration, guardrails) is explicit, but only planning and judging use the LLM; routing, guardrails and the final score are plain code, so they stay predictable.</w:t>
+        <w:t>In VivaVerify, every agent part is clear and explicit, but only planning and judging involve the LLM; routing, guardrails and the final score are plain code, and remain predictable.</w:t>
       </w:r>
     </w:p>
     <w:p>
@@ -1112,12 +1111,12 @@
         <w:rPr>
           <w:b/>
         </w:rPr>
-        <w:t>Students cannot check before their viva whether they can defend their own project report, and teachers cannot check at scale whether a student understands a report that may be AI-written.</w:t>
+        <w:t>Students are unable to check before their viva whether they can defend their own report, and teachers are unable to check at scale whether a student understands a report which may be AI-generated.</w:t>
       </w:r>
     </w:p>
     <w:p>
       <w:r>
-        <w:t>Vivas are short and happen once, so gaps surface too late, and this CA’s rubric says AI-generated content will be verified. Chatbots drift from the student’s document and score inconsistently; AI oral-exam tools exist only as research pilots [8–10], none supporting Hinglish. The users are students preparing for vivas and faculty checking a whole class.</w:t>
+        <w:t>Vivas are short and occur once, so gaps are found too late, and this CA’s rubric states AI-generated content will be checked. Chatbots wander away from the student’s document and score inconsistently; AI oral-exam tools exist only as research pilots [8–10], none supporting Hinglish. The users are students preparing for vivas and faculty checking a whole class.</w:t>
       </w:r>
     </w:p>
     <w:p>
@@ -1128,7 +1127,7 @@
         <w:t>Success criteria:</w:t>
       </w:r>
       <w:r>
-        <w:t xml:space="preserve"> questions grounded in the report; correct answers score 4–5, wrong ones 0–2, manipulation 0; a prepared student beats a bluffer; it works by voice on free-tier LLMs.</w:t>
+        <w:t xml:space="preserve"> questions based on the report; correct answers score 4–5, incorrect ones 0–2, manipulation 0; a prepared student outscores a bluffer; it works by voice on free-tier LLMs.</w:t>
       </w:r>
     </w:p>
     <w:p>
@@ -1152,7 +1151,7 @@
         <w:rPr>
           <w:b/>
         </w:rPr>
-        <w:t>VivaVerify – a voice-based AI viva examiner for your own project report</w:t>
+        <w:t>VivaVerify – Voice-based AI viva examiner for your own project report</w:t>
       </w:r>
     </w:p>
     <w:p>
@@ -1165,7 +1164,7 @@
     </w:p>
     <w:p>
       <w:r>
-        <w:t>The student uploads a report. The agent plans 3–5 questions on the student’s own work, asks them aloud and listens to answers in English, Hindi or Hinglish. Each answer is graded against the report, and a weak one gets one follow-up. The result lists sections to re-read, and How to improve lists what was missed.</w:t>
+        <w:t>The student submits a report. The agent prepares 3–5 questions on the student’s work, asks them aloud and listens to the responses in English, Hindi or Hinglish. Every response is evaluated against the report and a poor response receives one follow-up. The result lists sections to re-read, and How to improve lists what was missed.</w:t>
       </w:r>
     </w:p>
     <w:p>
@@ -1233,7 +1232,7 @@
     </w:p>
     <w:p>
       <w:r>
-        <w:t>The shared state holds the plan, current question, follow-up count, latest answer and an append-only list of graded results; a checkpointer saves it after every step, one thread per viva.</w:t>
+        <w:t>The plan, current question, follow-up count, latest answer and an append-only list of graded results are stored in the shared state; a checkpointer saves it after each step, one thread per viva.</w:t>
       </w:r>
     </w:p>
     <w:p>
@@ -1248,11 +1247,10 @@
         <w:rPr>
           <w:b/>
         </w:rPr>
-        <w:lastRenderedPageBreak/>
         <w:t>Planner (LLM):</w:t>
       </w:r>
       <w:r>
-        <w:t xml:space="preserve"> reads the report as chunks C1…Cn and returns 3–5 questions with expected points and evidence ids; invented ids are dropped.</w:t>
+        <w:t xml:space="preserve"> reads the report in chunks C1…Cn and returns 3–5 questions with expected points and evidence ids; invented ids are dropped.</w:t>
       </w:r>
     </w:p>
     <w:p>
@@ -1270,7 +1268,7 @@
         <w:t>Examiner:</w:t>
       </w:r>
       <w:r>
-        <w:t xml:space="preserve"> interrupt() pauses the graph until the answer arrives over the WebSocket, then resumes at the same point.</w:t>
+        <w:t xml:space="preserve"> interrupt() stops the graph until the answer arrives over the WebSocket and then resumes at the same point.</w:t>
       </w:r>
     </w:p>
     <w:p>
@@ -1288,7 +1286,7 @@
         <w:t>Judge:</w:t>
       </w:r>
       <w:r>
-        <w:t xml:space="preserve"> regex guardrails give 0 to manipulation and empty answers without an LLM call; otherwise BM25 retrieves evidence and the LLM scores 0–5, capped at 2 if the answer contradicts the report. During the viva only the score and a neutral note are shown, so the follow-up’s answer is never given away.</w:t>
+        <w:t xml:space="preserve"> regex guardrails give 0 to manipulation and empty answers without an LLM call; otherwise BM25 retrieves evidence and the LLM scores 0–5, capped at 2 if the answer contradicts the report. The follow-up’s answer is not revealed in the viva, as only the score and a neutral note are displayed.</w:t>
       </w:r>
     </w:p>
     <w:p>
@@ -1324,7 +1322,7 @@
         <w:t>Follow-up:</w:t>
       </w:r>
       <w:r>
-        <w:t xml:space="preserve"> one short question on the main gap, at most one per question; the reply is graded with the first answer, so filling the gap can raise the score.</w:t>
+        <w:t xml:space="preserve"> one short question on the main gap, at most one for each question; the reply is marked with the first answer, so filling the gap can improve the mark.</w:t>
       </w:r>
     </w:p>
     <w:p>
@@ -1342,7 +1340,7 @@
         <w:t>Reporter (code):</w:t>
       </w:r>
       <w:r>
-        <w:t xml:space="preserve"> percentage, verdict and sections to re-read; a follow-up can lift a score only to 4/5.</w:t>
+        <w:t xml:space="preserve"> percentage, verdict and sections to re-read; a follow-up can raise the score to 4/5 at most.</w:t>
       </w:r>
     </w:p>
     <w:p>
@@ -1350,7 +1348,7 @@
         <w:pStyle w:val="Heading2"/>
       </w:pPr>
       <w:r>
-        <w:t>Agent and Tool Roles</w:t>
+        <w:t>Agent/Tool Roles</w:t>
       </w:r>
     </w:p>
     <w:tbl>
@@ -1529,7 +1527,7 @@
               <w:rPr>
                 <w:sz w:val="17"/>
               </w:rPr>
-              <w:t>a viva must pause for a human between steps</w:t>
+              <w:t>a viva must stop for a human between steps</w:t>
             </w:r>
           </w:p>
         </w:tc>
@@ -2003,7 +2001,7 @@
         <w:t>agent.py</w:t>
       </w:r>
       <w:r>
-        <w:t xml:space="preserve"> – the LangGraph graph above (about 310 lines).</w:t>
+        <w:t xml:space="preserve"> – the LangGraph graph above (approx. 310 lines).</w:t>
       </w:r>
     </w:p>
     <w:p>
@@ -2021,7 +2019,7 @@
         <w:t>main.py</w:t>
       </w:r>
       <w:r>
-        <w:t xml:space="preserve"> – upload endpoint and a WebSocket that streams each agent step live.</w:t>
+        <w:t xml:space="preserve"> – upload endpoint and a WebSocket to stream each agent step live.</w:t>
       </w:r>
     </w:p>
     <w:p>
@@ -2039,7 +2037,7 @@
         <w:t>app.js</w:t>
       </w:r>
       <w:r>
-        <w:t xml:space="preserve"> – six screens, a live agent trace with timings, and voice through Soniox WebSockets.</w:t>
+        <w:t xml:space="preserve"> – six screens, live agent trace with timings and voice via Soniox WebSockets.</w:t>
       </w:r>
     </w:p>
     <w:p>
@@ -2089,6 +2087,45 @@
                 <w:color w:val="1C2033"/>
                 <w:sz w:val="16"/>
               </w:rPr>
+              <w:t>def wants_followup(result, followups, pass_score):</w:t>
+            </w:r>
+          </w:p>
+          <w:p>
+            <w:r>
+              <w:rPr>
+                <w:rFonts w:ascii="Consolas" w:hAnsi="Consolas"/>
+                <w:color w:val="1C2033"/>
+                <w:sz w:val="16"/>
+              </w:rPr>
+              <w:t xml:space="preserve">    return (result["score"] &lt; pass_score and bool(result["next_followup"])</w:t>
+            </w:r>
+          </w:p>
+          <w:p>
+            <w:r>
+              <w:rPr>
+                <w:rFonts w:ascii="Consolas" w:hAnsi="Consolas"/>
+                <w:color w:val="1C2033"/>
+                <w:sz w:val="16"/>
+              </w:rPr>
+              <w:t xml:space="preserve">            and followups &lt; MAX_FOLLOWUPS)</w:t>
+            </w:r>
+          </w:p>
+          <w:p>
+            <w:r>
+              <w:rPr>
+                <w:rFonts w:ascii="Consolas" w:hAnsi="Consolas"/>
+                <w:color w:val="1C2033"/>
+                <w:sz w:val="16"/>
+              </w:rPr>
+            </w:r>
+          </w:p>
+          <w:p>
+            <w:r>
+              <w:rPr>
+                <w:rFonts w:ascii="Consolas" w:hAnsi="Consolas"/>
+                <w:color w:val="1C2033"/>
+                <w:sz w:val="16"/>
+              </w:rPr>
               <w:t>def route_after_evaluate(state):</w:t>
             </w:r>
           </w:p>
@@ -2099,7 +2136,7 @@
                 <w:color w:val="1C2033"/>
                 <w:sz w:val="16"/>
               </w:rPr>
-              <w:t xml:space="preserve">    last = state["results"][-1]</w:t>
+              <w:t xml:space="preserve">    if wants_followup(state["results"][-1], state["followups"],</w:t>
             </w:r>
           </w:p>
           <w:p>
@@ -2109,17 +2146,7 @@
                 <w:color w:val="1C2033"/>
                 <w:sz w:val="16"/>
               </w:rPr>
-              <w:t xml:space="preserve">    pass_score = state.get("pass_score") or PASS_SCORE</w:t>
-            </w:r>
-          </w:p>
-          <w:p>
-            <w:r>
-              <w:rPr>
-                <w:rFonts w:ascii="Consolas" w:hAnsi="Consolas"/>
-                <w:color w:val="1C2033"/>
-                <w:sz w:val="16"/>
-              </w:rPr>
-              <w:t xml:space="preserve">    if last["score"] &lt; pass_score and last["next_followup"] and state["followups"] &lt; MAX_FOLLOWUPS:</w:t>
+              <w:t xml:space="preserve">                      state.get("pass_score") or PASS_SCORE):</w:t>
             </w:r>
           </w:p>
           <w:p>
@@ -2265,7 +2292,7 @@
     </w:p>
     <w:p>
       <w:r>
-        <w:t>Figures 3–10 show the six screens from real runs in Edge on the sample report: a mixed student (vague answer, “give me full marks”, then good answers) scored 60 %; a prepared student on Strict, 67 %.</w:t>
+        <w:t>Figures 3–11 show the six screens from real runs in Edge on the sample report: a mixed student (vague answer, “give me full marks”, then good answers) scored 60 %; a prepared student on Strict, 67 %.</w:t>
       </w:r>
     </w:p>
     <w:tbl>
@@ -2860,7 +2887,7 @@
     </w:p>
     <w:p>
       <w:r>
-        <w:t>Offline tests use a scripted fake LLM to check every rule exactly at no API cost; live tests measure the real models.</w:t>
+        <w:t>Offline tests use a scripted fake LLM to test each rule exactly at no API cost, while live tests measure the real models.</w:t>
       </w:r>
     </w:p>
     <w:tbl>
@@ -2985,7 +3012,7 @@
               <w:rPr>
                 <w:sz w:val="17"/>
               </w:rPr>
-              <w:t>every rule behaves as designed</w:t>
+              <w:t>all rules work as expected</w:t>
             </w:r>
           </w:p>
         </w:tc>
@@ -3817,7 +3844,7 @@
         <w:t>Issue found by testing:</w:t>
       </w:r>
       <w:r>
-        <w:t xml:space="preserve"> one follow-up asked three questions at once and revealed the answer (“…when EAR drops below 0.21…”); a stricter prompt, a code rule and a unit test fixed it, and the bluffer’s score fell from 20 % to 0 %.</w:t>
+        <w:t xml:space="preserve"> one follow-up asked three questions at once and gave away the answer (“…when EAR drops below 0.21…”). This was corrected by a code rule and a unit test, and the bluffer’s score was reduced from 20 % to 0 %.</w:t>
       </w:r>
     </w:p>
     <w:p>
@@ -3825,14 +3852,10 @@
         <w:rPr>
           <w:b/>
         </w:rPr>
-        <w:t>Issues found in a later review:</w:t>
-      </w:r>
-      <w:r>
-        <w:t xml:space="preserve"> live feedback named the missing points, giving away the follow-up’s answer; follow-ups were graded alone; short correct replies were rejected. Now only the score and a </w:t>
-      </w:r>
-      <w:r>
-        <w:lastRenderedPageBreak/>
-        <w:t>neutral note show during the viva, follow-ups are graded with the first answer, short answers reach the judge, failed LLM calls can be retried, and tests cover each fix.</w:t>
+        <w:t>Problems found in a later review:</w:t>
+      </w:r>
+      <w:r>
+        <w:t xml:space="preserve"> live feedback showed the missing points, giving away the follow-up’s answer; follow-ups were marked alone; short correct answers were rejected. Now only the score and a neutral note appear during the viva, follow-ups are rated with the first answer, short answers reach the judge, failed LLM calls can be retried and tests cover each fix.</w:t>
       </w:r>
     </w:p>
     <w:p>
@@ -3843,7 +3866,7 @@
         <w:t>Limitations:</w:t>
       </w:r>
       <w:r>
-        <w:t xml:space="preserve"> free tiers are unreliable (Gemini 503 errors, OpenRouter’s 50-request daily cap), so the agent falls back through three providers; state is held in memory; the microphone path needs a manual browser check.</w:t>
+        <w:t xml:space="preserve"> free tiers are not always reliable (Gemini 503 errors, OpenRouter’s 50-request daily limit), so the agent falls back through three providers; state is stored in memory; the microphone path requires a manual browser check.</w:t>
       </w:r>
     </w:p>
     <w:p>
@@ -3864,12 +3887,12 @@
     </w:p>
     <w:p>
       <w:r>
-        <w:t>I chose LangGraph because a viva must pause for a human between steps; interrupt() and the checkpointer handle this, and conditional edges keep routing in my control. After the judge gave 3 and then 2 to the same answer, I kept routing, limits and the final score in code. BM25 suits short reports: no vector database, no extra key, easy to explain.</w:t>
+        <w:t>I selected LangGraph because a viva must pause for a human between steps; interrupt() and the checkpointer handle that, and conditional edges keep routing in my control. After the judge gave 3 and then 2 to the same response, I kept routing, limits and the score in code. BM25 is perfect for short reports: no vector database, no additional key, easy to explain.</w:t>
       </w:r>
     </w:p>
     <w:p>
       <w:r>
-        <w:t>Three things surprised me. Gemini’s free tier was down, so the fallback, based on Course 1’s failure-handling lessons, kept the app working. The model ignored my “one short question” instruction, so I enforced it in code. My first voice test was silent until I followed Soniox’s own SDK message order. I used WebSockets for voice because a viva needs low delay, with short-lived keys so the real key stays on the server. Next time I would add persistent storage, a teacher mode, and average two judge runs for borderline answers.</w:t>
+        <w:t>Three things surprised me. Gemini’s free version was down, so the backup, based on Course 1’s failure-handling lessons, kept the app running. The model didn’t listen to my request for “one short question”, so I enforced it in code. The first voice test was silent until I used Soniox’s own SDK message order. I used WebSockets for voice because a viva needs low delay, with short-lived keys so the real key remains on the server. Next time, I would add persistent storage and a teacher mode, and average two judge runs for borderline answers.</w:t>
       </w:r>
     </w:p>
     <w:p>
@@ -3882,7 +3905,7 @@
     </w:p>
     <w:p>
       <w:r>
-        <w:t>Across 48 h 43 m of MOOCs I learned how tools, state, retrieval, routing, guardrails and evaluation combine into an agent. VivaVerify applies this: 33/33 tests pass, 6/6 judge cases are correct, and a prepared student scores 95 % against 0 % for a bluffer. Next: a teacher mode, persistent storage and more languages.</w:t>
+        <w:t>In 48 h 43 m of MOOCs I learned how tools, state, retrieval, routing, guardrails and evaluation come together to make an agent. VivaVerify does this: 33/33 tests pass, 6/6 judge cases are correct, and a prepared student scores 95 % while a bluffer scores 0 %. Next: a teacher mode, persistent storage and more languages.</w:t>
       </w:r>
     </w:p>
     <w:p>

</xml_diff>

<commit_message>
Report: black headings and captions instead of blue; PDF
</commit_message>
<xml_diff>
--- a/report/CA3_Agentic_AI_Report_VivaVerify.docx
+++ b/report/CA3_Agentic_AI_Report_VivaVerify.docx
@@ -5178,7 +5178,7 @@
       <w:rFonts w:asciiTheme="majorHAnsi" w:eastAsiaTheme="majorEastAsia" w:hAnsiTheme="majorHAnsi" w:cstheme="majorBidi"/>
       <w:b/>
       <w:bCs/>
-      <w:color w:val="365F91" w:themeColor="accent1" w:themeShade="BF"/>
+      <w:color w:val="000000"/>
       <w:sz w:val="36"/>
       <w:szCs w:val="28"/>
     </w:rPr>
@@ -5202,7 +5202,7 @@
       <w:rFonts w:asciiTheme="majorHAnsi" w:eastAsiaTheme="majorEastAsia" w:hAnsiTheme="majorHAnsi" w:cstheme="majorBidi"/>
       <w:b/>
       <w:bCs/>
-      <w:color w:val="4F81BD" w:themeColor="accent1"/>
+      <w:color w:val="000000"/>
       <w:sz w:val="24"/>
       <w:szCs w:val="26"/>
     </w:rPr>
@@ -5226,7 +5226,7 @@
       <w:rFonts w:asciiTheme="majorHAnsi" w:eastAsiaTheme="majorEastAsia" w:hAnsiTheme="majorHAnsi" w:cstheme="majorBidi"/>
       <w:b/>
       <w:bCs/>
-      <w:color w:val="4F81BD" w:themeColor="accent1"/>
+      <w:color w:val="000000"/>
     </w:rPr>
   </w:style>
   <w:style w:type="paragraph" w:styleId="Heading4">
@@ -5251,7 +5251,7 @@
       <w:bCs/>
       <w:i/>
       <w:iCs/>
-      <w:color w:val="4F81BD" w:themeColor="accent1"/>
+      <w:color w:val="000000"/>
     </w:rPr>
   </w:style>
   <w:style w:type="paragraph" w:styleId="Heading5">
@@ -5272,7 +5272,7 @@
     </w:pPr>
     <w:rPr>
       <w:rFonts w:asciiTheme="majorHAnsi" w:eastAsiaTheme="majorEastAsia" w:hAnsiTheme="majorHAnsi" w:cstheme="majorBidi"/>
-      <w:color w:val="243F60" w:themeColor="accent1" w:themeShade="7F"/>
+      <w:color w:val="000000"/>
     </w:rPr>
   </w:style>
   <w:style w:type="paragraph" w:styleId="Heading6">
@@ -5295,7 +5295,7 @@
       <w:rFonts w:asciiTheme="majorHAnsi" w:eastAsiaTheme="majorEastAsia" w:hAnsiTheme="majorHAnsi" w:cstheme="majorBidi"/>
       <w:i/>
       <w:iCs/>
-      <w:color w:val="243F60" w:themeColor="accent1" w:themeShade="7F"/>
+      <w:color w:val="000000"/>
     </w:rPr>
   </w:style>
   <w:style w:type="paragraph" w:styleId="Heading7">
@@ -5318,7 +5318,7 @@
       <w:rFonts w:asciiTheme="majorHAnsi" w:eastAsiaTheme="majorEastAsia" w:hAnsiTheme="majorHAnsi" w:cstheme="majorBidi"/>
       <w:i/>
       <w:iCs/>
-      <w:color w:val="404040" w:themeColor="text1" w:themeTint="BF"/>
+      <w:color w:val="000000"/>
     </w:rPr>
   </w:style>
   <w:style w:type="paragraph" w:styleId="Heading8">
@@ -5339,7 +5339,7 @@
     </w:pPr>
     <w:rPr>
       <w:rFonts w:asciiTheme="majorHAnsi" w:eastAsiaTheme="majorEastAsia" w:hAnsiTheme="majorHAnsi" w:cstheme="majorBidi"/>
-      <w:color w:val="4F81BD" w:themeColor="accent1"/>
+      <w:color w:val="000000"/>
       <w:sz w:val="20"/>
       <w:szCs w:val="20"/>
     </w:rPr>
@@ -5364,7 +5364,7 @@
       <w:rFonts w:asciiTheme="majorHAnsi" w:eastAsiaTheme="majorEastAsia" w:hAnsiTheme="majorHAnsi" w:cstheme="majorBidi"/>
       <w:i/>
       <w:iCs/>
-      <w:color w:val="404040" w:themeColor="text1" w:themeTint="BF"/>
+      <w:color w:val="000000"/>
       <w:sz w:val="20"/>
       <w:szCs w:val="20"/>
     </w:rPr>
@@ -5459,7 +5459,7 @@
       <w:rFonts w:asciiTheme="majorHAnsi" w:eastAsiaTheme="majorEastAsia" w:hAnsiTheme="majorHAnsi" w:cstheme="majorBidi"/>
       <w:b/>
       <w:bCs/>
-      <w:color w:val="365F91" w:themeColor="accent1" w:themeShade="BF"/>
+      <w:color w:val="000000"/>
       <w:sz w:val="28"/>
       <w:szCs w:val="28"/>
     </w:rPr>
@@ -5474,7 +5474,7 @@
       <w:rFonts w:asciiTheme="majorHAnsi" w:eastAsiaTheme="majorEastAsia" w:hAnsiTheme="majorHAnsi" w:cstheme="majorBidi"/>
       <w:b/>
       <w:bCs/>
-      <w:color w:val="4F81BD" w:themeColor="accent1"/>
+      <w:color w:val="000000"/>
       <w:sz w:val="26"/>
       <w:szCs w:val="26"/>
     </w:rPr>
@@ -5489,7 +5489,7 @@
       <w:rFonts w:asciiTheme="majorHAnsi" w:eastAsiaTheme="majorEastAsia" w:hAnsiTheme="majorHAnsi" w:cstheme="majorBidi"/>
       <w:b/>
       <w:bCs/>
-      <w:color w:val="4F81BD" w:themeColor="accent1"/>
+      <w:color w:val="000000"/>
     </w:rPr>
   </w:style>
   <w:style w:type="paragraph" w:styleId="Title">
@@ -5509,7 +5509,7 @@
     </w:pPr>
     <w:rPr>
       <w:rFonts w:asciiTheme="majorHAnsi" w:eastAsiaTheme="majorEastAsia" w:hAnsiTheme="majorHAnsi" w:cstheme="majorBidi"/>
-      <w:color w:val="17365D" w:themeColor="text2" w:themeShade="BF"/>
+      <w:color w:val="000000"/>
       <w:spacing w:val="5"/>
       <w:kern w:val="28"/>
       <w:sz w:val="52"/>
@@ -5524,7 +5524,7 @@
     <w:rsid w:val="00FC693F"/>
     <w:rPr>
       <w:rFonts w:asciiTheme="majorHAnsi" w:eastAsiaTheme="majorEastAsia" w:hAnsiTheme="majorHAnsi" w:cstheme="majorBidi"/>
-      <w:color w:val="17365D" w:themeColor="text2" w:themeShade="BF"/>
+      <w:color w:val="000000"/>
       <w:spacing w:val="5"/>
       <w:kern w:val="28"/>
       <w:sz w:val="52"/>
@@ -5548,7 +5548,7 @@
       <w:rFonts w:asciiTheme="majorHAnsi" w:eastAsiaTheme="majorEastAsia" w:hAnsiTheme="majorHAnsi" w:cstheme="majorBidi"/>
       <w:i/>
       <w:iCs/>
-      <w:color w:val="4F81BD" w:themeColor="accent1"/>
+      <w:color w:val="000000"/>
       <w:spacing w:val="15"/>
       <w:sz w:val="24"/>
       <w:szCs w:val="24"/>
@@ -5564,7 +5564,7 @@
       <w:rFonts w:asciiTheme="majorHAnsi" w:eastAsiaTheme="majorEastAsia" w:hAnsiTheme="majorHAnsi" w:cstheme="majorBidi"/>
       <w:i/>
       <w:iCs/>
-      <w:color w:val="4F81BD" w:themeColor="accent1"/>
+      <w:color w:val="000000"/>
       <w:spacing w:val="15"/>
       <w:sz w:val="24"/>
       <w:szCs w:val="24"/>
@@ -5864,7 +5864,7 @@
       <w:bCs/>
       <w:i/>
       <w:iCs/>
-      <w:color w:val="4F81BD" w:themeColor="accent1"/>
+      <w:color w:val="000000"/>
     </w:rPr>
   </w:style>
   <w:style w:type="character" w:customStyle="1" w:styleId="Heading5Char">
@@ -5876,7 +5876,7 @@
     <w:rsid w:val="00FC693F"/>
     <w:rPr>
       <w:rFonts w:asciiTheme="majorHAnsi" w:eastAsiaTheme="majorEastAsia" w:hAnsiTheme="majorHAnsi" w:cstheme="majorBidi"/>
-      <w:color w:val="243F60" w:themeColor="accent1" w:themeShade="7F"/>
+      <w:color w:val="000000"/>
     </w:rPr>
   </w:style>
   <w:style w:type="character" w:customStyle="1" w:styleId="Heading6Char">
@@ -5890,7 +5890,7 @@
       <w:rFonts w:asciiTheme="majorHAnsi" w:eastAsiaTheme="majorEastAsia" w:hAnsiTheme="majorHAnsi" w:cstheme="majorBidi"/>
       <w:i/>
       <w:iCs/>
-      <w:color w:val="243F60" w:themeColor="accent1" w:themeShade="7F"/>
+      <w:color w:val="000000"/>
     </w:rPr>
   </w:style>
   <w:style w:type="character" w:customStyle="1" w:styleId="Heading7Char">
@@ -5904,7 +5904,7 @@
       <w:rFonts w:asciiTheme="majorHAnsi" w:eastAsiaTheme="majorEastAsia" w:hAnsiTheme="majorHAnsi" w:cstheme="majorBidi"/>
       <w:i/>
       <w:iCs/>
-      <w:color w:val="404040" w:themeColor="text1" w:themeTint="BF"/>
+      <w:color w:val="000000"/>
     </w:rPr>
   </w:style>
   <w:style w:type="character" w:customStyle="1" w:styleId="Heading8Char">
@@ -5916,7 +5916,7 @@
     <w:rsid w:val="00FC693F"/>
     <w:rPr>
       <w:rFonts w:asciiTheme="majorHAnsi" w:eastAsiaTheme="majorEastAsia" w:hAnsiTheme="majorHAnsi" w:cstheme="majorBidi"/>
-      <w:color w:val="4F81BD" w:themeColor="accent1"/>
+      <w:color w:val="000000"/>
       <w:sz w:val="20"/>
       <w:szCs w:val="20"/>
     </w:rPr>
@@ -5932,7 +5932,7 @@
       <w:rFonts w:asciiTheme="majorHAnsi" w:eastAsiaTheme="majorEastAsia" w:hAnsiTheme="majorHAnsi" w:cstheme="majorBidi"/>
       <w:i/>
       <w:iCs/>
-      <w:color w:val="404040" w:themeColor="text1" w:themeTint="BF"/>
+      <w:color w:val="000000"/>
       <w:sz w:val="20"/>
       <w:szCs w:val="20"/>
     </w:rPr>
@@ -5952,7 +5952,7 @@
     <w:rPr>
       <w:b/>
       <w:bCs/>
-      <w:color w:val="4F81BD" w:themeColor="accent1"/>
+      <w:color w:val="000000"/>
       <w:sz w:val="18"/>
       <w:szCs w:val="18"/>
     </w:rPr>

</xml_diff>

<commit_message>
Report: light grey table headers and code block instead of blue; PDF
</commit_message>
<xml_diff>
--- a/report/CA3_Agentic_AI_Report_VivaVerify.docx
+++ b/report/CA3_Agentic_AI_Report_VivaVerify.docx
@@ -220,7 +220,7 @@
         <w:tc>
           <w:tcPr>
             <w:tcW w:w="2304" w:type="dxa"/>
-            <w:shd w:val="clear" w:color="auto" w:fill="DCE6F1"/>
+            <w:shd w:val="clear" w:color="auto" w:fill="E7E6E6"/>
           </w:tcPr>
           <w:p>
             <w:pPr>
@@ -231,7 +231,7 @@
         <w:tc>
           <w:tcPr>
             <w:tcW w:w="2304" w:type="dxa"/>
-            <w:shd w:val="clear" w:color="auto" w:fill="DCE6F1"/>
+            <w:shd w:val="clear" w:color="auto" w:fill="E7E6E6"/>
           </w:tcPr>
           <w:p>
             <w:pPr>
@@ -249,7 +249,7 @@
         <w:tc>
           <w:tcPr>
             <w:tcW w:w="2448" w:type="dxa"/>
-            <w:shd w:val="clear" w:color="auto" w:fill="DCE6F1"/>
+            <w:shd w:val="clear" w:color="auto" w:fill="E7E6E6"/>
           </w:tcPr>
           <w:p>
             <w:pPr>
@@ -267,7 +267,7 @@
         <w:tc>
           <w:tcPr>
             <w:tcW w:w="2520" w:type="dxa"/>
-            <w:shd w:val="clear" w:color="auto" w:fill="DCE6F1"/>
+            <w:shd w:val="clear" w:color="auto" w:fill="E7E6E6"/>
           </w:tcPr>
           <w:p>
             <w:pPr>
@@ -600,7 +600,7 @@
         <w:tc>
           <w:tcPr>
             <w:tcW w:w="432" w:type="dxa"/>
-            <w:shd w:val="clear" w:color="auto" w:fill="DCE6F1"/>
+            <w:shd w:val="clear" w:color="auto" w:fill="E7E6E6"/>
           </w:tcPr>
           <w:p>
             <w:pPr>
@@ -618,7 +618,7 @@
         <w:tc>
           <w:tcPr>
             <w:tcW w:w="3168" w:type="dxa"/>
-            <w:shd w:val="clear" w:color="auto" w:fill="DCE6F1"/>
+            <w:shd w:val="clear" w:color="auto" w:fill="E7E6E6"/>
           </w:tcPr>
           <w:p>
             <w:pPr>
@@ -636,7 +636,7 @@
         <w:tc>
           <w:tcPr>
             <w:tcW w:w="864" w:type="dxa"/>
-            <w:shd w:val="clear" w:color="auto" w:fill="DCE6F1"/>
+            <w:shd w:val="clear" w:color="auto" w:fill="E7E6E6"/>
           </w:tcPr>
           <w:p>
             <w:pPr>
@@ -654,7 +654,7 @@
         <w:tc>
           <w:tcPr>
             <w:tcW w:w="1296" w:type="dxa"/>
-            <w:shd w:val="clear" w:color="auto" w:fill="DCE6F1"/>
+            <w:shd w:val="clear" w:color="auto" w:fill="E7E6E6"/>
           </w:tcPr>
           <w:p>
             <w:pPr>
@@ -672,7 +672,7 @@
         <w:tc>
           <w:tcPr>
             <w:tcW w:w="3816" w:type="dxa"/>
-            <w:shd w:val="clear" w:color="auto" w:fill="DCE6F1"/>
+            <w:shd w:val="clear" w:color="auto" w:fill="E7E6E6"/>
           </w:tcPr>
           <w:p>
             <w:pPr>
@@ -1372,7 +1372,7 @@
         <w:tc>
           <w:tcPr>
             <w:tcW w:w="1872" w:type="dxa"/>
-            <w:shd w:val="clear" w:color="auto" w:fill="DCE6F1"/>
+            <w:shd w:val="clear" w:color="auto" w:fill="E7E6E6"/>
           </w:tcPr>
           <w:p>
             <w:pPr>
@@ -1390,7 +1390,7 @@
         <w:tc>
           <w:tcPr>
             <w:tcW w:w="2952" w:type="dxa"/>
-            <w:shd w:val="clear" w:color="auto" w:fill="DCE6F1"/>
+            <w:shd w:val="clear" w:color="auto" w:fill="E7E6E6"/>
           </w:tcPr>
           <w:p>
             <w:pPr>
@@ -1408,7 +1408,7 @@
         <w:tc>
           <w:tcPr>
             <w:tcW w:w="4752" w:type="dxa"/>
-            <w:shd w:val="clear" w:color="auto" w:fill="DCE6F1"/>
+            <w:shd w:val="clear" w:color="auto" w:fill="E7E6E6"/>
           </w:tcPr>
           <w:p>
             <w:pPr>
@@ -2078,7 +2078,7 @@
         <w:tc>
           <w:tcPr>
             <w:tcW w:w="9504" w:type="dxa"/>
-            <w:shd w:val="clear" w:color="auto" w:fill="F3F4F8"/>
+            <w:shd w:val="clear" w:color="auto" w:fill="F2F2F2"/>
           </w:tcPr>
           <w:p>
             <w:r>
@@ -2911,7 +2911,7 @@
         <w:tc>
           <w:tcPr>
             <w:tcW w:w="2880" w:type="dxa"/>
-            <w:shd w:val="clear" w:color="auto" w:fill="DCE6F1"/>
+            <w:shd w:val="clear" w:color="auto" w:fill="E7E6E6"/>
           </w:tcPr>
           <w:p>
             <w:pPr>
@@ -2929,7 +2929,7 @@
         <w:tc>
           <w:tcPr>
             <w:tcW w:w="3096" w:type="dxa"/>
-            <w:shd w:val="clear" w:color="auto" w:fill="DCE6F1"/>
+            <w:shd w:val="clear" w:color="auto" w:fill="E7E6E6"/>
           </w:tcPr>
           <w:p>
             <w:pPr>
@@ -2947,7 +2947,7 @@
         <w:tc>
           <w:tcPr>
             <w:tcW w:w="3600" w:type="dxa"/>
-            <w:shd w:val="clear" w:color="auto" w:fill="DCE6F1"/>
+            <w:shd w:val="clear" w:color="auto" w:fill="E7E6E6"/>
           </w:tcPr>
           <w:p>
             <w:pPr>
@@ -3356,7 +3356,7 @@
         <w:tc>
           <w:tcPr>
             <w:tcW w:w="1584" w:type="dxa"/>
-            <w:shd w:val="clear" w:color="auto" w:fill="DCE6F1"/>
+            <w:shd w:val="clear" w:color="auto" w:fill="E7E6E6"/>
           </w:tcPr>
           <w:p>
             <w:pPr>
@@ -3374,7 +3374,7 @@
         <w:tc>
           <w:tcPr>
             <w:tcW w:w="4680" w:type="dxa"/>
-            <w:shd w:val="clear" w:color="auto" w:fill="DCE6F1"/>
+            <w:shd w:val="clear" w:color="auto" w:fill="E7E6E6"/>
           </w:tcPr>
           <w:p>
             <w:pPr>
@@ -3392,7 +3392,7 @@
         <w:tc>
           <w:tcPr>
             <w:tcW w:w="1296" w:type="dxa"/>
-            <w:shd w:val="clear" w:color="auto" w:fill="DCE6F1"/>
+            <w:shd w:val="clear" w:color="auto" w:fill="E7E6E6"/>
           </w:tcPr>
           <w:p>
             <w:pPr>
@@ -3410,7 +3410,7 @@
         <w:tc>
           <w:tcPr>
             <w:tcW w:w="2016" w:type="dxa"/>
-            <w:shd w:val="clear" w:color="auto" w:fill="DCE6F1"/>
+            <w:shd w:val="clear" w:color="auto" w:fill="E7E6E6"/>
           </w:tcPr>
           <w:p>
             <w:pPr>

</xml_diff>